<commit_message>
doc(projet) : modifier l'intro (pret pour rendu)
</commit_message>
<xml_diff>
--- a/doc/H-P_ShootMeUp-pe84djb-Rapport.docx
+++ b/doc/H-P_ShootMeUp-pe84djb-Rapport.docx
@@ -158,7 +158,6 @@
         </w:rPr>
         <w:t xml:space="preserve">Rapport </w:t>
       </w:r>
-      <w:proofErr w:type="spellStart"/>
       <w:r>
         <w:rPr>
           <w:b/>
@@ -171,7 +170,6 @@
         </w:rPr>
         <w:t>ShootMeUp</w:t>
       </w:r>
-      <w:proofErr w:type="spellEnd"/>
     </w:p>
     <w:p>
       <w:pPr>
@@ -206,16 +204,14 @@
         <w:jc w:val="center"/>
       </w:pPr>
       <w:r>
-        <w:t>Août</w:t>
-      </w:r>
-      <w:r>
-        <w:t xml:space="preserve"> 2026</w:t>
-      </w:r>
-    </w:p>
-    <w:p>
-      <w:pPr>
-        <w:jc w:val="center"/>
-      </w:pPr>
+        <w:t>24.08.2026</w:t>
+      </w:r>
+      <w:r>
+        <w:t xml:space="preserve"> - </w:t>
+      </w:r>
+      <w:r>
+        <w:t>30.10.2026</w:t>
+      </w:r>
       <w:r>
         <w:br w:type="page"/>
       </w:r>
@@ -907,6 +903,259 @@
     </w:p>
     <w:p>
       <w:pPr>
+        <w:pStyle w:val="Titre2"/>
+      </w:pPr>
+      <w:r>
+        <w:t>Objectifs produit</w:t>
+      </w:r>
+    </w:p>
+    <w:p>
+      <w:pPr>
+        <w:jc w:val="center"/>
+      </w:pPr>
+      <w:r>
+        <w:rPr>
+          <w:noProof/>
+        </w:rPr>
+        <w:drawing>
+          <wp:inline distT="0" distB="0" distL="0" distR="0" wp14:anchorId="7B264DEE" wp14:editId="7763BE4B">
+            <wp:extent cx="5317362" cy="2648309"/>
+            <wp:effectExtent l="0" t="0" r="0" b="0"/>
+            <wp:docPr id="1006828699" name="Image 3"/>
+            <wp:cNvGraphicFramePr>
+              <a:graphicFrameLocks xmlns:a="http://schemas.openxmlformats.org/drawingml/2006/main" noChangeAspect="1"/>
+            </wp:cNvGraphicFramePr>
+            <a:graphic xmlns:a="http://schemas.openxmlformats.org/drawingml/2006/main">
+              <a:graphicData uri="http://schemas.openxmlformats.org/drawingml/2006/picture">
+                <pic:pic xmlns:pic="http://schemas.openxmlformats.org/drawingml/2006/picture">
+                  <pic:nvPicPr>
+                    <pic:cNvPr id="0" name="Picture 2"/>
+                    <pic:cNvPicPr>
+                      <a:picLocks noChangeAspect="1" noChangeArrowheads="1"/>
+                    </pic:cNvPicPr>
+                  </pic:nvPicPr>
+                  <pic:blipFill>
+                    <a:blip r:embed="rId8">
+                      <a:extLst>
+                        <a:ext uri="{28A0092B-C50C-407E-A947-70E740481C1C}">
+                          <a14:useLocalDpi xmlns:a14="http://schemas.microsoft.com/office/drawing/2010/main" val="0"/>
+                        </a:ext>
+                      </a:extLst>
+                    </a:blip>
+                    <a:srcRect/>
+                    <a:stretch>
+                      <a:fillRect/>
+                    </a:stretch>
+                  </pic:blipFill>
+                  <pic:spPr bwMode="auto">
+                    <a:xfrm>
+                      <a:off x="0" y="0"/>
+                      <a:ext cx="5340044" cy="2659606"/>
+                    </a:xfrm>
+                    <a:prstGeom prst="rect">
+                      <a:avLst/>
+                    </a:prstGeom>
+                    <a:noFill/>
+                    <a:ln>
+                      <a:noFill/>
+                    </a:ln>
+                  </pic:spPr>
+                </pic:pic>
+              </a:graphicData>
+            </a:graphic>
+          </wp:inline>
+        </w:drawing>
+      </w:r>
+    </w:p>
+    <w:p>
+      <w:r>
+        <w:t xml:space="preserve">Dans mon projet, l’environnement sera un </w:t>
+      </w:r>
+      <w:r>
+        <w:t>tapis ressemblant à un papier peint</w:t>
+      </w:r>
+      <w:r>
+        <w:t>.</w:t>
+      </w:r>
+    </w:p>
+    <w:p>
+      <w:r>
+        <w:t xml:space="preserve">Les ennemis </w:t>
+      </w:r>
+      <w:r>
+        <w:t>bougeront</w:t>
+      </w:r>
+      <w:r>
+        <w:t xml:space="preserve"> en vagues </w:t>
+      </w:r>
+      <w:r>
+        <w:t xml:space="preserve">de quelques individus </w:t>
+      </w:r>
+      <w:r>
+        <w:t>avec des directions relativement prévisible</w:t>
+      </w:r>
+      <w:r>
+        <w:t>s</w:t>
+      </w:r>
+      <w:r>
+        <w:t>.</w:t>
+      </w:r>
+    </w:p>
+    <w:p>
+      <w:r>
+        <w:t>Le personnage peut tirer des projectiles sans rechargement à une vitesse d</w:t>
+      </w:r>
+      <w:r>
+        <w:t>e</w:t>
+      </w:r>
+      <w:r>
+        <w:t xml:space="preserve"> </w:t>
+      </w:r>
+      <w:r>
+        <w:t>1</w:t>
+      </w:r>
+      <w:r>
+        <w:t xml:space="preserve"> par seconde (maintenu).</w:t>
+      </w:r>
+    </w:p>
+    <w:p>
+      <w:r>
+        <w:t xml:space="preserve">Les ennemis </w:t>
+      </w:r>
+      <w:r>
+        <w:t xml:space="preserve">ne </w:t>
+      </w:r>
+      <w:r>
+        <w:t xml:space="preserve">résistent </w:t>
+      </w:r>
+      <w:r>
+        <w:t xml:space="preserve">pas </w:t>
+      </w:r>
+      <w:r>
+        <w:t>au</w:t>
+      </w:r>
+      <w:r>
+        <w:t xml:space="preserve"> tir</w:t>
+      </w:r>
+      <w:r>
+        <w:t xml:space="preserve"> (un suffit)</w:t>
+      </w:r>
+      <w:r>
+        <w:t>.</w:t>
+      </w:r>
+    </w:p>
+    <w:p>
+      <w:r>
+        <w:t>Le personnage lance des gouvernails et les ennemis tirent avec des pistolets à une vitesse d’environ 2/sec sans viser particulièrement</w:t>
+      </w:r>
+      <w:r>
+        <w:t xml:space="preserve"> telle une pluie aléatoire</w:t>
+      </w:r>
+      <w:r>
+        <w:t>.</w:t>
+      </w:r>
+    </w:p>
+    <w:p>
+      <w:r>
+        <w:t>Les obstacles sont des piles de meubles (seront plus petites et il y en aura bel et bien 5 ou +)</w:t>
+      </w:r>
+      <w:r>
+        <w:t>, les obstacles perdent 1 meuble à chaque fois qu’ils sont touchés (sur 5), les meubles se r</w:t>
+      </w:r>
+      <w:r>
+        <w:t>e</w:t>
+      </w:r>
+      <w:r>
+        <w:t>génère</w:t>
+      </w:r>
+      <w:r>
+        <w:t>nt</w:t>
+      </w:r>
+      <w:r>
+        <w:t>.</w:t>
+      </w:r>
+    </w:p>
+    <w:p>
+      <w:r>
+        <w:t>Le personnage ne bouge que sur l’axe X.</w:t>
+      </w:r>
+    </w:p>
+    <w:p>
+      <w:r>
+        <w:t>Le personnage peut résister à un tir seulement.</w:t>
+      </w:r>
+    </w:p>
+    <w:p>
+      <w:pPr>
+        <w:pStyle w:val="Titre2"/>
+      </w:pPr>
+      <w:r>
+        <w:t>Objectifs pédagogiques</w:t>
+      </w:r>
+    </w:p>
+    <w:p>
+      <w:r>
+        <w:t>Lors de ce projet de programmation orientée objet, nous allons continuer à coder en C# comme nous avons déjà fait. Ce thème approfondira les notions de base et ajoutera d’autres notions de classes, objets etc…</w:t>
+      </w:r>
+    </w:p>
+    <w:p>
+      <w:r>
+        <w:t>Nous allons également passer une partie de notre temps de projet à rédiger des documents tels que le rapport et journal de travail.</w:t>
+      </w:r>
+    </w:p>
+    <w:p>
+      <w:r>
+        <w:lastRenderedPageBreak/>
+        <w:t>Ces documents vont nous servir à nous organiser, séparer le travail en plusieurs parties (user stories)</w:t>
+      </w:r>
+      <w:r>
+        <w:t>, créer des commits atomiques clairs respectant des conventions,</w:t>
+      </w:r>
+      <w:r>
+        <w:t xml:space="preserve"> ainsi que des points antérieurs tels qu’un rapport de test etc…</w:t>
+      </w:r>
+    </w:p>
+    <w:p>
+      <w:r>
+        <w:t xml:space="preserve">Ces apprentissages sont utiles voire nécessaires dans le monde de l’informatique car nous devrons </w:t>
+      </w:r>
+      <w:r>
+        <w:t xml:space="preserve">surement </w:t>
+      </w:r>
+      <w:r>
+        <w:t xml:space="preserve">travailler sur </w:t>
+      </w:r>
+      <w:r>
+        <w:t>de longs projets, expliquer nos tests et notre travail, rédiger des US etc. a des fins d’organisation ou de travail à plusieurs.</w:t>
+      </w:r>
+    </w:p>
+    <w:p>
+      <w:r>
+        <w:t xml:space="preserve">Nous faisons donc un pas en avant vers le travail sur des projets en entreprise, la POO peut nous servir </w:t>
+      </w:r>
+      <w:r>
+        <w:t>à</w:t>
+      </w:r>
+      <w:r>
+        <w:t xml:space="preserve"> faire des applications avancées</w:t>
+      </w:r>
+      <w:r>
+        <w:t>,</w:t>
+      </w:r>
+      <w:r>
+        <w:t xml:space="preserve"> mais la rédaction de rapports, jdt et autres points mentionnés nous apprends à être organisés et </w:t>
+      </w:r>
+      <w:r>
+        <w:t>professionnels.</w:t>
+      </w:r>
+    </w:p>
+    <w:p>
+      <w:r>
+        <w:t>Cela sera certainement utile dans d’autres contextes également.</w:t>
+      </w:r>
+    </w:p>
+    <w:p>
+      <w:pPr>
         <w:pStyle w:val="Titre1"/>
         <w:numPr>
           <w:ilvl w:val="0"/>
@@ -919,6 +1168,527 @@
       </w:r>
       <w:bookmarkEnd w:id="1"/>
     </w:p>
+    <w:tbl>
+      <w:tblPr>
+        <w:tblStyle w:val="Grilledutableau"/>
+        <w:tblW w:w="8401" w:type="dxa"/>
+        <w:tblLook w:val="04A0" w:firstRow="1" w:lastRow="0" w:firstColumn="1" w:lastColumn="0" w:noHBand="0" w:noVBand="1"/>
+      </w:tblPr>
+      <w:tblGrid>
+        <w:gridCol w:w="5197"/>
+        <w:gridCol w:w="1602"/>
+        <w:gridCol w:w="1602"/>
+      </w:tblGrid>
+      <w:tr>
+        <w:tc>
+          <w:tcPr>
+            <w:tcW w:w="5197" w:type="dxa"/>
+          </w:tcPr>
+          <w:p>
+            <w:pPr>
+              <w:rPr>
+                <w:b/>
+              </w:rPr>
+            </w:pPr>
+            <w:r>
+              <w:rPr>
+                <w:b/>
+              </w:rPr>
+              <w:t>Tâche</w:t>
+            </w:r>
+          </w:p>
+          <w:p>
+            <w:pPr>
+              <w:rPr>
+                <w:b/>
+              </w:rPr>
+            </w:pPr>
+            <w:r>
+              <w:rPr>
+                <w:b/>
+              </w:rPr>
+              <w:t>(description detaillées :</w:t>
+            </w:r>
+            <w:hyperlink r:id="rId9" w:history="1">
+              <w:r>
+                <w:rPr>
+                  <w:rStyle w:val="Lienhypertexte"/>
+                  <w:b/>
+                </w:rPr>
+                <w:t>Kanban</w:t>
+              </w:r>
+            </w:hyperlink>
+            <w:r>
+              <w:rPr>
+                <w:b/>
+              </w:rPr>
+              <w:t>)</w:t>
+            </w:r>
+          </w:p>
+        </w:tc>
+        <w:tc>
+          <w:tcPr>
+            <w:tcW w:w="1602" w:type="dxa"/>
+          </w:tcPr>
+          <w:p>
+            <w:pPr>
+              <w:rPr>
+                <w:b/>
+              </w:rPr>
+            </w:pPr>
+            <w:r>
+              <w:rPr>
+                <w:b/>
+              </w:rPr>
+              <w:t>Temps prévu (</w:t>
+            </w:r>
+            <w:r>
+              <w:rPr>
+                <w:b/>
+              </w:rPr>
+              <w:t>périodes</w:t>
+            </w:r>
+            <w:r>
+              <w:rPr>
+                <w:b/>
+              </w:rPr>
+              <w:t>)</w:t>
+            </w:r>
+          </w:p>
+        </w:tc>
+        <w:tc>
+          <w:tcPr>
+            <w:tcW w:w="1602" w:type="dxa"/>
+          </w:tcPr>
+          <w:p>
+            <w:pPr>
+              <w:rPr>
+                <w:b/>
+              </w:rPr>
+            </w:pPr>
+            <w:r>
+              <w:rPr>
+                <w:b/>
+              </w:rPr>
+              <w:t>Date de fin</w:t>
+            </w:r>
+          </w:p>
+        </w:tc>
+      </w:tr>
+      <w:tr>
+        <w:tc>
+          <w:tcPr>
+            <w:tcW w:w="5197" w:type="dxa"/>
+          </w:tcPr>
+          <w:p>
+            <w:r>
+              <w:t>Joueur</w:t>
+            </w:r>
+          </w:p>
+        </w:tc>
+        <w:tc>
+          <w:tcPr>
+            <w:tcW w:w="1602" w:type="dxa"/>
+          </w:tcPr>
+          <w:p>
+            <w:r>
+              <w:t>4</w:t>
+            </w:r>
+          </w:p>
+        </w:tc>
+        <w:tc>
+          <w:tcPr>
+            <w:tcW w:w="1602" w:type="dxa"/>
+          </w:tcPr>
+          <w:p>
+            <w:r>
+              <w:t>11.09.2026</w:t>
+            </w:r>
+          </w:p>
+        </w:tc>
+      </w:tr>
+      <w:tr>
+        <w:tc>
+          <w:tcPr>
+            <w:tcW w:w="5197" w:type="dxa"/>
+          </w:tcPr>
+          <w:p>
+            <w:r>
+              <w:t>Mouvement du joueur</w:t>
+            </w:r>
+          </w:p>
+        </w:tc>
+        <w:tc>
+          <w:tcPr>
+            <w:tcW w:w="1602" w:type="dxa"/>
+          </w:tcPr>
+          <w:p>
+            <w:r>
+              <w:t>2</w:t>
+            </w:r>
+          </w:p>
+        </w:tc>
+        <w:tc>
+          <w:tcPr>
+            <w:tcW w:w="1602" w:type="dxa"/>
+          </w:tcPr>
+          <w:p>
+            <w:r>
+              <w:t>18</w:t>
+            </w:r>
+            <w:r>
+              <w:t>.09.2026</w:t>
+            </w:r>
+          </w:p>
+        </w:tc>
+      </w:tr>
+      <w:tr>
+        <w:tc>
+          <w:tcPr>
+            <w:tcW w:w="5197" w:type="dxa"/>
+          </w:tcPr>
+          <w:p>
+            <w:r>
+              <w:t>Projectiles amis (ancres)</w:t>
+            </w:r>
+          </w:p>
+        </w:tc>
+        <w:tc>
+          <w:tcPr>
+            <w:tcW w:w="1602" w:type="dxa"/>
+          </w:tcPr>
+          <w:p>
+            <w:r>
+              <w:t>2</w:t>
+            </w:r>
+          </w:p>
+        </w:tc>
+        <w:tc>
+          <w:tcPr>
+            <w:tcW w:w="1602" w:type="dxa"/>
+          </w:tcPr>
+          <w:p>
+            <w:r>
+              <w:t>18.09.2026</w:t>
+            </w:r>
+          </w:p>
+        </w:tc>
+      </w:tr>
+      <w:tr>
+        <w:tc>
+          <w:tcPr>
+            <w:tcW w:w="5197" w:type="dxa"/>
+          </w:tcPr>
+          <w:p>
+            <w:r>
+              <w:t>Apparition des ennemis (vagues) et mouvement</w:t>
+            </w:r>
+          </w:p>
+        </w:tc>
+        <w:tc>
+          <w:tcPr>
+            <w:tcW w:w="1602" w:type="dxa"/>
+          </w:tcPr>
+          <w:p>
+            <w:r>
+              <w:t>4</w:t>
+            </w:r>
+          </w:p>
+        </w:tc>
+        <w:tc>
+          <w:tcPr>
+            <w:tcW w:w="1602" w:type="dxa"/>
+          </w:tcPr>
+          <w:p>
+            <w:r>
+              <w:t>25</w:t>
+            </w:r>
+            <w:r>
+              <w:t>.09.2026</w:t>
+            </w:r>
+          </w:p>
+        </w:tc>
+      </w:tr>
+      <w:tr>
+        <w:tc>
+          <w:tcPr>
+            <w:tcW w:w="5197" w:type="dxa"/>
+          </w:tcPr>
+          <w:p>
+            <w:r>
+              <w:t>Tir des ennemis</w:t>
+            </w:r>
+          </w:p>
+        </w:tc>
+        <w:tc>
+          <w:tcPr>
+            <w:tcW w:w="1602" w:type="dxa"/>
+          </w:tcPr>
+          <w:p>
+            <w:r>
+              <w:t>3</w:t>
+            </w:r>
+          </w:p>
+        </w:tc>
+        <w:tc>
+          <w:tcPr>
+            <w:tcW w:w="1602" w:type="dxa"/>
+          </w:tcPr>
+          <w:p>
+            <w:r>
+              <w:t>25.09.2026</w:t>
+            </w:r>
+          </w:p>
+        </w:tc>
+      </w:tr>
+      <w:tr>
+        <w:tc>
+          <w:tcPr>
+            <w:tcW w:w="5197" w:type="dxa"/>
+          </w:tcPr>
+          <w:p>
+            <w:r>
+              <w:t>Dégats aux ennemis</w:t>
+            </w:r>
+          </w:p>
+        </w:tc>
+        <w:tc>
+          <w:tcPr>
+            <w:tcW w:w="1602" w:type="dxa"/>
+          </w:tcPr>
+          <w:p>
+            <w:r>
+              <w:t>3</w:t>
+            </w:r>
+          </w:p>
+        </w:tc>
+        <w:tc>
+          <w:tcPr>
+            <w:tcW w:w="1602" w:type="dxa"/>
+          </w:tcPr>
+          <w:p>
+            <w:r>
+              <w:t>02.10.2026</w:t>
+            </w:r>
+          </w:p>
+        </w:tc>
+      </w:tr>
+      <w:tr>
+        <w:tc>
+          <w:tcPr>
+            <w:tcW w:w="5197" w:type="dxa"/>
+          </w:tcPr>
+          <w:p>
+            <w:r>
+              <w:t>Obstacles</w:t>
+            </w:r>
+          </w:p>
+        </w:tc>
+        <w:tc>
+          <w:tcPr>
+            <w:tcW w:w="1602" w:type="dxa"/>
+          </w:tcPr>
+          <w:p>
+            <w:r>
+              <w:t>2</w:t>
+            </w:r>
+          </w:p>
+        </w:tc>
+        <w:tc>
+          <w:tcPr>
+            <w:tcW w:w="1602" w:type="dxa"/>
+          </w:tcPr>
+          <w:p>
+            <w:r>
+              <w:t>02.10.2026</w:t>
+            </w:r>
+          </w:p>
+        </w:tc>
+      </w:tr>
+      <w:tr>
+        <w:tc>
+          <w:tcPr>
+            <w:tcW w:w="5197" w:type="dxa"/>
+          </w:tcPr>
+          <w:p>
+            <w:r>
+              <w:t>Dégats au joueur</w:t>
+            </w:r>
+          </w:p>
+        </w:tc>
+        <w:tc>
+          <w:tcPr>
+            <w:tcW w:w="1602" w:type="dxa"/>
+          </w:tcPr>
+          <w:p>
+            <w:r>
+              <w:t>2</w:t>
+            </w:r>
+          </w:p>
+        </w:tc>
+        <w:tc>
+          <w:tcPr>
+            <w:tcW w:w="1602" w:type="dxa"/>
+          </w:tcPr>
+          <w:p>
+            <w:r>
+              <w:t>09</w:t>
+            </w:r>
+            <w:r>
+              <w:t>.10.2026</w:t>
+            </w:r>
+          </w:p>
+        </w:tc>
+      </w:tr>
+      <w:tr>
+        <w:trPr>
+          <w:trHeight w:val="56"/>
+        </w:trPr>
+        <w:tc>
+          <w:tcPr>
+            <w:tcW w:w="5197" w:type="dxa"/>
+          </w:tcPr>
+          <w:p>
+            <w:r>
+              <w:t>Score</w:t>
+            </w:r>
+          </w:p>
+        </w:tc>
+        <w:tc>
+          <w:tcPr>
+            <w:tcW w:w="1602" w:type="dxa"/>
+          </w:tcPr>
+          <w:p>
+            <w:pPr>
+              <w:tabs>
+                <w:tab w:val="center" w:pos="955"/>
+              </w:tabs>
+            </w:pPr>
+            <w:r>
+              <w:t>3</w:t>
+            </w:r>
+          </w:p>
+        </w:tc>
+        <w:tc>
+          <w:tcPr>
+            <w:tcW w:w="1602" w:type="dxa"/>
+          </w:tcPr>
+          <w:p>
+            <w:pPr>
+              <w:tabs>
+                <w:tab w:val="center" w:pos="955"/>
+              </w:tabs>
+            </w:pPr>
+            <w:r>
+              <w:t>0</w:t>
+            </w:r>
+            <w:r>
+              <w:t>9</w:t>
+            </w:r>
+            <w:r>
+              <w:t>.10.2026</w:t>
+            </w:r>
+          </w:p>
+        </w:tc>
+      </w:tr>
+      <w:tr>
+        <w:trPr>
+          <w:trHeight w:val="56"/>
+        </w:trPr>
+        <w:tc>
+          <w:tcPr>
+            <w:tcW w:w="5197" w:type="dxa"/>
+          </w:tcPr>
+          <w:p>
+            <w:r>
+              <w:t>Gestion de bugs éventuels</w:t>
+            </w:r>
+          </w:p>
+        </w:tc>
+        <w:tc>
+          <w:tcPr>
+            <w:tcW w:w="1602" w:type="dxa"/>
+          </w:tcPr>
+          <w:p>
+            <w:pPr>
+              <w:tabs>
+                <w:tab w:val="center" w:pos="955"/>
+              </w:tabs>
+            </w:pPr>
+            <w:r>
+              <w:t>4</w:t>
+            </w:r>
+          </w:p>
+        </w:tc>
+        <w:tc>
+          <w:tcPr>
+            <w:tcW w:w="1602" w:type="dxa"/>
+          </w:tcPr>
+          <w:p>
+            <w:pPr>
+              <w:tabs>
+                <w:tab w:val="center" w:pos="955"/>
+              </w:tabs>
+            </w:pPr>
+            <w:r>
+              <w:t>30</w:t>
+            </w:r>
+            <w:r>
+              <w:t>.10.2026</w:t>
+            </w:r>
+          </w:p>
+        </w:tc>
+      </w:tr>
+      <w:tr>
+        <w:trPr>
+          <w:trHeight w:val="56"/>
+        </w:trPr>
+        <w:tc>
+          <w:tcPr>
+            <w:tcW w:w="5197" w:type="dxa"/>
+          </w:tcPr>
+          <w:p>
+            <w:r>
+              <w:t>Marge de temps (10%)</w:t>
+            </w:r>
+          </w:p>
+        </w:tc>
+        <w:tc>
+          <w:tcPr>
+            <w:tcW w:w="1602" w:type="dxa"/>
+          </w:tcPr>
+          <w:p>
+            <w:pPr>
+              <w:tabs>
+                <w:tab w:val="center" w:pos="955"/>
+              </w:tabs>
+            </w:pPr>
+            <w:r>
+              <w:t>3</w:t>
+            </w:r>
+          </w:p>
+        </w:tc>
+        <w:tc>
+          <w:tcPr>
+            <w:tcW w:w="1602" w:type="dxa"/>
+          </w:tcPr>
+          <w:p>
+            <w:pPr>
+              <w:tabs>
+                <w:tab w:val="center" w:pos="955"/>
+              </w:tabs>
+            </w:pPr>
+            <w:r>
+              <w:t>30</w:t>
+            </w:r>
+            <w:r>
+              <w:t>.10.2026</w:t>
+            </w:r>
+          </w:p>
+        </w:tc>
+      </w:tr>
+    </w:tbl>
+    <w:p/>
     <w:p>
       <w:pPr>
         <w:pStyle w:val="Titre1"/>
@@ -975,6 +1745,7 @@
       </w:pPr>
       <w:bookmarkStart w:id="5" w:name="_Toc238824187"/>
       <w:r>
+        <w:lastRenderedPageBreak/>
         <w:t>CONCLUSION</w:t>
       </w:r>
       <w:bookmarkEnd w:id="5"/>
@@ -992,6 +1763,27 @@
         <w:t>ANNEXE</w:t>
       </w:r>
       <w:bookmarkEnd w:id="6"/>
+    </w:p>
+    <w:p>
+      <w:pPr>
+        <w:pStyle w:val="Titre2"/>
+      </w:pPr>
+      <w:r>
+        <w:t>Liens en version texte :</w:t>
+      </w:r>
+      <w:r>
+        <w:t xml:space="preserve"> </w:t>
+      </w:r>
+    </w:p>
+    <w:p>
+      <w:hyperlink r:id="rId10" w:history="1">
+        <w:r>
+          <w:rPr>
+            <w:rStyle w:val="Lienhypertexte"/>
+          </w:rPr>
+          <w:t>https://github.com/users/yohannf-222/projects/1/views/1</w:t>
+        </w:r>
+      </w:hyperlink>
     </w:p>
     <w:p/>
     <w:sectPr>
@@ -3378,23 +4170,6 @@
 </file>
 
 <file path=customXml/item1.xml><?xml version="1.0" encoding="utf-8"?>
-<p:properties xmlns:p="http://schemas.microsoft.com/office/2006/metadata/properties" xmlns:xsi="http://www.w3.org/2001/XMLSchema-instance" xmlns:pc="http://schemas.microsoft.com/office/infopath/2007/PartnerControls">
-  <documentManagement>
-    <_activity xmlns="0dcbab57-ce0d-48ec-9006-afbf43b82b42" xsi:nil="true"/>
-  </documentManagement>
-</p:properties>
-</file>
-
-<file path=customXml/item2.xml><?xml version="1.0" encoding="utf-8"?>
-<?mso-contentType ?>
-<FormTemplates xmlns="http://schemas.microsoft.com/sharepoint/v3/contenttype/forms">
-  <Display>DocumentLibraryForm</Display>
-  <Edit>DocumentLibraryForm</Edit>
-  <New>DocumentLibraryForm</New>
-</FormTemplates>
-</file>
-
-<file path=customXml/item3.xml><?xml version="1.0" encoding="utf-8"?>
 <ct:contentTypeSchema xmlns:ct="http://schemas.microsoft.com/office/2006/metadata/contentType" xmlns:ma="http://schemas.microsoft.com/office/2006/metadata/properties/metaAttributes" ct:_="" ma:_="" ma:contentTypeName="Document" ma:contentTypeID="0x010100735015723C2CFE488EA62BE6EBA752B5" ma:contentTypeVersion="5" ma:contentTypeDescription="Crée un document." ma:contentTypeScope="" ma:versionID="3e8f5d53e540aae86bd17d1e2bfad409">
   <xsd:schema xmlns:xsd="http://www.w3.org/2001/XMLSchema" xmlns:xs="http://www.w3.org/2001/XMLSchema" xmlns:p="http://schemas.microsoft.com/office/2006/metadata/properties" xmlns:ns3="0dcbab57-ce0d-48ec-9006-afbf43b82b42" targetNamespace="http://schemas.microsoft.com/office/2006/metadata/properties" ma:root="true" ma:fieldsID="6de1e369a405dbd253ccbf124950f54b" ns3:_="">
     <xsd:import namespace="0dcbab57-ce0d-48ec-9006-afbf43b82b42"/>
@@ -3544,25 +4319,24 @@
 </ct:contentTypeSchema>
 </file>
 
-<file path=customXml/itemProps1.xml><?xml version="1.0" encoding="utf-8"?>
-<ds:datastoreItem xmlns:ds="http://schemas.openxmlformats.org/officeDocument/2006/customXml" ds:itemID="{7D23386E-842B-4B42-9D04-7B63869B43F9}">
-  <ds:schemaRefs>
-    <ds:schemaRef ds:uri="http://schemas.microsoft.com/office/2006/metadata/properties"/>
-    <ds:schemaRef ds:uri="http://schemas.microsoft.com/office/infopath/2007/PartnerControls"/>
-    <ds:schemaRef ds:uri="0dcbab57-ce0d-48ec-9006-afbf43b82b42"/>
-  </ds:schemaRefs>
-</ds:datastoreItem>
+<file path=customXml/item2.xml><?xml version="1.0" encoding="utf-8"?>
+<p:properties xmlns:p="http://schemas.microsoft.com/office/2006/metadata/properties" xmlns:xsi="http://www.w3.org/2001/XMLSchema-instance" xmlns:pc="http://schemas.microsoft.com/office/infopath/2007/PartnerControls">
+  <documentManagement>
+    <_activity xmlns="0dcbab57-ce0d-48ec-9006-afbf43b82b42" xsi:nil="true"/>
+  </documentManagement>
+</p:properties>
 </file>
 
-<file path=customXml/itemProps2.xml><?xml version="1.0" encoding="utf-8"?>
-<ds:datastoreItem xmlns:ds="http://schemas.openxmlformats.org/officeDocument/2006/customXml" ds:itemID="{ACF3336E-B009-4268-AFDE-A53C75438088}">
-  <ds:schemaRefs>
-    <ds:schemaRef ds:uri="http://schemas.microsoft.com/sharepoint/v3/contenttype/forms"/>
-  </ds:schemaRefs>
-</ds:datastoreItem>
+<file path=customXml/item3.xml><?xml version="1.0" encoding="utf-8"?>
+<?mso-contentType ?>
+<FormTemplates xmlns="http://schemas.microsoft.com/sharepoint/v3/contenttype/forms">
+  <Display>DocumentLibraryForm</Display>
+  <Edit>DocumentLibraryForm</Edit>
+  <New>DocumentLibraryForm</New>
+</FormTemplates>
 </file>
 
-<file path=customXml/itemProps3.xml><?xml version="1.0" encoding="utf-8"?>
+<file path=customXml/itemProps1.xml><?xml version="1.0" encoding="utf-8"?>
 <ds:datastoreItem xmlns:ds="http://schemas.openxmlformats.org/officeDocument/2006/customXml" ds:itemID="{4669D0C8-B775-45D7-AB16-E95ABF9C8762}">
   <ds:schemaRefs>
     <ds:schemaRef ds:uri="http://schemas.microsoft.com/office/2006/metadata/contentType"/>
@@ -3578,4 +4352,22 @@
     <ds:schemaRef ds:uri="http://schemas.microsoft.com/internal/obd"/>
   </ds:schemaRefs>
 </ds:datastoreItem>
+</file>
+
+<file path=customXml/itemProps2.xml><?xml version="1.0" encoding="utf-8"?>
+<ds:datastoreItem xmlns:ds="http://schemas.openxmlformats.org/officeDocument/2006/customXml" ds:itemID="{7D23386E-842B-4B42-9D04-7B63869B43F9}">
+  <ds:schemaRefs>
+    <ds:schemaRef ds:uri="http://schemas.microsoft.com/office/2006/metadata/properties"/>
+    <ds:schemaRef ds:uri="http://schemas.microsoft.com/office/infopath/2007/PartnerControls"/>
+    <ds:schemaRef ds:uri="0dcbab57-ce0d-48ec-9006-afbf43b82b42"/>
+  </ds:schemaRefs>
+</ds:datastoreItem>
+</file>
+
+<file path=customXml/itemProps3.xml><?xml version="1.0" encoding="utf-8"?>
+<ds:datastoreItem xmlns:ds="http://schemas.openxmlformats.org/officeDocument/2006/customXml" ds:itemID="{ACF3336E-B009-4268-AFDE-A53C75438088}">
+  <ds:schemaRefs>
+    <ds:schemaRef ds:uri="http://schemas.microsoft.com/sharepoint/v3/contenttype/forms"/>
+  </ds:schemaRefs>
+</ds:datastoreItem>
 </file>
</xml_diff>

<commit_message>
doc(rapport): Je modifie la structure (titres) pour plus tard
plus adapté au cdc
</commit_message>
<xml_diff>
--- a/doc/H-P_ShootMeUp-pe84djb-Rapport.docx
+++ b/doc/H-P_ShootMeUp-pe84djb-Rapport.docx
@@ -145,7 +145,7 @@
           </mc:Choice>
           <mc:Fallback>
             <w:pict>
-              <v:line w14:anchorId="1E638E4D" id="Connecteur droit 1" o:spid="_x0000_s1026" style="position:absolute;z-index:251658240;visibility:visible;mso-wrap-style:square;mso-height-percent:0;mso-wrap-distance-left:9pt;mso-wrap-distance-top:0;mso-wrap-distance-right:9pt;mso-wrap-distance-bottom:0;mso-position-horizontal:absolute;mso-position-horizontal-relative:text;mso-position-vertical:absolute;mso-position-vertical-relative:text;mso-height-percent:0;mso-height-relative:margin" from="87.4pt,36.3pt" to="369.95pt,36.3pt" o:gfxdata="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" strokecolor="black [3213]" strokeweight="1.5pt">
+              <v:line w14:anchorId="5CBBA19E" id="Connecteur droit 1" o:spid="_x0000_s1026" style="position:absolute;z-index:251658240;visibility:visible;mso-wrap-style:square;mso-height-percent:0;mso-wrap-distance-left:9pt;mso-wrap-distance-top:0;mso-wrap-distance-right:9pt;mso-wrap-distance-bottom:0;mso-position-horizontal:absolute;mso-position-horizontal-relative:text;mso-position-vertical:absolute;mso-position-vertical-relative:text;mso-height-percent:0;mso-height-relative:margin" from="87.4pt,36.3pt" to="369.95pt,36.3pt" o:gfxdata="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" strokecolor="black [3213]" strokeweight="1.5pt">
                 <v:stroke joinstyle="miter"/>
               </v:line>
             </w:pict>
@@ -158,6 +158,7 @@
         </w:rPr>
         <w:t xml:space="preserve">Rapport </w:t>
       </w:r>
+      <w:proofErr w:type="spellStart"/>
       <w:r>
         <w:rPr>
           <w:b/>
@@ -170,6 +171,7 @@
         </w:rPr>
         <w:t>ShootMeUp</w:t>
       </w:r>
+      <w:proofErr w:type="spellEnd"/>
     </w:p>
     <w:p>
       <w:pPr>
@@ -420,7 +422,7 @@
                 <w:noProof/>
                 <w:webHidden/>
               </w:rPr>
-              <w:t>3</w:t>
+              <w:t>4</w:t>
             </w:r>
             <w:r>
               <w:rPr>
@@ -506,7 +508,7 @@
                 <w:noProof/>
                 <w:webHidden/>
               </w:rPr>
-              <w:t>3</w:t>
+              <w:t>4</w:t>
             </w:r>
             <w:r>
               <w:rPr>
@@ -592,7 +594,7 @@
                 <w:noProof/>
                 <w:webHidden/>
               </w:rPr>
-              <w:t>3</w:t>
+              <w:t>4</w:t>
             </w:r>
             <w:r>
               <w:rPr>
@@ -678,7 +680,7 @@
                 <w:noProof/>
                 <w:webHidden/>
               </w:rPr>
-              <w:t>3</w:t>
+              <w:t>4</w:t>
             </w:r>
             <w:r>
               <w:rPr>
@@ -764,7 +766,7 @@
                 <w:noProof/>
                 <w:webHidden/>
               </w:rPr>
-              <w:t>3</w:t>
+              <w:t>5</w:t>
             </w:r>
             <w:r>
               <w:rPr>
@@ -850,7 +852,7 @@
                 <w:noProof/>
                 <w:webHidden/>
               </w:rPr>
-              <w:t>3</w:t>
+              <w:t>5</w:t>
             </w:r>
             <w:r>
               <w:rPr>
@@ -969,13 +971,25 @@
     </w:p>
     <w:p>
       <w:r>
-        <w:t xml:space="preserve">Dans mon projet, l’environnement sera un </w:t>
+        <w:t xml:space="preserve">Mon </w:t>
+      </w:r>
+      <w:r>
+        <w:t>projet</w:t>
+      </w:r>
+      <w:r>
+        <w:t xml:space="preserve"> est inspiré du film backrooms (style seulement)</w:t>
+      </w:r>
+      <w:r>
+        <w:t xml:space="preserve">, l’environnement sera un </w:t>
       </w:r>
       <w:r>
         <w:t>tapis ressemblant à un papier peint</w:t>
       </w:r>
       <w:r>
         <w:t>.</w:t>
+      </w:r>
+      <w:r>
+        <w:t xml:space="preserve"> </w:t>
       </w:r>
     </w:p>
     <w:p>
@@ -1082,7 +1096,19 @@
     </w:p>
     <w:p>
       <w:r>
-        <w:t>Le personnage peut résister à un tir seulement.</w:t>
+        <w:t xml:space="preserve">Le personnage peut résister à </w:t>
+      </w:r>
+      <w:r>
+        <w:t>2</w:t>
+      </w:r>
+      <w:r>
+        <w:t xml:space="preserve"> tir</w:t>
+      </w:r>
+      <w:r>
+        <w:t>s</w:t>
+      </w:r>
+      <w:r>
+        <w:t xml:space="preserve"> seulement.</w:t>
       </w:r>
     </w:p>
     <w:p>
@@ -1100,16 +1126,24 @@
     </w:p>
     <w:p>
       <w:r>
+        <w:lastRenderedPageBreak/>
         <w:t>Nous allons également passer une partie de notre temps de projet à rédiger des documents tels que le rapport et journal de travail.</w:t>
       </w:r>
     </w:p>
     <w:p>
       <w:r>
-        <w:lastRenderedPageBreak/>
         <w:t>Ces documents vont nous servir à nous organiser, séparer le travail en plusieurs parties (user stories)</w:t>
       </w:r>
       <w:r>
-        <w:t>, créer des commits atomiques clairs respectant des conventions,</w:t>
+        <w:t xml:space="preserve">, créer des </w:t>
+      </w:r>
+      <w:proofErr w:type="spellStart"/>
+      <w:r>
+        <w:t>commits</w:t>
+      </w:r>
+      <w:proofErr w:type="spellEnd"/>
+      <w:r>
+        <w:t xml:space="preserve"> atomiques clairs respectant des conventions,</w:t>
       </w:r>
       <w:r>
         <w:t xml:space="preserve"> ainsi que des points antérieurs tels qu’un rapport de test etc…</w:t>
@@ -1126,7 +1160,13 @@
         <w:t xml:space="preserve">travailler sur </w:t>
       </w:r>
       <w:r>
-        <w:t>de longs projets, expliquer nos tests et notre travail, rédiger des US etc. a des fins d’organisation ou de travail à plusieurs.</w:t>
+        <w:t xml:space="preserve">de longs projets, expliquer nos tests et notre travail, rédiger des US etc. </w:t>
+      </w:r>
+      <w:r>
+        <w:t>à</w:t>
+      </w:r>
+      <w:r>
+        <w:t xml:space="preserve"> des fins d’organisation ou de travail à plusieurs.</w:t>
       </w:r>
     </w:p>
     <w:p>
@@ -1143,7 +1183,15 @@
         <w:t>,</w:t>
       </w:r>
       <w:r>
-        <w:t xml:space="preserve"> mais la rédaction de rapports, jdt et autres points mentionnés nous apprends à être organisés et </w:t>
+        <w:t xml:space="preserve"> mais la rédaction de rapports, </w:t>
+      </w:r>
+      <w:proofErr w:type="spellStart"/>
+      <w:r>
+        <w:t>jdt</w:t>
+      </w:r>
+      <w:proofErr w:type="spellEnd"/>
+      <w:r>
+        <w:t xml:space="preserve"> et autres points mentionnés nous apprends à être organisés et </w:t>
       </w:r>
       <w:r>
         <w:t>professionnels.</w:t>
@@ -1207,7 +1255,37 @@
               <w:rPr>
                 <w:b/>
               </w:rPr>
-              <w:t>(description detaillées :</w:t>
+              <w:t>(</w:t>
+            </w:r>
+            <w:r>
+              <w:rPr>
+                <w:b/>
+              </w:rPr>
+              <w:t>Description</w:t>
+            </w:r>
+            <w:r>
+              <w:rPr>
+                <w:b/>
+              </w:rPr>
+              <w:t xml:space="preserve"> </w:t>
+            </w:r>
+            <w:r>
+              <w:rPr>
+                <w:b/>
+              </w:rPr>
+              <w:t>détaillées</w:t>
+            </w:r>
+            <w:r>
+              <w:rPr>
+                <w:b/>
+              </w:rPr>
+              <w:t> :</w:t>
+            </w:r>
+            <w:r>
+              <w:rPr>
+                <w:b/>
+              </w:rPr>
+              <w:t xml:space="preserve"> </w:t>
             </w:r>
             <w:hyperlink r:id="rId9" w:history="1">
               <w:r>
@@ -1334,10 +1412,7 @@
           </w:tcPr>
           <w:p>
             <w:r>
-              <w:t>18</w:t>
-            </w:r>
-            <w:r>
-              <w:t>.09.2026</w:t>
+              <w:t>18.09.2026</w:t>
             </w:r>
           </w:p>
         </w:tc>
@@ -1401,10 +1476,7 @@
           </w:tcPr>
           <w:p>
             <w:r>
-              <w:t>25</w:t>
-            </w:r>
-            <w:r>
-              <w:t>.09.2026</w:t>
+              <w:t>25.09.2026</w:t>
             </w:r>
           </w:p>
         </w:tc>
@@ -1447,8 +1519,13 @@
             <w:tcW w:w="5197" w:type="dxa"/>
           </w:tcPr>
           <w:p>
-            <w:r>
-              <w:t>Dégats aux ennemis</w:t>
+            <w:proofErr w:type="spellStart"/>
+            <w:r>
+              <w:t>Dégats</w:t>
+            </w:r>
+            <w:proofErr w:type="spellEnd"/>
+            <w:r>
+              <w:t xml:space="preserve"> aux ennemis</w:t>
             </w:r>
           </w:p>
         </w:tc>
@@ -1511,8 +1588,13 @@
             <w:tcW w:w="5197" w:type="dxa"/>
           </w:tcPr>
           <w:p>
-            <w:r>
-              <w:t>Dégats au joueur</w:t>
+            <w:proofErr w:type="spellStart"/>
+            <w:r>
+              <w:t>Dégats</w:t>
+            </w:r>
+            <w:proofErr w:type="spellEnd"/>
+            <w:r>
+              <w:t xml:space="preserve"> au joueur</w:t>
             </w:r>
           </w:p>
         </w:tc>
@@ -1532,10 +1614,7 @@
           </w:tcPr>
           <w:p>
             <w:r>
-              <w:t>09</w:t>
-            </w:r>
-            <w:r>
-              <w:t>.10.2026</w:t>
+              <w:t>09.10.2026</w:t>
             </w:r>
           </w:p>
         </w:tc>
@@ -1580,13 +1659,7 @@
               </w:tabs>
             </w:pPr>
             <w:r>
-              <w:t>0</w:t>
-            </w:r>
-            <w:r>
-              <w:t>9</w:t>
-            </w:r>
-            <w:r>
-              <w:t>.10.2026</w:t>
+              <w:t>09.10.2026</w:t>
             </w:r>
           </w:p>
         </w:tc>
@@ -1631,10 +1704,7 @@
               </w:tabs>
             </w:pPr>
             <w:r>
-              <w:t>30</w:t>
-            </w:r>
-            <w:r>
-              <w:t>.10.2026</w:t>
+              <w:t>30.10.2026</w:t>
             </w:r>
           </w:p>
         </w:tc>
@@ -1679,10 +1749,7 @@
               </w:tabs>
             </w:pPr>
             <w:r>
-              <w:t>30</w:t>
-            </w:r>
-            <w:r>
-              <w:t>.10.2026</w:t>
+              <w:t>30.10.2026</w:t>
             </w:r>
           </w:p>
         </w:tc>
@@ -1699,12 +1766,9 @@
       </w:pPr>
       <w:bookmarkStart w:id="2" w:name="_Toc238824184"/>
       <w:r>
-        <w:t>CONCEPTIO</w:t>
-      </w:r>
-      <w:r>
-        <w:t>N</w:t>
-      </w:r>
-      <w:bookmarkEnd w:id="2"/>
+        <w:lastRenderedPageBreak/>
+        <w:t>RAPPORTS DE TESTS</w:t>
+      </w:r>
     </w:p>
     <w:p>
       <w:pPr>
@@ -1714,11 +1778,25 @@
           <w:numId w:val="1"/>
         </w:numPr>
       </w:pPr>
-      <w:bookmarkStart w:id="3" w:name="_Toc238824185"/>
-      <w:r>
-        <w:t>RÉALISATION</w:t>
-      </w:r>
-      <w:bookmarkEnd w:id="3"/>
+      <w:r>
+        <w:t>CONCEPTIO</w:t>
+      </w:r>
+      <w:r>
+        <w:t>N</w:t>
+      </w:r>
+      <w:bookmarkEnd w:id="2"/>
+    </w:p>
+    <w:p>
+      <w:pPr>
+        <w:pStyle w:val="Titre1"/>
+        <w:numPr>
+          <w:ilvl w:val="0"/>
+          <w:numId w:val="1"/>
+        </w:numPr>
+      </w:pPr>
+      <w:r>
+        <w:t>UTILISATION DE L’IA</w:t>
+      </w:r>
     </w:p>
     <w:p>
       <w:pPr>
@@ -1728,13 +1806,10 @@
           <w:numId w:val="9"/>
         </w:numPr>
       </w:pPr>
-      <w:bookmarkStart w:id="4" w:name="_Toc238824186"/>
-      <w:r>
-        <w:t>TESTS</w:t>
-      </w:r>
-      <w:bookmarkEnd w:id="4"/>
+      <w:r>
+        <w:t>DEROULEMENT DU PROJET</w:t>
+      </w:r>
     </w:p>
-    <w:p/>
     <w:p>
       <w:pPr>
         <w:pStyle w:val="Titre1"/>
@@ -1743,12 +1818,10 @@
           <w:numId w:val="9"/>
         </w:numPr>
       </w:pPr>
-      <w:bookmarkStart w:id="5" w:name="_Toc238824187"/>
-      <w:r>
-        <w:lastRenderedPageBreak/>
-        <w:t>CONCLUSION</w:t>
-      </w:r>
-      <w:bookmarkEnd w:id="5"/>
+      <w:bookmarkStart w:id="3" w:name="_Toc238824187"/>
+      <w:r>
+        <w:t>BILAN PRODUIT</w:t>
+      </w:r>
     </w:p>
     <w:p>
       <w:pPr>
@@ -1758,11 +1831,24 @@
           <w:numId w:val="9"/>
         </w:numPr>
       </w:pPr>
-      <w:bookmarkStart w:id="6" w:name="_Toc238824188"/>
+      <w:r>
+        <w:t>CONCLUSION</w:t>
+      </w:r>
+      <w:bookmarkEnd w:id="3"/>
+    </w:p>
+    <w:p>
+      <w:pPr>
+        <w:pStyle w:val="Titre1"/>
+        <w:numPr>
+          <w:ilvl w:val="0"/>
+          <w:numId w:val="9"/>
+        </w:numPr>
+      </w:pPr>
+      <w:bookmarkStart w:id="4" w:name="_Toc238824188"/>
       <w:r>
         <w:t>ANNEXE</w:t>
       </w:r>
-      <w:bookmarkEnd w:id="6"/>
+      <w:bookmarkEnd w:id="4"/>
     </w:p>
     <w:p>
       <w:pPr>
@@ -4170,8 +4256,25 @@
 </file>
 
 <file path=customXml/item1.xml><?xml version="1.0" encoding="utf-8"?>
-<ct:contentTypeSchema xmlns:ct="http://schemas.microsoft.com/office/2006/metadata/contentType" xmlns:ma="http://schemas.microsoft.com/office/2006/metadata/properties/metaAttributes" ct:_="" ma:_="" ma:contentTypeName="Document" ma:contentTypeID="0x010100735015723C2CFE488EA62BE6EBA752B5" ma:contentTypeVersion="5" ma:contentTypeDescription="Crée un document." ma:contentTypeScope="" ma:versionID="3e8f5d53e540aae86bd17d1e2bfad409">
-  <xsd:schema xmlns:xsd="http://www.w3.org/2001/XMLSchema" xmlns:xs="http://www.w3.org/2001/XMLSchema" xmlns:p="http://schemas.microsoft.com/office/2006/metadata/properties" xmlns:ns3="0dcbab57-ce0d-48ec-9006-afbf43b82b42" targetNamespace="http://schemas.microsoft.com/office/2006/metadata/properties" ma:root="true" ma:fieldsID="6de1e369a405dbd253ccbf124950f54b" ns3:_="">
+<p:properties xmlns:p="http://schemas.microsoft.com/office/2006/metadata/properties" xmlns:xsi="http://www.w3.org/2001/XMLSchema-instance" xmlns:pc="http://schemas.microsoft.com/office/infopath/2007/PartnerControls">
+  <documentManagement>
+    <_activity xmlns="0dcbab57-ce0d-48ec-9006-afbf43b82b42" xsi:nil="true"/>
+  </documentManagement>
+</p:properties>
+</file>
+
+<file path=customXml/item2.xml><?xml version="1.0" encoding="utf-8"?>
+<?mso-contentType ?>
+<FormTemplates xmlns="http://schemas.microsoft.com/sharepoint/v3/contenttype/forms">
+  <Display>DocumentLibraryForm</Display>
+  <Edit>DocumentLibraryForm</Edit>
+  <New>DocumentLibraryForm</New>
+</FormTemplates>
+</file>
+
+<file path=customXml/item3.xml><?xml version="1.0" encoding="utf-8"?>
+<ct:contentTypeSchema xmlns:ct="http://schemas.microsoft.com/office/2006/metadata/contentType" xmlns:ma="http://schemas.microsoft.com/office/2006/metadata/properties/metaAttributes" ct:_="" ma:_="" ma:contentTypeName="Document" ma:contentTypeID="0x010100735015723C2CFE488EA62BE6EBA752B5" ma:contentTypeVersion="10" ma:contentTypeDescription="Crée un document." ma:contentTypeScope="" ma:versionID="879a0952b67ddc4861aa98f664a08e07">
+  <xsd:schema xmlns:xsd="http://www.w3.org/2001/XMLSchema" xmlns:xs="http://www.w3.org/2001/XMLSchema" xmlns:p="http://schemas.microsoft.com/office/2006/metadata/properties" xmlns:ns3="0dcbab57-ce0d-48ec-9006-afbf43b82b42" targetNamespace="http://schemas.microsoft.com/office/2006/metadata/properties" ma:root="true" ma:fieldsID="872bcaed78208874ee82016f6206aa40" ns3:_="">
     <xsd:import namespace="0dcbab57-ce0d-48ec-9006-afbf43b82b42"/>
     <xsd:element name="properties">
       <xsd:complexType>
@@ -4184,6 +4287,11 @@
                 <xsd:element ref="ns3:MediaServiceFastMetadata" minOccurs="0"/>
                 <xsd:element ref="ns3:MediaServiceSearchProperties" minOccurs="0"/>
                 <xsd:element ref="ns3:_activity" minOccurs="0"/>
+                <xsd:element ref="ns3:MediaServiceSystemTags" minOccurs="0"/>
+                <xsd:element ref="ns3:MediaServiceOCR" minOccurs="0"/>
+                <xsd:element ref="ns3:MediaServiceGenerationTime" minOccurs="0"/>
+                <xsd:element ref="ns3:MediaServiceEventHashCode" minOccurs="0"/>
+                <xsd:element ref="ns3:MediaLengthInSeconds" minOccurs="0"/>
               </xsd:all>
             </xsd:complexType>
           </xsd:element>
@@ -4217,6 +4325,33 @@
     <xsd:element name="_activity" ma:index="12" nillable="true" ma:displayName="_activity" ma:hidden="true" ma:internalName="_activity">
       <xsd:simpleType>
         <xsd:restriction base="dms:Note"/>
+      </xsd:simpleType>
+    </xsd:element>
+    <xsd:element name="MediaServiceSystemTags" ma:index="13" nillable="true" ma:displayName="MediaServiceSystemTags" ma:hidden="true" ma:internalName="MediaServiceSystemTags" ma:readOnly="true">
+      <xsd:simpleType>
+        <xsd:restriction base="dms:Note"/>
+      </xsd:simpleType>
+    </xsd:element>
+    <xsd:element name="MediaServiceOCR" ma:index="14" nillable="true" ma:displayName="Extracted Text" ma:internalName="MediaServiceOCR" ma:readOnly="true">
+      <xsd:simpleType>
+        <xsd:restriction base="dms:Note">
+          <xsd:maxLength value="255"/>
+        </xsd:restriction>
+      </xsd:simpleType>
+    </xsd:element>
+    <xsd:element name="MediaServiceGenerationTime" ma:index="15" nillable="true" ma:displayName="MediaServiceGenerationTime" ma:hidden="true" ma:internalName="MediaServiceGenerationTime" ma:readOnly="true">
+      <xsd:simpleType>
+        <xsd:restriction base="dms:Text"/>
+      </xsd:simpleType>
+    </xsd:element>
+    <xsd:element name="MediaServiceEventHashCode" ma:index="16" nillable="true" ma:displayName="MediaServiceEventHashCode" ma:hidden="true" ma:internalName="MediaServiceEventHashCode" ma:readOnly="true">
+      <xsd:simpleType>
+        <xsd:restriction base="dms:Text"/>
+      </xsd:simpleType>
+    </xsd:element>
+    <xsd:element name="MediaLengthInSeconds" ma:index="17" nillable="true" ma:displayName="MediaLengthInSeconds" ma:hidden="true" ma:internalName="MediaLengthInSeconds" ma:readOnly="true">
+      <xsd:simpleType>
+        <xsd:restriction base="dms:Unknown"/>
       </xsd:simpleType>
     </xsd:element>
   </xsd:schema>
@@ -4319,25 +4454,26 @@
 </ct:contentTypeSchema>
 </file>
 
-<file path=customXml/item2.xml><?xml version="1.0" encoding="utf-8"?>
-<p:properties xmlns:p="http://schemas.microsoft.com/office/2006/metadata/properties" xmlns:xsi="http://www.w3.org/2001/XMLSchema-instance" xmlns:pc="http://schemas.microsoft.com/office/infopath/2007/PartnerControls">
-  <documentManagement>
-    <_activity xmlns="0dcbab57-ce0d-48ec-9006-afbf43b82b42" xsi:nil="true"/>
-  </documentManagement>
-</p:properties>
+<file path=customXml/itemProps1.xml><?xml version="1.0" encoding="utf-8"?>
+<ds:datastoreItem xmlns:ds="http://schemas.openxmlformats.org/officeDocument/2006/customXml" ds:itemID="{7D23386E-842B-4B42-9D04-7B63869B43F9}">
+  <ds:schemaRefs>
+    <ds:schemaRef ds:uri="http://schemas.microsoft.com/office/2006/metadata/properties"/>
+    <ds:schemaRef ds:uri="http://schemas.microsoft.com/office/infopath/2007/PartnerControls"/>
+    <ds:schemaRef ds:uri="0dcbab57-ce0d-48ec-9006-afbf43b82b42"/>
+  </ds:schemaRefs>
+</ds:datastoreItem>
 </file>
 
-<file path=customXml/item3.xml><?xml version="1.0" encoding="utf-8"?>
-<?mso-contentType ?>
-<FormTemplates xmlns="http://schemas.microsoft.com/sharepoint/v3/contenttype/forms">
-  <Display>DocumentLibraryForm</Display>
-  <Edit>DocumentLibraryForm</Edit>
-  <New>DocumentLibraryForm</New>
-</FormTemplates>
+<file path=customXml/itemProps2.xml><?xml version="1.0" encoding="utf-8"?>
+<ds:datastoreItem xmlns:ds="http://schemas.openxmlformats.org/officeDocument/2006/customXml" ds:itemID="{ACF3336E-B009-4268-AFDE-A53C75438088}">
+  <ds:schemaRefs>
+    <ds:schemaRef ds:uri="http://schemas.microsoft.com/sharepoint/v3/contenttype/forms"/>
+  </ds:schemaRefs>
+</ds:datastoreItem>
 </file>
 
-<file path=customXml/itemProps1.xml><?xml version="1.0" encoding="utf-8"?>
-<ds:datastoreItem xmlns:ds="http://schemas.openxmlformats.org/officeDocument/2006/customXml" ds:itemID="{4669D0C8-B775-45D7-AB16-E95ABF9C8762}">
+<file path=customXml/itemProps3.xml><?xml version="1.0" encoding="utf-8"?>
+<ds:datastoreItem xmlns:ds="http://schemas.openxmlformats.org/officeDocument/2006/customXml" ds:itemID="{1FC03C61-EAFE-4134-834E-573F40A8F159}">
   <ds:schemaRefs>
     <ds:schemaRef ds:uri="http://schemas.microsoft.com/office/2006/metadata/contentType"/>
     <ds:schemaRef ds:uri="http://schemas.microsoft.com/office/2006/metadata/properties/metaAttributes"/>
@@ -4352,22 +4488,4 @@
     <ds:schemaRef ds:uri="http://schemas.microsoft.com/internal/obd"/>
   </ds:schemaRefs>
 </ds:datastoreItem>
-</file>
-
-<file path=customXml/itemProps2.xml><?xml version="1.0" encoding="utf-8"?>
-<ds:datastoreItem xmlns:ds="http://schemas.openxmlformats.org/officeDocument/2006/customXml" ds:itemID="{7D23386E-842B-4B42-9D04-7B63869B43F9}">
-  <ds:schemaRefs>
-    <ds:schemaRef ds:uri="http://schemas.microsoft.com/office/2006/metadata/properties"/>
-    <ds:schemaRef ds:uri="http://schemas.microsoft.com/office/infopath/2007/PartnerControls"/>
-    <ds:schemaRef ds:uri="0dcbab57-ce0d-48ec-9006-afbf43b82b42"/>
-  </ds:schemaRefs>
-</ds:datastoreItem>
-</file>
-
-<file path=customXml/itemProps3.xml><?xml version="1.0" encoding="utf-8"?>
-<ds:datastoreItem xmlns:ds="http://schemas.openxmlformats.org/officeDocument/2006/customXml" ds:itemID="{ACF3336E-B009-4268-AFDE-A53C75438088}">
-  <ds:schemaRefs>
-    <ds:schemaRef ds:uri="http://schemas.microsoft.com/sharepoint/v3/contenttype/forms"/>
-  </ds:schemaRefs>
-</ds:datastoreItem>
 </file>
</xml_diff>

<commit_message>
chore(doc) : documentation 80%
Chapitres :
utilisation de l'IA,
Déroulement,
bilan produit (80%),
manque conception
</commit_message>
<xml_diff>
--- a/doc/H-P_ShootMeUp-pe84djb-Rapport.docx
+++ b/doc/H-P_ShootMeUp-pe84djb-Rapport.docx
@@ -25,51 +25,6 @@
         <w:pStyle w:val="Titre"/>
         <w:jc w:val="center"/>
         <w:rPr>
-          <w:u w:val="single"/>
-        </w:rPr>
-      </w:pPr>
-    </w:p>
-    <w:p>
-      <w:pPr>
-        <w:pStyle w:val="Titre"/>
-        <w:jc w:val="center"/>
-        <w:rPr>
-          <w:u w:val="single"/>
-        </w:rPr>
-      </w:pPr>
-    </w:p>
-    <w:p>
-      <w:pPr>
-        <w:pStyle w:val="Titre"/>
-        <w:jc w:val="center"/>
-        <w:rPr>
-          <w:u w:val="single"/>
-        </w:rPr>
-      </w:pPr>
-    </w:p>
-    <w:p>
-      <w:pPr>
-        <w:pStyle w:val="Titre"/>
-        <w:jc w:val="center"/>
-        <w:rPr>
-          <w:u w:val="single"/>
-        </w:rPr>
-      </w:pPr>
-    </w:p>
-    <w:p>
-      <w:pPr>
-        <w:pStyle w:val="Titre"/>
-        <w:jc w:val="center"/>
-        <w:rPr>
-          <w:u w:val="single"/>
-        </w:rPr>
-      </w:pPr>
-    </w:p>
-    <w:p>
-      <w:pPr>
-        <w:pStyle w:val="Titre"/>
-        <w:jc w:val="center"/>
-        <w:rPr>
           <w:b/>
         </w:rPr>
       </w:pPr>
@@ -82,7 +37,7 @@
         <mc:AlternateContent>
           <mc:Choice Requires="wps">
             <w:drawing>
-              <wp:anchor distT="0" distB="0" distL="114300" distR="114300" simplePos="0" relativeHeight="251658240" behindDoc="0" locked="0" layoutInCell="1" allowOverlap="1" wp14:anchorId="57C784F5" wp14:editId="186D453D">
+              <wp:anchor distT="0" distB="0" distL="114300" distR="114300" simplePos="0" relativeHeight="251661312" behindDoc="0" locked="0" layoutInCell="1" allowOverlap="1" wp14:anchorId="61EE1753" wp14:editId="0601A51C">
                 <wp:simplePos x="0" y="0"/>
                 <wp:positionH relativeFrom="column">
                   <wp:posOffset>1110160</wp:posOffset>
@@ -145,7 +100,7 @@
           </mc:Choice>
           <mc:Fallback>
             <w:pict>
-              <v:line w14:anchorId="5CBBA19E" id="Connecteur droit 1" o:spid="_x0000_s1026" style="position:absolute;z-index:251658240;visibility:visible;mso-wrap-style:square;mso-height-percent:0;mso-wrap-distance-left:9pt;mso-wrap-distance-top:0;mso-wrap-distance-right:9pt;mso-wrap-distance-bottom:0;mso-position-horizontal:absolute;mso-position-horizontal-relative:text;mso-position-vertical:absolute;mso-position-vertical-relative:text;mso-height-percent:0;mso-height-relative:margin" from="87.4pt,36.3pt" to="369.95pt,36.3pt" o:gfxdata="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" strokecolor="black [3213]" strokeweight="1.5pt">
+              <v:line w14:anchorId="24C443A3" id="Connecteur droit 1" o:spid="_x0000_s1026" style="position:absolute;z-index:251661312;visibility:visible;mso-wrap-style:square;mso-height-percent:0;mso-wrap-distance-left:9pt;mso-wrap-distance-top:0;mso-wrap-distance-right:9pt;mso-wrap-distance-bottom:0;mso-position-horizontal:absolute;mso-position-horizontal-relative:text;mso-position-vertical:absolute;mso-position-vertical-relative:text;mso-height-percent:0;mso-height-relative:margin" from="87.4pt,36.3pt" to="369.95pt,36.3pt" o:gfxdata="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" strokecolor="black [3213]" strokeweight="1.5pt">
                 <v:stroke joinstyle="miter"/>
               </v:line>
             </w:pict>
@@ -172,6 +127,85 @@
         <w:t>ShootMeUp</w:t>
       </w:r>
       <w:proofErr w:type="spellEnd"/>
+    </w:p>
+    <w:p>
+      <w:pPr>
+        <w:pStyle w:val="Titre"/>
+        <w:rPr>
+          <w:u w:val="single"/>
+        </w:rPr>
+      </w:pPr>
+    </w:p>
+    <w:p>
+      <w:pPr>
+        <w:pStyle w:val="Titre"/>
+        <w:jc w:val="center"/>
+        <w:rPr>
+          <w:u w:val="single"/>
+        </w:rPr>
+      </w:pPr>
+      <w:r>
+        <w:rPr>
+          <w:noProof/>
+        </w:rPr>
+        <w:drawing>
+          <wp:inline distT="0" distB="0" distL="0" distR="0" wp14:anchorId="729B1D3F" wp14:editId="28A44E5D">
+            <wp:extent cx="3058533" cy="3058533"/>
+            <wp:effectExtent l="0" t="0" r="8890" b="8890"/>
+            <wp:docPr id="2037768655" name="Image 2" descr="How A24's Backrooms Turned an Infinite Maze Into a Real-Life Movie Set"/>
+            <wp:cNvGraphicFramePr>
+              <a:graphicFrameLocks xmlns:a="http://schemas.openxmlformats.org/drawingml/2006/main" noChangeAspect="1"/>
+            </wp:cNvGraphicFramePr>
+            <a:graphic xmlns:a="http://schemas.openxmlformats.org/drawingml/2006/main">
+              <a:graphicData uri="http://schemas.openxmlformats.org/drawingml/2006/picture">
+                <pic:pic xmlns:pic="http://schemas.openxmlformats.org/drawingml/2006/picture">
+                  <pic:nvPicPr>
+                    <pic:cNvPr id="0" name="dimg_obPLar2YGfa9i-gPoKWU8Aw_139" descr="How A24's Backrooms Turned an Infinite Maze Into a Real-Life Movie Set"/>
+                    <pic:cNvPicPr>
+                      <a:picLocks noChangeAspect="1" noChangeArrowheads="1"/>
+                    </pic:cNvPicPr>
+                  </pic:nvPicPr>
+                  <pic:blipFill>
+                    <a:blip r:embed="rId8">
+                      <a:extLst>
+                        <a:ext uri="{28A0092B-C50C-407E-A947-70E740481C1C}">
+                          <a14:useLocalDpi xmlns:a14="http://schemas.microsoft.com/office/drawing/2010/main" val="0"/>
+                        </a:ext>
+                      </a:extLst>
+                    </a:blip>
+                    <a:srcRect/>
+                    <a:stretch>
+                      <a:fillRect/>
+                    </a:stretch>
+                  </pic:blipFill>
+                  <pic:spPr bwMode="auto">
+                    <a:xfrm>
+                      <a:off x="0" y="0"/>
+                      <a:ext cx="3065545" cy="3065545"/>
+                    </a:xfrm>
+                    <a:prstGeom prst="rect">
+                      <a:avLst/>
+                    </a:prstGeom>
+                    <a:noFill/>
+                    <a:ln>
+                      <a:noFill/>
+                    </a:ln>
+                  </pic:spPr>
+                </pic:pic>
+              </a:graphicData>
+            </a:graphic>
+          </wp:inline>
+        </w:drawing>
+      </w:r>
+    </w:p>
+    <w:p>
+      <w:pPr>
+        <w:pStyle w:val="Titre"/>
+        <w:jc w:val="center"/>
+        <w:rPr>
+          <w:u w:val="single"/>
+        </w:rPr>
+      </w:pPr>
     </w:p>
     <w:p>
       <w:pPr>
@@ -274,7 +308,7 @@
           <w:r>
             <w:fldChar w:fldCharType="separate"/>
           </w:r>
-          <w:hyperlink w:anchor="_Toc238824182" w:history="1">
+          <w:hyperlink w:anchor="_Toc242631062" w:history="1">
             <w:r>
               <w:rPr>
                 <w:rStyle w:val="Lienhypertexte"/>
@@ -316,7 +350,147 @@
                 <w:noProof/>
                 <w:webHidden/>
               </w:rPr>
-              <w:instrText xml:space="preserve"> PAGEREF _Toc238824182 \h </w:instrText>
+              <w:instrText xml:space="preserve"> PAGEREF _Toc242631062 \h </w:instrText>
+            </w:r>
+            <w:r>
+              <w:rPr>
+                <w:noProof/>
+                <w:webHidden/>
+              </w:rPr>
+            </w:r>
+            <w:r>
+              <w:rPr>
+                <w:noProof/>
+                <w:webHidden/>
+              </w:rPr>
+              <w:fldChar w:fldCharType="separate"/>
+            </w:r>
+            <w:r>
+              <w:rPr>
+                <w:noProof/>
+                <w:webHidden/>
+              </w:rPr>
+              <w:t>3</w:t>
+            </w:r>
+            <w:r>
+              <w:rPr>
+                <w:noProof/>
+                <w:webHidden/>
+              </w:rPr>
+              <w:fldChar w:fldCharType="end"/>
+            </w:r>
+          </w:hyperlink>
+        </w:p>
+        <w:p>
+          <w:pPr>
+            <w:pStyle w:val="TM2"/>
+            <w:tabs>
+              <w:tab w:val="right" w:leader="dot" w:pos="9062"/>
+            </w:tabs>
+            <w:rPr>
+              <w:rFonts w:eastAsiaTheme="minorEastAsia"/>
+              <w:noProof/>
+              <w:lang w:eastAsia="fr-CH"/>
+            </w:rPr>
+          </w:pPr>
+          <w:hyperlink w:anchor="_Toc242631063" w:history="1">
+            <w:r>
+              <w:rPr>
+                <w:rStyle w:val="Lienhypertexte"/>
+                <w:noProof/>
+              </w:rPr>
+              <w:t>Objectifs produit</w:t>
+            </w:r>
+            <w:r>
+              <w:rPr>
+                <w:noProof/>
+                <w:webHidden/>
+              </w:rPr>
+              <w:tab/>
+            </w:r>
+            <w:r>
+              <w:rPr>
+                <w:noProof/>
+                <w:webHidden/>
+              </w:rPr>
+              <w:fldChar w:fldCharType="begin"/>
+            </w:r>
+            <w:r>
+              <w:rPr>
+                <w:noProof/>
+                <w:webHidden/>
+              </w:rPr>
+              <w:instrText xml:space="preserve"> PAGEREF _Toc242631063 \h </w:instrText>
+            </w:r>
+            <w:r>
+              <w:rPr>
+                <w:noProof/>
+                <w:webHidden/>
+              </w:rPr>
+            </w:r>
+            <w:r>
+              <w:rPr>
+                <w:noProof/>
+                <w:webHidden/>
+              </w:rPr>
+              <w:fldChar w:fldCharType="separate"/>
+            </w:r>
+            <w:r>
+              <w:rPr>
+                <w:noProof/>
+                <w:webHidden/>
+              </w:rPr>
+              <w:t>3</w:t>
+            </w:r>
+            <w:r>
+              <w:rPr>
+                <w:noProof/>
+                <w:webHidden/>
+              </w:rPr>
+              <w:fldChar w:fldCharType="end"/>
+            </w:r>
+          </w:hyperlink>
+        </w:p>
+        <w:p>
+          <w:pPr>
+            <w:pStyle w:val="TM2"/>
+            <w:tabs>
+              <w:tab w:val="right" w:leader="dot" w:pos="9062"/>
+            </w:tabs>
+            <w:rPr>
+              <w:rFonts w:eastAsiaTheme="minorEastAsia"/>
+              <w:noProof/>
+              <w:lang w:eastAsia="fr-CH"/>
+            </w:rPr>
+          </w:pPr>
+          <w:hyperlink w:anchor="_Toc242631064" w:history="1">
+            <w:r>
+              <w:rPr>
+                <w:rStyle w:val="Lienhypertexte"/>
+                <w:noProof/>
+              </w:rPr>
+              <w:t>Objectifs pédagogiques</w:t>
+            </w:r>
+            <w:r>
+              <w:rPr>
+                <w:noProof/>
+                <w:webHidden/>
+              </w:rPr>
+              <w:tab/>
+            </w:r>
+            <w:r>
+              <w:rPr>
+                <w:noProof/>
+                <w:webHidden/>
+              </w:rPr>
+              <w:fldChar w:fldCharType="begin"/>
+            </w:r>
+            <w:r>
+              <w:rPr>
+                <w:noProof/>
+                <w:webHidden/>
+              </w:rPr>
+              <w:instrText xml:space="preserve"> PAGEREF _Toc242631064 \h </w:instrText>
             </w:r>
             <w:r>
               <w:rPr>
@@ -360,7 +534,7 @@
               <w:lang w:eastAsia="fr-CH"/>
             </w:rPr>
           </w:pPr>
-          <w:hyperlink w:anchor="_Toc238824183" w:history="1">
+          <w:hyperlink w:anchor="_Toc242631065" w:history="1">
             <w:r>
               <w:rPr>
                 <w:rStyle w:val="Lienhypertexte"/>
@@ -402,7 +576,7 @@
                 <w:noProof/>
                 <w:webHidden/>
               </w:rPr>
-              <w:instrText xml:space="preserve"> PAGEREF _Toc238824183 \h </w:instrText>
+              <w:instrText xml:space="preserve"> PAGEREF _Toc242631065 \h </w:instrText>
             </w:r>
             <w:r>
               <w:rPr>
@@ -446,7 +620,7 @@
               <w:lang w:eastAsia="fr-CH"/>
             </w:rPr>
           </w:pPr>
-          <w:hyperlink w:anchor="_Toc238824184" w:history="1">
+          <w:hyperlink w:anchor="_Toc242631066" w:history="1">
             <w:r>
               <w:rPr>
                 <w:rStyle w:val="Lienhypertexte"/>
@@ -467,7 +641,7 @@
                 <w:rStyle w:val="Lienhypertexte"/>
                 <w:noProof/>
               </w:rPr>
-              <w:t>CONCEPTION</w:t>
+              <w:t>RAPPORTS DE TESTS</w:t>
             </w:r>
             <w:r>
               <w:rPr>
@@ -488,7 +662,7 @@
                 <w:noProof/>
                 <w:webHidden/>
               </w:rPr>
-              <w:instrText xml:space="preserve"> PAGEREF _Toc238824184 \h </w:instrText>
+              <w:instrText xml:space="preserve"> PAGEREF _Toc242631066 \h </w:instrText>
             </w:r>
             <w:r>
               <w:rPr>
@@ -532,13 +706,13 @@
               <w:lang w:eastAsia="fr-CH"/>
             </w:rPr>
           </w:pPr>
-          <w:hyperlink w:anchor="_Toc238824185" w:history="1">
+          <w:hyperlink w:anchor="_Toc242631067" w:history="1">
             <w:r>
               <w:rPr>
                 <w:rStyle w:val="Lienhypertexte"/>
                 <w:noProof/>
               </w:rPr>
-              <w:t>4.</w:t>
+              <w:t>3.</w:t>
             </w:r>
             <w:r>
               <w:rPr>
@@ -553,7 +727,7 @@
                 <w:rStyle w:val="Lienhypertexte"/>
                 <w:noProof/>
               </w:rPr>
-              <w:t>RÉALISATION</w:t>
+              <w:t>CONCEPTION</w:t>
             </w:r>
             <w:r>
               <w:rPr>
@@ -574,7 +748,7 @@
                 <w:noProof/>
                 <w:webHidden/>
               </w:rPr>
-              <w:instrText xml:space="preserve"> PAGEREF _Toc238824185 \h </w:instrText>
+              <w:instrText xml:space="preserve"> PAGEREF _Toc242631067 \h </w:instrText>
             </w:r>
             <w:r>
               <w:rPr>
@@ -594,7 +768,7 @@
                 <w:noProof/>
                 <w:webHidden/>
               </w:rPr>
-              <w:t>4</w:t>
+              <w:t>5</w:t>
             </w:r>
             <w:r>
               <w:rPr>
@@ -618,13 +792,13 @@
               <w:lang w:eastAsia="fr-CH"/>
             </w:rPr>
           </w:pPr>
-          <w:hyperlink w:anchor="_Toc238824186" w:history="1">
+          <w:hyperlink w:anchor="_Toc242631068" w:history="1">
             <w:r>
               <w:rPr>
                 <w:rStyle w:val="Lienhypertexte"/>
                 <w:noProof/>
               </w:rPr>
-              <w:t>5.</w:t>
+              <w:t>4.</w:t>
             </w:r>
             <w:r>
               <w:rPr>
@@ -639,7 +813,7 @@
                 <w:rStyle w:val="Lienhypertexte"/>
                 <w:noProof/>
               </w:rPr>
-              <w:t>TESTS</w:t>
+              <w:t>UTILISATION DE L’IA</w:t>
             </w:r>
             <w:r>
               <w:rPr>
@@ -660,7 +834,7 @@
                 <w:noProof/>
                 <w:webHidden/>
               </w:rPr>
-              <w:instrText xml:space="preserve"> PAGEREF _Toc238824186 \h </w:instrText>
+              <w:instrText xml:space="preserve"> PAGEREF _Toc242631068 \h </w:instrText>
             </w:r>
             <w:r>
               <w:rPr>
@@ -680,7 +854,7 @@
                 <w:noProof/>
                 <w:webHidden/>
               </w:rPr>
-              <w:t>4</w:t>
+              <w:t>5</w:t>
             </w:r>
             <w:r>
               <w:rPr>
@@ -704,13 +878,13 @@
               <w:lang w:eastAsia="fr-CH"/>
             </w:rPr>
           </w:pPr>
-          <w:hyperlink w:anchor="_Toc238824187" w:history="1">
+          <w:hyperlink w:anchor="_Toc242631069" w:history="1">
             <w:r>
               <w:rPr>
                 <w:rStyle w:val="Lienhypertexte"/>
                 <w:noProof/>
               </w:rPr>
-              <w:t>6.</w:t>
+              <w:t>5.</w:t>
             </w:r>
             <w:r>
               <w:rPr>
@@ -725,7 +899,7 @@
                 <w:rStyle w:val="Lienhypertexte"/>
                 <w:noProof/>
               </w:rPr>
-              <w:t>CONCLUSION</w:t>
+              <w:t>DEROULEMENT DU PROJET</w:t>
             </w:r>
             <w:r>
               <w:rPr>
@@ -746,7 +920,7 @@
                 <w:noProof/>
                 <w:webHidden/>
               </w:rPr>
-              <w:instrText xml:space="preserve"> PAGEREF _Toc238824187 \h </w:instrText>
+              <w:instrText xml:space="preserve"> PAGEREF _Toc242631069 \h </w:instrText>
             </w:r>
             <w:r>
               <w:rPr>
@@ -790,12 +964,98 @@
               <w:lang w:eastAsia="fr-CH"/>
             </w:rPr>
           </w:pPr>
-          <w:hyperlink w:anchor="_Toc238824188" w:history="1">
+          <w:hyperlink w:anchor="_Toc242631070" w:history="1">
             <w:r>
               <w:rPr>
                 <w:rStyle w:val="Lienhypertexte"/>
                 <w:noProof/>
               </w:rPr>
+              <w:t>6.</w:t>
+            </w:r>
+            <w:r>
+              <w:rPr>
+                <w:rFonts w:eastAsiaTheme="minorEastAsia"/>
+                <w:noProof/>
+                <w:lang w:eastAsia="fr-CH"/>
+              </w:rPr>
+              <w:tab/>
+            </w:r>
+            <w:r>
+              <w:rPr>
+                <w:rStyle w:val="Lienhypertexte"/>
+                <w:noProof/>
+              </w:rPr>
+              <w:t>BILAN PRODUIT</w:t>
+            </w:r>
+            <w:r>
+              <w:rPr>
+                <w:noProof/>
+                <w:webHidden/>
+              </w:rPr>
+              <w:tab/>
+            </w:r>
+            <w:r>
+              <w:rPr>
+                <w:noProof/>
+                <w:webHidden/>
+              </w:rPr>
+              <w:fldChar w:fldCharType="begin"/>
+            </w:r>
+            <w:r>
+              <w:rPr>
+                <w:noProof/>
+                <w:webHidden/>
+              </w:rPr>
+              <w:instrText xml:space="preserve"> PAGEREF _Toc242631070 \h </w:instrText>
+            </w:r>
+            <w:r>
+              <w:rPr>
+                <w:noProof/>
+                <w:webHidden/>
+              </w:rPr>
+            </w:r>
+            <w:r>
+              <w:rPr>
+                <w:noProof/>
+                <w:webHidden/>
+              </w:rPr>
+              <w:fldChar w:fldCharType="separate"/>
+            </w:r>
+            <w:r>
+              <w:rPr>
+                <w:noProof/>
+                <w:webHidden/>
+              </w:rPr>
+              <w:t>5</w:t>
+            </w:r>
+            <w:r>
+              <w:rPr>
+                <w:noProof/>
+                <w:webHidden/>
+              </w:rPr>
+              <w:fldChar w:fldCharType="end"/>
+            </w:r>
+          </w:hyperlink>
+        </w:p>
+        <w:p>
+          <w:pPr>
+            <w:pStyle w:val="TM1"/>
+            <w:tabs>
+              <w:tab w:val="left" w:pos="480"/>
+              <w:tab w:val="right" w:leader="dot" w:pos="9062"/>
+            </w:tabs>
+            <w:rPr>
+              <w:rFonts w:eastAsiaTheme="minorEastAsia"/>
+              <w:noProof/>
+              <w:lang w:eastAsia="fr-CH"/>
+            </w:rPr>
+          </w:pPr>
+          <w:hyperlink w:anchor="_Toc242631071" w:history="1">
+            <w:r>
+              <w:rPr>
+                <w:rStyle w:val="Lienhypertexte"/>
+                <w:noProof/>
+              </w:rPr>
               <w:t>7.</w:t>
             </w:r>
             <w:r>
@@ -811,6 +1071,92 @@
                 <w:rStyle w:val="Lienhypertexte"/>
                 <w:noProof/>
               </w:rPr>
+              <w:t>CONCLUSION</w:t>
+            </w:r>
+            <w:r>
+              <w:rPr>
+                <w:noProof/>
+                <w:webHidden/>
+              </w:rPr>
+              <w:tab/>
+            </w:r>
+            <w:r>
+              <w:rPr>
+                <w:noProof/>
+                <w:webHidden/>
+              </w:rPr>
+              <w:fldChar w:fldCharType="begin"/>
+            </w:r>
+            <w:r>
+              <w:rPr>
+                <w:noProof/>
+                <w:webHidden/>
+              </w:rPr>
+              <w:instrText xml:space="preserve"> PAGEREF _Toc242631071 \h </w:instrText>
+            </w:r>
+            <w:r>
+              <w:rPr>
+                <w:noProof/>
+                <w:webHidden/>
+              </w:rPr>
+            </w:r>
+            <w:r>
+              <w:rPr>
+                <w:noProof/>
+                <w:webHidden/>
+              </w:rPr>
+              <w:fldChar w:fldCharType="separate"/>
+            </w:r>
+            <w:r>
+              <w:rPr>
+                <w:noProof/>
+                <w:webHidden/>
+              </w:rPr>
+              <w:t>5</w:t>
+            </w:r>
+            <w:r>
+              <w:rPr>
+                <w:noProof/>
+                <w:webHidden/>
+              </w:rPr>
+              <w:fldChar w:fldCharType="end"/>
+            </w:r>
+          </w:hyperlink>
+        </w:p>
+        <w:p>
+          <w:pPr>
+            <w:pStyle w:val="TM1"/>
+            <w:tabs>
+              <w:tab w:val="left" w:pos="480"/>
+              <w:tab w:val="right" w:leader="dot" w:pos="9062"/>
+            </w:tabs>
+            <w:rPr>
+              <w:rFonts w:eastAsiaTheme="minorEastAsia"/>
+              <w:noProof/>
+              <w:lang w:eastAsia="fr-CH"/>
+            </w:rPr>
+          </w:pPr>
+          <w:hyperlink w:anchor="_Toc242631072" w:history="1">
+            <w:r>
+              <w:rPr>
+                <w:rStyle w:val="Lienhypertexte"/>
+                <w:noProof/>
+              </w:rPr>
+              <w:t>8.</w:t>
+            </w:r>
+            <w:r>
+              <w:rPr>
+                <w:rFonts w:eastAsiaTheme="minorEastAsia"/>
+                <w:noProof/>
+                <w:lang w:eastAsia="fr-CH"/>
+              </w:rPr>
+              <w:tab/>
+            </w:r>
+            <w:r>
+              <w:rPr>
+                <w:rStyle w:val="Lienhypertexte"/>
+                <w:noProof/>
+              </w:rPr>
               <w:t>ANNEXE</w:t>
             </w:r>
             <w:r>
@@ -832,7 +1178,77 @@
                 <w:noProof/>
                 <w:webHidden/>
               </w:rPr>
-              <w:instrText xml:space="preserve"> PAGEREF _Toc238824188 \h </w:instrText>
+              <w:instrText xml:space="preserve"> PAGEREF _Toc242631072 \h </w:instrText>
+            </w:r>
+            <w:r>
+              <w:rPr>
+                <w:noProof/>
+                <w:webHidden/>
+              </w:rPr>
+            </w:r>
+            <w:r>
+              <w:rPr>
+                <w:noProof/>
+                <w:webHidden/>
+              </w:rPr>
+              <w:fldChar w:fldCharType="separate"/>
+            </w:r>
+            <w:r>
+              <w:rPr>
+                <w:noProof/>
+                <w:webHidden/>
+              </w:rPr>
+              <w:t>5</w:t>
+            </w:r>
+            <w:r>
+              <w:rPr>
+                <w:noProof/>
+                <w:webHidden/>
+              </w:rPr>
+              <w:fldChar w:fldCharType="end"/>
+            </w:r>
+          </w:hyperlink>
+        </w:p>
+        <w:p>
+          <w:pPr>
+            <w:pStyle w:val="TM2"/>
+            <w:tabs>
+              <w:tab w:val="right" w:leader="dot" w:pos="9062"/>
+            </w:tabs>
+            <w:rPr>
+              <w:rFonts w:eastAsiaTheme="minorEastAsia"/>
+              <w:noProof/>
+              <w:lang w:eastAsia="fr-CH"/>
+            </w:rPr>
+          </w:pPr>
+          <w:hyperlink w:anchor="_Toc242631073" w:history="1">
+            <w:r>
+              <w:rPr>
+                <w:rStyle w:val="Lienhypertexte"/>
+                <w:noProof/>
+              </w:rPr>
+              <w:t>Liens en version texte :</w:t>
+            </w:r>
+            <w:r>
+              <w:rPr>
+                <w:noProof/>
+                <w:webHidden/>
+              </w:rPr>
+              <w:tab/>
+            </w:r>
+            <w:r>
+              <w:rPr>
+                <w:noProof/>
+                <w:webHidden/>
+              </w:rPr>
+              <w:fldChar w:fldCharType="begin"/>
+            </w:r>
+            <w:r>
+              <w:rPr>
+                <w:noProof/>
+                <w:webHidden/>
+              </w:rPr>
+              <w:instrText xml:space="preserve"> PAGEREF _Toc242631073 \h </w:instrText>
             </w:r>
             <w:r>
               <w:rPr>
@@ -893,10 +1309,10 @@
         <w:pStyle w:val="Titre1"/>
         <w:numPr>
           <w:ilvl w:val="0"/>
-          <w:numId w:val="1"/>
+          <w:numId w:val="13"/>
         </w:numPr>
       </w:pPr>
-      <w:bookmarkStart w:id="0" w:name="_Toc238824182"/>
+      <w:bookmarkStart w:id="0" w:name="_Toc242631062"/>
       <w:r>
         <w:lastRenderedPageBreak/>
         <w:t>INTRODUCTION</w:t>
@@ -907,9 +1323,11 @@
       <w:pPr>
         <w:pStyle w:val="Titre2"/>
       </w:pPr>
+      <w:bookmarkStart w:id="1" w:name="_Toc242631063"/>
       <w:r>
         <w:t>Objectifs produit</w:t>
       </w:r>
+      <w:bookmarkEnd w:id="1"/>
     </w:p>
     <w:p>
       <w:pPr>
@@ -937,7 +1355,7 @@
                     </pic:cNvPicPr>
                   </pic:nvPicPr>
                   <pic:blipFill>
-                    <a:blip r:embed="rId8">
+                    <a:blip r:embed="rId9">
                       <a:extLst>
                         <a:ext uri="{28A0092B-C50C-407E-A947-70E740481C1C}">
                           <a14:useLocalDpi xmlns:a14="http://schemas.microsoft.com/office/drawing/2010/main" val="0"/>
@@ -1115,9 +1533,11 @@
       <w:pPr>
         <w:pStyle w:val="Titre2"/>
       </w:pPr>
+      <w:bookmarkStart w:id="2" w:name="_Toc242631064"/>
       <w:r>
         <w:t>Objectifs pédagogiques</w:t>
       </w:r>
+      <w:bookmarkEnd w:id="2"/>
     </w:p>
     <w:p>
       <w:r>
@@ -1207,14 +1627,14 @@
         <w:pStyle w:val="Titre1"/>
         <w:numPr>
           <w:ilvl w:val="0"/>
-          <w:numId w:val="1"/>
+          <w:numId w:val="13"/>
         </w:numPr>
       </w:pPr>
-      <w:bookmarkStart w:id="1" w:name="_Toc238824183"/>
+      <w:bookmarkStart w:id="3" w:name="_Toc242631065"/>
       <w:r>
         <w:t>PLANIFICATION</w:t>
       </w:r>
-      <w:bookmarkEnd w:id="1"/>
+      <w:bookmarkEnd w:id="3"/>
     </w:p>
     <w:tbl>
       <w:tblPr>
@@ -1287,7 +1707,7 @@
               </w:rPr>
               <w:t xml:space="preserve"> </w:t>
             </w:r>
-            <w:hyperlink r:id="rId9" w:history="1">
+            <w:hyperlink r:id="rId10" w:history="1">
               <w:r>
                 <w:rPr>
                   <w:rStyle w:val="Lienhypertexte"/>
@@ -1519,11 +1939,9 @@
             <w:tcW w:w="5197" w:type="dxa"/>
           </w:tcPr>
           <w:p>
-            <w:proofErr w:type="spellStart"/>
-            <w:r>
-              <w:t>Dégats</w:t>
-            </w:r>
-            <w:proofErr w:type="spellEnd"/>
+            <w:r>
+              <w:t>Dégâts</w:t>
+            </w:r>
             <w:r>
               <w:t xml:space="preserve"> aux ennemis</w:t>
             </w:r>
@@ -1588,11 +2006,9 @@
             <w:tcW w:w="5197" w:type="dxa"/>
           </w:tcPr>
           <w:p>
-            <w:proofErr w:type="spellStart"/>
-            <w:r>
-              <w:t>Dégats</w:t>
-            </w:r>
-            <w:proofErr w:type="spellEnd"/>
+            <w:r>
+              <w:t>Dégâts</w:t>
+            </w:r>
             <w:r>
               <w:t xml:space="preserve"> au joueur</w:t>
             </w:r>
@@ -1761,13 +2177,777 @@
         <w:pStyle w:val="Titre1"/>
         <w:numPr>
           <w:ilvl w:val="0"/>
-          <w:numId w:val="1"/>
+          <w:numId w:val="13"/>
         </w:numPr>
       </w:pPr>
-      <w:bookmarkStart w:id="2" w:name="_Toc238824184"/>
+      <w:bookmarkStart w:id="4" w:name="_Toc242631066"/>
+      <w:r>
+        <w:t>RAPPORTS DE TESTS</w:t>
+      </w:r>
+      <w:bookmarkEnd w:id="4"/>
+    </w:p>
+    <w:p>
+      <w:r>
+        <w:t>Pour mes tests, j’utilise la méthode vue en cours.</w:t>
+      </w:r>
+    </w:p>
+    <w:p>
+      <w:r>
+        <w:t xml:space="preserve">J’ai ajouté un projet </w:t>
+      </w:r>
+      <w:proofErr w:type="spellStart"/>
+      <w:r>
+        <w:rPr>
+          <w:b/>
+          <w:bCs/>
+        </w:rPr>
+        <w:t>MSTest</w:t>
+      </w:r>
+      <w:proofErr w:type="spellEnd"/>
+      <w:r>
+        <w:t xml:space="preserve"> dans la solution et chaque test a une méthode dans ce projet (un seul fichier).</w:t>
+      </w:r>
+    </w:p>
+    <w:p>
+      <w:r>
+        <w:t xml:space="preserve">J’utilise bien entendu la méthode </w:t>
+      </w:r>
+      <w:r>
+        <w:rPr>
+          <w:b/>
+          <w:bCs/>
+        </w:rPr>
+        <w:t>AAA</w:t>
+      </w:r>
+      <w:r>
+        <w:t xml:space="preserve"> pour mes tests.</w:t>
+      </w:r>
+    </w:p>
+    <w:p>
+      <w:r>
+        <w:t xml:space="preserve">Il m’est arrivé plusieurs fois de faire les tests avant d’utiliser la </w:t>
+      </w:r>
+      <w:r>
+        <w:t>méthode</w:t>
+      </w:r>
+      <w:r>
+        <w:t xml:space="preserve"> dans le jeu afin de ne pas partir dans une mauvaise direction, j’ai également </w:t>
+      </w:r>
+      <w:r>
+        <w:t>fait</w:t>
+      </w:r>
+      <w:r>
+        <w:t xml:space="preserve"> cela dans le test pratique du 09.10.26.</w:t>
+      </w:r>
+    </w:p>
+    <w:p>
       <w:r>
         <w:lastRenderedPageBreak/>
-        <w:t>RAPPORTS DE TESTS</w:t>
+        <w:t>Exemple de ma méthodologie lors du test d’une méthode :</w:t>
+      </w:r>
+    </w:p>
+    <w:p>
+      <w:pPr>
+        <w:pStyle w:val="Titre4"/>
+      </w:pPr>
+      <w:r>
+        <w:t xml:space="preserve">Je crée mon test </w:t>
+      </w:r>
+    </w:p>
+    <w:p>
+      <w:pPr>
+        <w:pStyle w:val="Paragraphedeliste"/>
+      </w:pPr>
+      <w:r>
+        <w:t>Exemple :</w:t>
+      </w:r>
+    </w:p>
+    <w:p>
+      <w:pPr>
+        <w:shd w:val="clear" w:color="auto" w:fill="1E1E1E"/>
+        <w:spacing w:after="0" w:line="285" w:lineRule="atLeast"/>
+        <w:rPr>
+          <w:rFonts w:ascii="Consolas" w:eastAsia="Times New Roman" w:hAnsi="Consolas" w:cs="Times New Roman"/>
+          <w:color w:val="D4D4D4"/>
+          <w:kern w:val="0"/>
+          <w:sz w:val="21"/>
+          <w:szCs w:val="21"/>
+          <w:lang w:eastAsia="fr-CH"/>
+          <w14:ligatures w14:val="none"/>
+        </w:rPr>
+      </w:pPr>
+      <w:r>
+        <w:rPr>
+          <w:rFonts w:ascii="Consolas" w:eastAsia="Times New Roman" w:hAnsi="Consolas" w:cs="Times New Roman"/>
+          <w:color w:val="D4D4D4"/>
+          <w:kern w:val="0"/>
+          <w:sz w:val="21"/>
+          <w:szCs w:val="21"/>
+          <w:lang w:eastAsia="fr-CH"/>
+          <w14:ligatures w14:val="none"/>
+        </w:rPr>
+        <w:t>[</w:t>
+      </w:r>
+      <w:proofErr w:type="spellStart"/>
+      <w:r>
+        <w:rPr>
+          <w:rFonts w:ascii="Consolas" w:eastAsia="Times New Roman" w:hAnsi="Consolas" w:cs="Times New Roman"/>
+          <w:color w:val="D4D4D4"/>
+          <w:kern w:val="0"/>
+          <w:sz w:val="21"/>
+          <w:szCs w:val="21"/>
+          <w:lang w:eastAsia="fr-CH"/>
+          <w14:ligatures w14:val="none"/>
+        </w:rPr>
+        <w:t>TestMethod</w:t>
+      </w:r>
+      <w:proofErr w:type="spellEnd"/>
+      <w:r>
+        <w:rPr>
+          <w:rFonts w:ascii="Consolas" w:eastAsia="Times New Roman" w:hAnsi="Consolas" w:cs="Times New Roman"/>
+          <w:color w:val="D4D4D4"/>
+          <w:kern w:val="0"/>
+          <w:sz w:val="21"/>
+          <w:szCs w:val="21"/>
+          <w:lang w:eastAsia="fr-CH"/>
+          <w14:ligatures w14:val="none"/>
+        </w:rPr>
+        <w:t>]</w:t>
+      </w:r>
+    </w:p>
+    <w:p>
+      <w:pPr>
+        <w:shd w:val="clear" w:color="auto" w:fill="1E1E1E"/>
+        <w:spacing w:after="0" w:line="285" w:lineRule="atLeast"/>
+        <w:rPr>
+          <w:rFonts w:ascii="Consolas" w:eastAsia="Times New Roman" w:hAnsi="Consolas" w:cs="Times New Roman"/>
+          <w:color w:val="D4D4D4"/>
+          <w:kern w:val="0"/>
+          <w:sz w:val="21"/>
+          <w:szCs w:val="21"/>
+          <w:lang w:eastAsia="fr-CH"/>
+          <w14:ligatures w14:val="none"/>
+        </w:rPr>
+      </w:pPr>
+      <w:proofErr w:type="gramStart"/>
+      <w:r>
+        <w:rPr>
+          <w:rFonts w:ascii="Consolas" w:eastAsia="Times New Roman" w:hAnsi="Consolas" w:cs="Times New Roman"/>
+          <w:color w:val="D4D4D4"/>
+          <w:kern w:val="0"/>
+          <w:sz w:val="21"/>
+          <w:szCs w:val="21"/>
+          <w:lang w:eastAsia="fr-CH"/>
+          <w14:ligatures w14:val="none"/>
+        </w:rPr>
+        <w:t>public</w:t>
+      </w:r>
+      <w:proofErr w:type="gramEnd"/>
+      <w:r>
+        <w:rPr>
+          <w:rFonts w:ascii="Consolas" w:eastAsia="Times New Roman" w:hAnsi="Consolas" w:cs="Times New Roman"/>
+          <w:color w:val="D4D4D4"/>
+          <w:kern w:val="0"/>
+          <w:sz w:val="21"/>
+          <w:szCs w:val="21"/>
+          <w:lang w:eastAsia="fr-CH"/>
+          <w14:ligatures w14:val="none"/>
+        </w:rPr>
+        <w:t xml:space="preserve"> </w:t>
+      </w:r>
+      <w:proofErr w:type="spellStart"/>
+      <w:r>
+        <w:rPr>
+          <w:rFonts w:ascii="Consolas" w:eastAsia="Times New Roman" w:hAnsi="Consolas" w:cs="Times New Roman"/>
+          <w:color w:val="D4D4D4"/>
+          <w:kern w:val="0"/>
+          <w:sz w:val="21"/>
+          <w:szCs w:val="21"/>
+          <w:lang w:eastAsia="fr-CH"/>
+          <w14:ligatures w14:val="none"/>
+        </w:rPr>
+        <w:t>void</w:t>
+      </w:r>
+      <w:proofErr w:type="spellEnd"/>
+      <w:r>
+        <w:rPr>
+          <w:rFonts w:ascii="Consolas" w:eastAsia="Times New Roman" w:hAnsi="Consolas" w:cs="Times New Roman"/>
+          <w:color w:val="D4D4D4"/>
+          <w:kern w:val="0"/>
+          <w:sz w:val="21"/>
+          <w:szCs w:val="21"/>
+          <w:lang w:eastAsia="fr-CH"/>
+          <w14:ligatures w14:val="none"/>
+        </w:rPr>
+        <w:t xml:space="preserve"> MathHelpers_IsTouching_2Rectangles_</w:t>
+      </w:r>
+      <w:proofErr w:type="gramStart"/>
+      <w:r>
+        <w:rPr>
+          <w:rFonts w:ascii="Consolas" w:eastAsia="Times New Roman" w:hAnsi="Consolas" w:cs="Times New Roman"/>
+          <w:color w:val="D4D4D4"/>
+          <w:kern w:val="0"/>
+          <w:sz w:val="21"/>
+          <w:szCs w:val="21"/>
+          <w:lang w:eastAsia="fr-CH"/>
+          <w14:ligatures w14:val="none"/>
+        </w:rPr>
+        <w:t>True(</w:t>
+      </w:r>
+      <w:proofErr w:type="gramEnd"/>
+      <w:r>
+        <w:rPr>
+          <w:rFonts w:ascii="Consolas" w:eastAsia="Times New Roman" w:hAnsi="Consolas" w:cs="Times New Roman"/>
+          <w:color w:val="D4D4D4"/>
+          <w:kern w:val="0"/>
+          <w:sz w:val="21"/>
+          <w:szCs w:val="21"/>
+          <w:lang w:eastAsia="fr-CH"/>
+          <w14:ligatures w14:val="none"/>
+        </w:rPr>
+        <w:t>)</w:t>
+      </w:r>
+    </w:p>
+    <w:p>
+      <w:pPr>
+        <w:shd w:val="clear" w:color="auto" w:fill="1E1E1E"/>
+        <w:spacing w:after="0" w:line="285" w:lineRule="atLeast"/>
+        <w:rPr>
+          <w:rFonts w:ascii="Consolas" w:eastAsia="Times New Roman" w:hAnsi="Consolas" w:cs="Times New Roman"/>
+          <w:color w:val="D4D4D4"/>
+          <w:kern w:val="0"/>
+          <w:sz w:val="21"/>
+          <w:szCs w:val="21"/>
+          <w:lang w:eastAsia="fr-CH"/>
+          <w14:ligatures w14:val="none"/>
+        </w:rPr>
+      </w:pPr>
+      <w:r>
+        <w:rPr>
+          <w:rFonts w:ascii="Consolas" w:eastAsia="Times New Roman" w:hAnsi="Consolas" w:cs="Times New Roman"/>
+          <w:color w:val="D4D4D4"/>
+          <w:kern w:val="0"/>
+          <w:sz w:val="21"/>
+          <w:szCs w:val="21"/>
+          <w:lang w:eastAsia="fr-CH"/>
+          <w14:ligatures w14:val="none"/>
+        </w:rPr>
+        <w:t>{</w:t>
+      </w:r>
+    </w:p>
+    <w:p>
+      <w:pPr>
+        <w:shd w:val="clear" w:color="auto" w:fill="1E1E1E"/>
+        <w:spacing w:after="0" w:line="285" w:lineRule="atLeast"/>
+        <w:rPr>
+          <w:rFonts w:ascii="Consolas" w:eastAsia="Times New Roman" w:hAnsi="Consolas" w:cs="Times New Roman"/>
+          <w:color w:val="D4D4D4"/>
+          <w:kern w:val="0"/>
+          <w:sz w:val="21"/>
+          <w:szCs w:val="21"/>
+          <w:lang w:eastAsia="fr-CH"/>
+          <w14:ligatures w14:val="none"/>
+        </w:rPr>
+      </w:pPr>
+      <w:r>
+        <w:rPr>
+          <w:rFonts w:ascii="Consolas" w:eastAsia="Times New Roman" w:hAnsi="Consolas" w:cs="Times New Roman"/>
+          <w:color w:val="D4D4D4"/>
+          <w:kern w:val="0"/>
+          <w:sz w:val="21"/>
+          <w:szCs w:val="21"/>
+          <w:lang w:eastAsia="fr-CH"/>
+          <w14:ligatures w14:val="none"/>
+        </w:rPr>
+        <w:t xml:space="preserve">    // Arrange</w:t>
+      </w:r>
+    </w:p>
+    <w:p>
+      <w:pPr>
+        <w:shd w:val="clear" w:color="auto" w:fill="1E1E1E"/>
+        <w:spacing w:after="0" w:line="285" w:lineRule="atLeast"/>
+        <w:rPr>
+          <w:rFonts w:ascii="Consolas" w:eastAsia="Times New Roman" w:hAnsi="Consolas" w:cs="Times New Roman"/>
+          <w:color w:val="D4D4D4"/>
+          <w:kern w:val="0"/>
+          <w:sz w:val="21"/>
+          <w:szCs w:val="21"/>
+          <w:lang w:val="de-CH" w:eastAsia="fr-CH"/>
+          <w14:ligatures w14:val="none"/>
+        </w:rPr>
+      </w:pPr>
+      <w:r>
+        <w:rPr>
+          <w:rFonts w:ascii="Consolas" w:eastAsia="Times New Roman" w:hAnsi="Consolas" w:cs="Times New Roman"/>
+          <w:color w:val="D4D4D4"/>
+          <w:kern w:val="0"/>
+          <w:sz w:val="21"/>
+          <w:szCs w:val="21"/>
+          <w:lang w:eastAsia="fr-CH"/>
+          <w14:ligatures w14:val="none"/>
+        </w:rPr>
+        <w:t xml:space="preserve">    </w:t>
+      </w:r>
+      <w:proofErr w:type="spellStart"/>
+      <w:r>
+        <w:rPr>
+          <w:rFonts w:ascii="Consolas" w:eastAsia="Times New Roman" w:hAnsi="Consolas" w:cs="Times New Roman"/>
+          <w:color w:val="D4D4D4"/>
+          <w:kern w:val="0"/>
+          <w:sz w:val="21"/>
+          <w:szCs w:val="21"/>
+          <w:lang w:val="de-CH" w:eastAsia="fr-CH"/>
+          <w14:ligatures w14:val="none"/>
+        </w:rPr>
+        <w:t>int</w:t>
+      </w:r>
+      <w:proofErr w:type="spellEnd"/>
+      <w:r>
+        <w:rPr>
+          <w:rFonts w:ascii="Consolas" w:eastAsia="Times New Roman" w:hAnsi="Consolas" w:cs="Times New Roman"/>
+          <w:color w:val="D4D4D4"/>
+          <w:kern w:val="0"/>
+          <w:sz w:val="21"/>
+          <w:szCs w:val="21"/>
+          <w:lang w:val="de-CH" w:eastAsia="fr-CH"/>
+          <w14:ligatures w14:val="none"/>
+        </w:rPr>
+        <w:t xml:space="preserve"> x1 = 0, y1 = 0, width1 = 10, height1 = 10;</w:t>
+      </w:r>
+    </w:p>
+    <w:p>
+      <w:pPr>
+        <w:shd w:val="clear" w:color="auto" w:fill="1E1E1E"/>
+        <w:spacing w:after="0" w:line="285" w:lineRule="atLeast"/>
+        <w:rPr>
+          <w:rFonts w:ascii="Consolas" w:eastAsia="Times New Roman" w:hAnsi="Consolas" w:cs="Times New Roman"/>
+          <w:color w:val="D4D4D4"/>
+          <w:kern w:val="0"/>
+          <w:sz w:val="21"/>
+          <w:szCs w:val="21"/>
+          <w:lang w:val="de-CH" w:eastAsia="fr-CH"/>
+          <w14:ligatures w14:val="none"/>
+        </w:rPr>
+      </w:pPr>
+      <w:r>
+        <w:rPr>
+          <w:rFonts w:ascii="Consolas" w:eastAsia="Times New Roman" w:hAnsi="Consolas" w:cs="Times New Roman"/>
+          <w:color w:val="D4D4D4"/>
+          <w:kern w:val="0"/>
+          <w:sz w:val="21"/>
+          <w:szCs w:val="21"/>
+          <w:lang w:val="de-CH" w:eastAsia="fr-CH"/>
+          <w14:ligatures w14:val="none"/>
+        </w:rPr>
+        <w:t xml:space="preserve">    </w:t>
+      </w:r>
+      <w:proofErr w:type="spellStart"/>
+      <w:r>
+        <w:rPr>
+          <w:rFonts w:ascii="Consolas" w:eastAsia="Times New Roman" w:hAnsi="Consolas" w:cs="Times New Roman"/>
+          <w:color w:val="D4D4D4"/>
+          <w:kern w:val="0"/>
+          <w:sz w:val="21"/>
+          <w:szCs w:val="21"/>
+          <w:lang w:val="de-CH" w:eastAsia="fr-CH"/>
+          <w14:ligatures w14:val="none"/>
+        </w:rPr>
+        <w:t>int</w:t>
+      </w:r>
+      <w:proofErr w:type="spellEnd"/>
+      <w:r>
+        <w:rPr>
+          <w:rFonts w:ascii="Consolas" w:eastAsia="Times New Roman" w:hAnsi="Consolas" w:cs="Times New Roman"/>
+          <w:color w:val="D4D4D4"/>
+          <w:kern w:val="0"/>
+          <w:sz w:val="21"/>
+          <w:szCs w:val="21"/>
+          <w:lang w:val="de-CH" w:eastAsia="fr-CH"/>
+          <w14:ligatures w14:val="none"/>
+        </w:rPr>
+        <w:t xml:space="preserve"> x2 = 5, y2 = 5, width2 = 10, height2 = 10;</w:t>
+      </w:r>
+    </w:p>
+    <w:p>
+      <w:pPr>
+        <w:shd w:val="clear" w:color="auto" w:fill="1E1E1E"/>
+        <w:spacing w:after="0" w:line="285" w:lineRule="atLeast"/>
+        <w:rPr>
+          <w:rFonts w:ascii="Consolas" w:eastAsia="Times New Roman" w:hAnsi="Consolas" w:cs="Times New Roman"/>
+          <w:color w:val="D4D4D4"/>
+          <w:kern w:val="0"/>
+          <w:sz w:val="21"/>
+          <w:szCs w:val="21"/>
+          <w:lang w:val="de-CH" w:eastAsia="fr-CH"/>
+          <w14:ligatures w14:val="none"/>
+        </w:rPr>
+      </w:pPr>
+    </w:p>
+    <w:p>
+      <w:pPr>
+        <w:shd w:val="clear" w:color="auto" w:fill="1E1E1E"/>
+        <w:spacing w:after="0" w:line="285" w:lineRule="atLeast"/>
+        <w:rPr>
+          <w:rFonts w:ascii="Consolas" w:eastAsia="Times New Roman" w:hAnsi="Consolas" w:cs="Times New Roman"/>
+          <w:color w:val="D4D4D4"/>
+          <w:kern w:val="0"/>
+          <w:sz w:val="21"/>
+          <w:szCs w:val="21"/>
+          <w:lang w:val="de-CH" w:eastAsia="fr-CH"/>
+          <w14:ligatures w14:val="none"/>
+        </w:rPr>
+      </w:pPr>
+      <w:r>
+        <w:rPr>
+          <w:rFonts w:ascii="Consolas" w:eastAsia="Times New Roman" w:hAnsi="Consolas" w:cs="Times New Roman"/>
+          <w:color w:val="D4D4D4"/>
+          <w:kern w:val="0"/>
+          <w:sz w:val="21"/>
+          <w:szCs w:val="21"/>
+          <w:lang w:val="de-CH" w:eastAsia="fr-CH"/>
+          <w14:ligatures w14:val="none"/>
+        </w:rPr>
+        <w:t xml:space="preserve">    // Act</w:t>
+      </w:r>
+    </w:p>
+    <w:p>
+      <w:pPr>
+        <w:shd w:val="clear" w:color="auto" w:fill="1E1E1E"/>
+        <w:spacing w:after="0" w:line="285" w:lineRule="atLeast"/>
+        <w:rPr>
+          <w:rFonts w:ascii="Consolas" w:eastAsia="Times New Roman" w:hAnsi="Consolas" w:cs="Times New Roman"/>
+          <w:color w:val="D4D4D4"/>
+          <w:kern w:val="0"/>
+          <w:sz w:val="21"/>
+          <w:szCs w:val="21"/>
+          <w:lang w:val="de-CH" w:eastAsia="fr-CH"/>
+          <w14:ligatures w14:val="none"/>
+        </w:rPr>
+      </w:pPr>
+      <w:r>
+        <w:rPr>
+          <w:rFonts w:ascii="Consolas" w:eastAsia="Times New Roman" w:hAnsi="Consolas" w:cs="Times New Roman"/>
+          <w:color w:val="D4D4D4"/>
+          <w:kern w:val="0"/>
+          <w:sz w:val="21"/>
+          <w:szCs w:val="21"/>
+          <w:lang w:val="de-CH" w:eastAsia="fr-CH"/>
+          <w14:ligatures w14:val="none"/>
+        </w:rPr>
+        <w:t xml:space="preserve">    </w:t>
+      </w:r>
+      <w:proofErr w:type="spellStart"/>
+      <w:r>
+        <w:rPr>
+          <w:rFonts w:ascii="Consolas" w:eastAsia="Times New Roman" w:hAnsi="Consolas" w:cs="Times New Roman"/>
+          <w:color w:val="D4D4D4"/>
+          <w:kern w:val="0"/>
+          <w:sz w:val="21"/>
+          <w:szCs w:val="21"/>
+          <w:lang w:val="de-CH" w:eastAsia="fr-CH"/>
+          <w14:ligatures w14:val="none"/>
+        </w:rPr>
+        <w:t>bool</w:t>
+      </w:r>
+      <w:proofErr w:type="spellEnd"/>
+      <w:r>
+        <w:rPr>
+          <w:rFonts w:ascii="Consolas" w:eastAsia="Times New Roman" w:hAnsi="Consolas" w:cs="Times New Roman"/>
+          <w:color w:val="D4D4D4"/>
+          <w:kern w:val="0"/>
+          <w:sz w:val="21"/>
+          <w:szCs w:val="21"/>
+          <w:lang w:val="de-CH" w:eastAsia="fr-CH"/>
+          <w14:ligatures w14:val="none"/>
+        </w:rPr>
+        <w:t xml:space="preserve"> </w:t>
+      </w:r>
+      <w:proofErr w:type="spellStart"/>
+      <w:r>
+        <w:rPr>
+          <w:rFonts w:ascii="Consolas" w:eastAsia="Times New Roman" w:hAnsi="Consolas" w:cs="Times New Roman"/>
+          <w:color w:val="D4D4D4"/>
+          <w:kern w:val="0"/>
+          <w:sz w:val="21"/>
+          <w:szCs w:val="21"/>
+          <w:lang w:val="de-CH" w:eastAsia="fr-CH"/>
+          <w14:ligatures w14:val="none"/>
+        </w:rPr>
+        <w:t>result</w:t>
+      </w:r>
+      <w:proofErr w:type="spellEnd"/>
+      <w:r>
+        <w:rPr>
+          <w:rFonts w:ascii="Consolas" w:eastAsia="Times New Roman" w:hAnsi="Consolas" w:cs="Times New Roman"/>
+          <w:color w:val="D4D4D4"/>
+          <w:kern w:val="0"/>
+          <w:sz w:val="21"/>
+          <w:szCs w:val="21"/>
+          <w:lang w:val="de-CH" w:eastAsia="fr-CH"/>
+          <w14:ligatures w14:val="none"/>
+        </w:rPr>
+        <w:t xml:space="preserve"> = </w:t>
+      </w:r>
+      <w:proofErr w:type="spellStart"/>
+      <w:r>
+        <w:rPr>
+          <w:rFonts w:ascii="Consolas" w:eastAsia="Times New Roman" w:hAnsi="Consolas" w:cs="Times New Roman"/>
+          <w:color w:val="D4D4D4"/>
+          <w:kern w:val="0"/>
+          <w:sz w:val="21"/>
+          <w:szCs w:val="21"/>
+          <w:lang w:val="de-CH" w:eastAsia="fr-CH"/>
+          <w14:ligatures w14:val="none"/>
+        </w:rPr>
+        <w:t>MathHelpers.IsTouching</w:t>
+      </w:r>
+      <w:proofErr w:type="spellEnd"/>
+      <w:r>
+        <w:rPr>
+          <w:rFonts w:ascii="Consolas" w:eastAsia="Times New Roman" w:hAnsi="Consolas" w:cs="Times New Roman"/>
+          <w:color w:val="D4D4D4"/>
+          <w:kern w:val="0"/>
+          <w:sz w:val="21"/>
+          <w:szCs w:val="21"/>
+          <w:lang w:val="de-CH" w:eastAsia="fr-CH"/>
+          <w14:ligatures w14:val="none"/>
+        </w:rPr>
+        <w:t>(x1, y1, width1, height1, x2, y2, width2, height2);</w:t>
+      </w:r>
+    </w:p>
+    <w:p>
+      <w:pPr>
+        <w:shd w:val="clear" w:color="auto" w:fill="1E1E1E"/>
+        <w:spacing w:after="0" w:line="285" w:lineRule="atLeast"/>
+        <w:rPr>
+          <w:rFonts w:ascii="Consolas" w:eastAsia="Times New Roman" w:hAnsi="Consolas" w:cs="Times New Roman"/>
+          <w:color w:val="D4D4D4"/>
+          <w:kern w:val="0"/>
+          <w:sz w:val="21"/>
+          <w:szCs w:val="21"/>
+          <w:lang w:val="de-CH" w:eastAsia="fr-CH"/>
+          <w14:ligatures w14:val="none"/>
+        </w:rPr>
+      </w:pPr>
+    </w:p>
+    <w:p>
+      <w:pPr>
+        <w:shd w:val="clear" w:color="auto" w:fill="1E1E1E"/>
+        <w:spacing w:after="0" w:line="285" w:lineRule="atLeast"/>
+        <w:rPr>
+          <w:rFonts w:ascii="Consolas" w:eastAsia="Times New Roman" w:hAnsi="Consolas" w:cs="Times New Roman"/>
+          <w:color w:val="D4D4D4"/>
+          <w:kern w:val="0"/>
+          <w:sz w:val="21"/>
+          <w:szCs w:val="21"/>
+          <w:lang w:eastAsia="fr-CH"/>
+          <w14:ligatures w14:val="none"/>
+        </w:rPr>
+      </w:pPr>
+      <w:r>
+        <w:rPr>
+          <w:rFonts w:ascii="Consolas" w:eastAsia="Times New Roman" w:hAnsi="Consolas" w:cs="Times New Roman"/>
+          <w:color w:val="D4D4D4"/>
+          <w:kern w:val="0"/>
+          <w:sz w:val="21"/>
+          <w:szCs w:val="21"/>
+          <w:lang w:val="de-CH" w:eastAsia="fr-CH"/>
+          <w14:ligatures w14:val="none"/>
+        </w:rPr>
+        <w:t xml:space="preserve">    </w:t>
+      </w:r>
+      <w:r>
+        <w:rPr>
+          <w:rFonts w:ascii="Consolas" w:eastAsia="Times New Roman" w:hAnsi="Consolas" w:cs="Times New Roman"/>
+          <w:color w:val="D4D4D4"/>
+          <w:kern w:val="0"/>
+          <w:sz w:val="21"/>
+          <w:szCs w:val="21"/>
+          <w:lang w:eastAsia="fr-CH"/>
+          <w14:ligatures w14:val="none"/>
+        </w:rPr>
+        <w:t xml:space="preserve">// </w:t>
+      </w:r>
+      <w:proofErr w:type="spellStart"/>
+      <w:r>
+        <w:rPr>
+          <w:rFonts w:ascii="Consolas" w:eastAsia="Times New Roman" w:hAnsi="Consolas" w:cs="Times New Roman"/>
+          <w:color w:val="D4D4D4"/>
+          <w:kern w:val="0"/>
+          <w:sz w:val="21"/>
+          <w:szCs w:val="21"/>
+          <w:lang w:eastAsia="fr-CH"/>
+          <w14:ligatures w14:val="none"/>
+        </w:rPr>
+        <w:t>Assert</w:t>
+      </w:r>
+      <w:proofErr w:type="spellEnd"/>
+    </w:p>
+    <w:p>
+      <w:pPr>
+        <w:shd w:val="clear" w:color="auto" w:fill="1E1E1E"/>
+        <w:spacing w:after="0" w:line="285" w:lineRule="atLeast"/>
+        <w:rPr>
+          <w:rFonts w:ascii="Consolas" w:eastAsia="Times New Roman" w:hAnsi="Consolas" w:cs="Times New Roman"/>
+          <w:color w:val="D4D4D4"/>
+          <w:kern w:val="0"/>
+          <w:sz w:val="21"/>
+          <w:szCs w:val="21"/>
+          <w:lang w:eastAsia="fr-CH"/>
+          <w14:ligatures w14:val="none"/>
+        </w:rPr>
+      </w:pPr>
+      <w:r>
+        <w:rPr>
+          <w:rFonts w:ascii="Consolas" w:eastAsia="Times New Roman" w:hAnsi="Consolas" w:cs="Times New Roman"/>
+          <w:color w:val="D4D4D4"/>
+          <w:kern w:val="0"/>
+          <w:sz w:val="21"/>
+          <w:szCs w:val="21"/>
+          <w:lang w:eastAsia="fr-CH"/>
+          <w14:ligatures w14:val="none"/>
+        </w:rPr>
+        <w:t xml:space="preserve">    </w:t>
+      </w:r>
+      <w:proofErr w:type="spellStart"/>
+      <w:r>
+        <w:rPr>
+          <w:rFonts w:ascii="Consolas" w:eastAsia="Times New Roman" w:hAnsi="Consolas" w:cs="Times New Roman"/>
+          <w:color w:val="D4D4D4"/>
+          <w:kern w:val="0"/>
+          <w:sz w:val="21"/>
+          <w:szCs w:val="21"/>
+          <w:lang w:eastAsia="fr-CH"/>
+          <w14:ligatures w14:val="none"/>
+        </w:rPr>
+        <w:t>Assert.IsTrue</w:t>
+      </w:r>
+      <w:proofErr w:type="spellEnd"/>
+      <w:r>
+        <w:rPr>
+          <w:rFonts w:ascii="Consolas" w:eastAsia="Times New Roman" w:hAnsi="Consolas" w:cs="Times New Roman"/>
+          <w:color w:val="D4D4D4"/>
+          <w:kern w:val="0"/>
+          <w:sz w:val="21"/>
+          <w:szCs w:val="21"/>
+          <w:lang w:eastAsia="fr-CH"/>
+          <w14:ligatures w14:val="none"/>
+        </w:rPr>
+        <w:t>(</w:t>
+      </w:r>
+      <w:proofErr w:type="spellStart"/>
+      <w:r>
+        <w:rPr>
+          <w:rFonts w:ascii="Consolas" w:eastAsia="Times New Roman" w:hAnsi="Consolas" w:cs="Times New Roman"/>
+          <w:color w:val="D4D4D4"/>
+          <w:kern w:val="0"/>
+          <w:sz w:val="21"/>
+          <w:szCs w:val="21"/>
+          <w:lang w:eastAsia="fr-CH"/>
+          <w14:ligatures w14:val="none"/>
+        </w:rPr>
+        <w:t>result</w:t>
+      </w:r>
+      <w:proofErr w:type="spellEnd"/>
+      <w:proofErr w:type="gramStart"/>
+      <w:r>
+        <w:rPr>
+          <w:rFonts w:ascii="Consolas" w:eastAsia="Times New Roman" w:hAnsi="Consolas" w:cs="Times New Roman"/>
+          <w:color w:val="D4D4D4"/>
+          <w:kern w:val="0"/>
+          <w:sz w:val="21"/>
+          <w:szCs w:val="21"/>
+          <w:lang w:eastAsia="fr-CH"/>
+          <w14:ligatures w14:val="none"/>
+        </w:rPr>
+        <w:t>);</w:t>
+      </w:r>
+      <w:proofErr w:type="gramEnd"/>
+    </w:p>
+    <w:p>
+      <w:pPr>
+        <w:shd w:val="clear" w:color="auto" w:fill="1E1E1E"/>
+        <w:spacing w:after="0" w:line="285" w:lineRule="atLeast"/>
+        <w:rPr>
+          <w:rFonts w:ascii="Consolas" w:eastAsia="Times New Roman" w:hAnsi="Consolas" w:cs="Times New Roman"/>
+          <w:color w:val="D4D4D4"/>
+          <w:kern w:val="0"/>
+          <w:sz w:val="21"/>
+          <w:szCs w:val="21"/>
+          <w:lang w:eastAsia="fr-CH"/>
+          <w14:ligatures w14:val="none"/>
+        </w:rPr>
+      </w:pPr>
+      <w:r>
+        <w:rPr>
+          <w:rFonts w:ascii="Consolas" w:eastAsia="Times New Roman" w:hAnsi="Consolas" w:cs="Times New Roman"/>
+          <w:color w:val="D4D4D4"/>
+          <w:kern w:val="0"/>
+          <w:sz w:val="21"/>
+          <w:szCs w:val="21"/>
+          <w:lang w:eastAsia="fr-CH"/>
+          <w14:ligatures w14:val="none"/>
+        </w:rPr>
+        <w:t>}</w:t>
+      </w:r>
+    </w:p>
+    <w:p>
+      <w:pPr>
+        <w:pStyle w:val="Paragraphedeliste"/>
+      </w:pPr>
+    </w:p>
+    <w:p>
+      <w:pPr>
+        <w:pStyle w:val="Titre4"/>
+      </w:pPr>
+      <w:r>
+        <w:t>Pour plus de couverture, Je demande à l’IA de me refaire le même avec d’autres valeurs.</w:t>
+      </w:r>
+    </w:p>
+    <w:p>
+      <w:r>
+        <w:t xml:space="preserve">Le modèle de langage </w:t>
+      </w:r>
+      <w:r>
+        <w:t>prend</w:t>
+      </w:r>
+      <w:r>
+        <w:t xml:space="preserve"> en compte les différents scénarios mais </w:t>
+      </w:r>
+      <w:r>
+        <w:t>commet</w:t>
+      </w:r>
+      <w:r>
+        <w:t xml:space="preserve"> des erreurs, je relis et corrige donc les tests et vérifie que tout fonctionne.</w:t>
+      </w:r>
+    </w:p>
+    <w:p>
+      <w:r>
+        <w:t>J’essaye aussi de changer quelques valeurs pour essayer de mettre</w:t>
+      </w:r>
+      <w:r>
+        <w:t xml:space="preserve"> plus</w:t>
+      </w:r>
+      <w:r>
+        <w:t xml:space="preserve"> en difficulté la méthode testée</w:t>
+      </w:r>
+      <w:r>
+        <w:t xml:space="preserve"> car l’IA a tendance </w:t>
+      </w:r>
+      <w:r>
+        <w:t>à</w:t>
+      </w:r>
+      <w:r>
+        <w:t xml:space="preserve"> vouloir que </w:t>
+      </w:r>
+      <w:r>
+        <w:t>le test</w:t>
+      </w:r>
+      <w:r>
+        <w:t xml:space="preserve"> réussisse.</w:t>
+      </w:r>
+      <w:r>
+        <w:br/>
       </w:r>
     </w:p>
     <w:p>
@@ -1775,27 +2955,447 @@
         <w:pStyle w:val="Titre1"/>
         <w:numPr>
           <w:ilvl w:val="0"/>
-          <w:numId w:val="1"/>
+          <w:numId w:val="13"/>
         </w:numPr>
       </w:pPr>
+      <w:bookmarkStart w:id="5" w:name="_Toc242631067"/>
       <w:r>
         <w:t>CONCEPTIO</w:t>
       </w:r>
       <w:r>
         <w:t>N</w:t>
       </w:r>
-      <w:bookmarkEnd w:id="2"/>
+      <w:bookmarkEnd w:id="5"/>
     </w:p>
     <w:p>
       <w:pPr>
         <w:pStyle w:val="Titre1"/>
         <w:numPr>
           <w:ilvl w:val="0"/>
-          <w:numId w:val="1"/>
+          <w:numId w:val="13"/>
         </w:numPr>
       </w:pPr>
+      <w:bookmarkStart w:id="6" w:name="_Toc242631068"/>
       <w:r>
         <w:t>UTILISATION DE L’IA</w:t>
+      </w:r>
+      <w:bookmarkEnd w:id="6"/>
+    </w:p>
+    <w:p>
+      <w:r>
+        <w:t>Pendant ce projet, j’ai essayé de faire attention à ne pas trop utiliser l’IA trop souvent, et seulement pour des tâches redondantes, comme transformer une définition de tableau en définition de liste ou créer plusieurs version</w:t>
+      </w:r>
+      <w:r>
+        <w:t>s</w:t>
+      </w:r>
+      <w:r>
+        <w:t xml:space="preserve"> d’un test semblable.</w:t>
+      </w:r>
+    </w:p>
+    <w:p>
+      <w:r>
+        <w:t xml:space="preserve">Lors de mon travail en dehors des cours, je n’ai pas désactivé </w:t>
+      </w:r>
+      <w:r>
+        <w:t>l’auto-remplissage</w:t>
+      </w:r>
+      <w:r>
+        <w:t xml:space="preserve"> sur mon PC personnel, ce qui </w:t>
+      </w:r>
+      <w:r>
+        <w:t>compte</w:t>
+      </w:r>
+      <w:r>
+        <w:t xml:space="preserve"> comme une utilisation de l’IA.</w:t>
+      </w:r>
+    </w:p>
+    <w:p>
+      <w:r>
+        <w:t xml:space="preserve">Cependant, Je ne l’ai utilisée </w:t>
+      </w:r>
+      <w:r>
+        <w:t>en très grande partie</w:t>
+      </w:r>
+      <w:r>
+        <w:t xml:space="preserve"> pour quelques </w:t>
+      </w:r>
+      <w:r>
+        <w:t>lignes, pour</w:t>
+      </w:r>
+      <w:r>
+        <w:t xml:space="preserve"> remplir des </w:t>
+      </w:r>
+      <w:r>
+        <w:rPr>
+          <w:b/>
+          <w:bCs/>
+        </w:rPr>
+        <w:t>for</w:t>
+      </w:r>
+      <w:r>
+        <w:t xml:space="preserve"> (1</w:t>
+      </w:r>
+      <w:r>
+        <w:rPr>
+          <w:vertAlign w:val="superscript"/>
+        </w:rPr>
+        <w:t>ère</w:t>
+      </w:r>
+      <w:r>
+        <w:t xml:space="preserve"> ligne) et autres tâches que je maitrise</w:t>
+      </w:r>
+      <w:r>
+        <w:t>, en toute honnêteté, je suis même peu satisfait des propositions qui m’ont été proposées.</w:t>
+      </w:r>
+    </w:p>
+    <w:p>
+      <w:r>
+        <w:t>Viennent ensuite les nombreux problèmes que j’ai eu avec les mouvements de mes ennemis,</w:t>
+      </w:r>
+      <w:r>
+        <w:t xml:space="preserve"> que je voulais faire bouger en file sur des axes prédéfinis</w:t>
+      </w:r>
+      <w:r>
+        <w:t xml:space="preserve">, ce qui s’est avéré </w:t>
+      </w:r>
+      <w:r>
+        <w:lastRenderedPageBreak/>
+        <w:t>trop</w:t>
+      </w:r>
+      <w:r>
+        <w:t xml:space="preserve"> compliqué et long</w:t>
+      </w:r>
+      <w:r>
+        <w:t>, pendant ce chapitre, j’ai demandé de l’aide pour imaginer quels outils je pouvais utiliser</w:t>
+      </w:r>
+      <w:r>
+        <w:t xml:space="preserve"> (utiliser une </w:t>
+      </w:r>
+      <w:proofErr w:type="gramStart"/>
+      <w:r>
+        <w:t>Liste,  une</w:t>
+      </w:r>
+      <w:proofErr w:type="gramEnd"/>
+      <w:r>
+        <w:t xml:space="preserve"> nouvelle classe)</w:t>
+      </w:r>
+      <w:r>
+        <w:t xml:space="preserve"> mais là encore, j’ai fini par opter pour ma propre approche</w:t>
+      </w:r>
+      <w:r>
+        <w:t>.</w:t>
+      </w:r>
+      <w:r>
+        <w:t xml:space="preserve"> </w:t>
+      </w:r>
+    </w:p>
+    <w:p>
+      <w:pPr>
+        <w:rPr>
+          <w:b/>
+          <w:bCs/>
+        </w:rPr>
+      </w:pPr>
+      <w:r>
+        <w:t xml:space="preserve">La seule utilisation importante est lorsque j’ai demandé pourquoi les images ne s’ajoutaient pas au projet, et j’ai donc appris </w:t>
+      </w:r>
+      <w:r>
+        <w:t>qu’il fallait utiliser l’</w:t>
+      </w:r>
+      <w:r>
+        <w:rPr>
+          <w:b/>
+          <w:bCs/>
+        </w:rPr>
+        <w:t>éditeur de ressources managées (héritée)</w:t>
+      </w:r>
+      <w:r>
+        <w:rPr>
+          <w:b/>
+          <w:bCs/>
+        </w:rPr>
+        <w:t>.</w:t>
+      </w:r>
+    </w:p>
+    <w:p>
+      <w:r>
+        <w:t>Je n’ai pas utilisé d’LLM pour le rapport.</w:t>
+      </w:r>
+    </w:p>
+    <w:p>
+      <w:r>
+        <w:t>Moins décisif pour la note du projet : je n’ai pas utilisé l’IA pour les images non plus.</w:t>
+      </w:r>
+    </w:p>
+    <w:p>
+      <w:pPr>
+        <w:pStyle w:val="Titre1"/>
+        <w:numPr>
+          <w:ilvl w:val="0"/>
+          <w:numId w:val="13"/>
+        </w:numPr>
+      </w:pPr>
+      <w:bookmarkStart w:id="7" w:name="_Toc242631069"/>
+      <w:r>
+        <w:t>DEROULEMENT DU PROJET</w:t>
+      </w:r>
+      <w:bookmarkEnd w:id="7"/>
+    </w:p>
+    <w:p>
+      <w:pPr>
+        <w:pStyle w:val="Titre4"/>
+      </w:pPr>
+      <w:r>
+        <w:t>Planning :</w:t>
+      </w:r>
+    </w:p>
+    <w:p>
+      <w:r>
+        <w:t>En avançant dans le projet, j’ai adapté mon avancée sur le moment</w:t>
+      </w:r>
+      <w:r>
+        <w:t xml:space="preserve"> au lieu de suivre la planification à la lettre</w:t>
+      </w:r>
+      <w:r>
+        <w:t>.</w:t>
+      </w:r>
+    </w:p>
+    <w:p>
+      <w:r>
+        <w:t xml:space="preserve">Je </w:t>
+      </w:r>
+      <w:r>
+        <w:t>choisissais</w:t>
+      </w:r>
+      <w:r>
+        <w:t xml:space="preserve"> simplement la US qui me semblait adaptée et essayait de la finir en un temps raisonnable.</w:t>
+      </w:r>
+    </w:p>
+    <w:p>
+      <w:r>
+        <w:t>Ainsi, j’ai ajouté les obstacles bien avant les ennemis car ils me semblaient plus abordables, et ait avancé bien moins vite que prévu.</w:t>
+      </w:r>
+    </w:p>
+    <w:p>
+      <w:r>
+        <w:t xml:space="preserve">Je me retrouve donc </w:t>
+      </w:r>
+      <w:r>
+        <w:t>à</w:t>
+      </w:r>
+      <w:r>
+        <w:t xml:space="preserve"> travailler quelques heures le weekend.</w:t>
+      </w:r>
+    </w:p>
+    <w:p>
+      <w:pPr>
+        <w:pStyle w:val="Titre4"/>
+      </w:pPr>
+      <w:r>
+        <w:t>Problèmes</w:t>
+      </w:r>
+    </w:p>
+    <w:p>
+      <w:r>
+        <w:t>Mon principal frein sur ce projet était les mouvements des ennemis, tout le reste s’est déroulé sans encombre a part une légère lenteur.</w:t>
+      </w:r>
+    </w:p>
+    <w:p>
+      <w:r>
+        <w:t>J’avais décidé que mes ennemis devraient bouger en lignes sur des axes définis, cela s’est avéré très long et je n’ai même pas terminé au moment du rendu 80%.</w:t>
+      </w:r>
+    </w:p>
+    <w:p>
+      <w:r>
+        <w:t xml:space="preserve">J’aurais pu simplement copier les exercices du module (drones) et utiliser </w:t>
+      </w:r>
+      <w:proofErr w:type="spellStart"/>
+      <w:r>
+        <w:rPr>
+          <w:b/>
+          <w:bCs/>
+        </w:rPr>
+        <w:t>roaming</w:t>
+      </w:r>
+      <w:proofErr w:type="spellEnd"/>
+      <w:r>
+        <w:t xml:space="preserve"> </w:t>
+      </w:r>
+      <w:r>
+        <w:t>pour mes ennemis</w:t>
+      </w:r>
+      <w:r>
+        <w:t>.</w:t>
+      </w:r>
+    </w:p>
+    <w:p>
+      <w:pPr>
+        <w:rPr>
+          <w:b/>
+          <w:bCs/>
+        </w:rPr>
+      </w:pPr>
+      <w:r>
+        <w:t xml:space="preserve">J’aurais été moins satisfait car j’avais envie de surmonter </w:t>
+      </w:r>
+      <w:r>
+        <w:t>ce défi</w:t>
+      </w:r>
+      <w:r>
+        <w:t>, mais j’aurais également gagné beaucoup de temps.</w:t>
+      </w:r>
+    </w:p>
+    <w:p>
+      <w:pPr>
+        <w:pStyle w:val="Titre1"/>
+        <w:numPr>
+          <w:ilvl w:val="0"/>
+          <w:numId w:val="13"/>
+        </w:numPr>
+      </w:pPr>
+      <w:bookmarkStart w:id="8" w:name="_Toc242631070"/>
+      <w:r>
+        <w:lastRenderedPageBreak/>
+        <w:t>BILAN PRODUIT</w:t>
+      </w:r>
+      <w:bookmarkEnd w:id="8"/>
+    </w:p>
+    <w:p>
+      <w:r>
+        <w:rPr>
+          <w:noProof/>
+        </w:rPr>
+        <w:drawing>
+          <wp:anchor distT="0" distB="0" distL="114300" distR="114300" simplePos="0" relativeHeight="251659264" behindDoc="0" locked="0" layoutInCell="1" allowOverlap="1" wp14:anchorId="3E1FF0D3" wp14:editId="0EDA9F20">
+            <wp:simplePos x="0" y="0"/>
+            <wp:positionH relativeFrom="page">
+              <wp:posOffset>217714</wp:posOffset>
+            </wp:positionH>
+            <wp:positionV relativeFrom="paragraph">
+              <wp:posOffset>245291</wp:posOffset>
+            </wp:positionV>
+            <wp:extent cx="7051981" cy="2932884"/>
+            <wp:effectExtent l="0" t="0" r="0" b="1270"/>
+            <wp:wrapTopAndBottom/>
+            <wp:docPr id="440935663" name="Image 1"/>
+            <wp:cNvGraphicFramePr>
+              <a:graphicFrameLocks xmlns:a="http://schemas.openxmlformats.org/drawingml/2006/main" noChangeAspect="1"/>
+            </wp:cNvGraphicFramePr>
+            <a:graphic xmlns:a="http://schemas.openxmlformats.org/drawingml/2006/main">
+              <a:graphicData uri="http://schemas.openxmlformats.org/drawingml/2006/picture">
+                <pic:pic xmlns:pic="http://schemas.openxmlformats.org/drawingml/2006/picture">
+                  <pic:nvPicPr>
+                    <pic:cNvPr id="440935663" name=""/>
+                    <pic:cNvPicPr/>
+                  </pic:nvPicPr>
+                  <pic:blipFill>
+                    <a:blip r:embed="rId11">
+                      <a:extLst>
+                        <a:ext uri="{28A0092B-C50C-407E-A947-70E740481C1C}">
+                          <a14:useLocalDpi xmlns:a14="http://schemas.microsoft.com/office/drawing/2010/main" val="0"/>
+                        </a:ext>
+                      </a:extLst>
+                    </a:blip>
+                    <a:stretch>
+                      <a:fillRect/>
+                    </a:stretch>
+                  </pic:blipFill>
+                  <pic:spPr>
+                    <a:xfrm>
+                      <a:off x="0" y="0"/>
+                      <a:ext cx="7051981" cy="2932884"/>
+                    </a:xfrm>
+                    <a:prstGeom prst="rect">
+                      <a:avLst/>
+                    </a:prstGeom>
+                  </pic:spPr>
+                </pic:pic>
+              </a:graphicData>
+            </a:graphic>
+            <wp14:sizeRelH relativeFrom="margin">
+              <wp14:pctWidth>0</wp14:pctWidth>
+            </wp14:sizeRelH>
+            <wp14:sizeRelV relativeFrom="margin">
+              <wp14:pctHeight>0</wp14:pctHeight>
+            </wp14:sizeRelV>
+          </wp:anchor>
+        </w:drawing>
+      </w:r>
+      <w:r>
+        <w:t>Bilan</w:t>
+      </w:r>
+      <w:r>
+        <w:t xml:space="preserve"> </w:t>
+      </w:r>
+      <w:r>
+        <w:t>80% :</w:t>
+      </w:r>
+    </w:p>
+    <w:p>
+      <w:r>
+        <w:t>Les mouvements des ennemis ont toujours des problèmes, ils se bloquent parfois et se superposent trop souvent.</w:t>
+      </w:r>
+    </w:p>
+    <w:p>
+      <w:r>
+        <w:t xml:space="preserve">Les dégâts du joueur fonctionnent mais les réapparitions ont </w:t>
+      </w:r>
+      <w:r>
+        <w:t xml:space="preserve">des </w:t>
+      </w:r>
+      <w:r>
+        <w:t>problèmes.</w:t>
+      </w:r>
+    </w:p>
+    <w:p>
+      <w:r>
+        <w:t>J’admets qu’en termes d’avancée, je suis en retrait. Cependant, les user stories qui restent ont le bénéfice de n’apporter rien de nouveau (à part le fond), et me causent moins d’inquiétudes que les problèmes</w:t>
+      </w:r>
+      <w:r>
+        <w:t xml:space="preserve"> dans </w:t>
+      </w:r>
+      <w:r>
+        <w:rPr>
+          <w:b/>
+          <w:bCs/>
+        </w:rPr>
+        <w:t xml:space="preserve">In </w:t>
+      </w:r>
+      <w:proofErr w:type="spellStart"/>
+      <w:r>
+        <w:rPr>
+          <w:b/>
+          <w:bCs/>
+        </w:rPr>
+        <w:t>progress</w:t>
+      </w:r>
+      <w:proofErr w:type="spellEnd"/>
+      <w:r>
+        <w:t xml:space="preserve"> et </w:t>
+      </w:r>
+      <w:r>
+        <w:rPr>
+          <w:b/>
+          <w:bCs/>
+        </w:rPr>
+        <w:t xml:space="preserve">In </w:t>
+      </w:r>
+      <w:proofErr w:type="spellStart"/>
+      <w:r>
+        <w:rPr>
+          <w:b/>
+          <w:bCs/>
+        </w:rPr>
+        <w:t>review</w:t>
+      </w:r>
+      <w:proofErr w:type="spellEnd"/>
+      <w:r>
+        <w:t>.</w:t>
+      </w:r>
+    </w:p>
+    <w:p>
+      <w:r>
+        <w:t>Il faut également que je trouve un moyen de changer le nom de ma solution et enlever les traces de drones venant de la base de code.</w:t>
       </w:r>
     </w:p>
     <w:p>
@@ -1806,9 +3406,11 @@
           <w:numId w:val="9"/>
         </w:numPr>
       </w:pPr>
-      <w:r>
-        <w:t>DEROULEMENT DU PROJET</w:t>
-      </w:r>
+      <w:bookmarkStart w:id="9" w:name="_Toc242631071"/>
+      <w:r>
+        <w:t>CONCLUSION</w:t>
+      </w:r>
+      <w:bookmarkEnd w:id="9"/>
     </w:p>
     <w:p>
       <w:pPr>
@@ -1818,56 +3420,42 @@
           <w:numId w:val="9"/>
         </w:numPr>
       </w:pPr>
-      <w:bookmarkStart w:id="3" w:name="_Toc238824187"/>
-      <w:r>
-        <w:t>BILAN PRODUIT</w:t>
-      </w:r>
-    </w:p>
-    <w:p>
-      <w:pPr>
-        <w:pStyle w:val="Titre1"/>
-        <w:numPr>
-          <w:ilvl w:val="0"/>
-          <w:numId w:val="9"/>
-        </w:numPr>
-      </w:pPr>
-      <w:r>
-        <w:t>CONCLUSION</w:t>
-      </w:r>
-      <w:bookmarkEnd w:id="3"/>
-    </w:p>
-    <w:p>
-      <w:pPr>
-        <w:pStyle w:val="Titre1"/>
-        <w:numPr>
-          <w:ilvl w:val="0"/>
-          <w:numId w:val="9"/>
-        </w:numPr>
-      </w:pPr>
-      <w:bookmarkStart w:id="4" w:name="_Toc238824188"/>
+      <w:bookmarkStart w:id="10" w:name="_Toc242631072"/>
       <w:r>
         <w:t>ANNEXE</w:t>
       </w:r>
-      <w:bookmarkEnd w:id="4"/>
+      <w:bookmarkEnd w:id="10"/>
     </w:p>
     <w:p>
       <w:pPr>
         <w:pStyle w:val="Titre2"/>
       </w:pPr>
+      <w:bookmarkStart w:id="11" w:name="_Toc242631073"/>
       <w:r>
         <w:t>Liens en version texte :</w:t>
       </w:r>
+      <w:bookmarkEnd w:id="11"/>
       <w:r>
         <w:t xml:space="preserve"> </w:t>
       </w:r>
     </w:p>
     <w:p>
-      <w:hyperlink r:id="rId10" w:history="1">
+      <w:hyperlink r:id="rId12" w:history="1">
         <w:r>
           <w:rPr>
             <w:rStyle w:val="Lienhypertexte"/>
           </w:rPr>
           <w:t>https://github.com/users/yohannf-222/projects/1/views/1</w:t>
+        </w:r>
+      </w:hyperlink>
+    </w:p>
+    <w:p>
+      <w:hyperlink r:id="rId13" w:history="1">
+        <w:r>
+          <w:rPr>
+            <w:rStyle w:val="Lienhypertexte"/>
+          </w:rPr>
+          <w:t>https://github.com/yohannf-222/Projet-320-ShootMeUp-YFS</w:t>
         </w:r>
       </w:hyperlink>
     </w:p>
@@ -2243,7 +3831,7 @@
   <w:abstractNum w:abstractNumId="4" w15:restartNumberingAfterBreak="0">
     <w:nsid w:val="34695AAE"/>
     <w:multiLevelType w:val="hybridMultilevel"/>
-    <w:tmpl w:val="3920CE14"/>
+    <w:tmpl w:val="9B545082"/>
     <w:lvl w:ilvl="0" w:tplc="100C000F">
       <w:start w:val="1"/>
       <w:numFmt w:val="decimal"/>
@@ -2680,6 +4268,92 @@
     </w:lvl>
   </w:abstractNum>
   <w:abstractNum w:abstractNumId="9" w15:restartNumberingAfterBreak="0">
+    <w:nsid w:val="60736E98"/>
+    <w:multiLevelType w:val="hybridMultilevel"/>
+    <w:tmpl w:val="F81A98B8"/>
+    <w:lvl w:ilvl="0" w:tplc="100C000F">
+      <w:start w:val="1"/>
+      <w:numFmt w:val="decimal"/>
+      <w:lvlText w:val="%1."/>
+      <w:lvlJc w:val="left"/>
+      <w:pPr>
+        <w:ind w:left="720" w:hanging="360"/>
+      </w:pPr>
+    </w:lvl>
+    <w:lvl w:ilvl="1" w:tplc="100C0019" w:tentative="1">
+      <w:start w:val="1"/>
+      <w:numFmt w:val="lowerLetter"/>
+      <w:lvlText w:val="%2."/>
+      <w:lvlJc w:val="left"/>
+      <w:pPr>
+        <w:ind w:left="1440" w:hanging="360"/>
+      </w:pPr>
+    </w:lvl>
+    <w:lvl w:ilvl="2" w:tplc="100C001B" w:tentative="1">
+      <w:start w:val="1"/>
+      <w:numFmt w:val="lowerRoman"/>
+      <w:lvlText w:val="%3."/>
+      <w:lvlJc w:val="right"/>
+      <w:pPr>
+        <w:ind w:left="2160" w:hanging="180"/>
+      </w:pPr>
+    </w:lvl>
+    <w:lvl w:ilvl="3" w:tplc="100C000F" w:tentative="1">
+      <w:start w:val="1"/>
+      <w:numFmt w:val="decimal"/>
+      <w:lvlText w:val="%4."/>
+      <w:lvlJc w:val="left"/>
+      <w:pPr>
+        <w:ind w:left="2880" w:hanging="360"/>
+      </w:pPr>
+    </w:lvl>
+    <w:lvl w:ilvl="4" w:tplc="100C0019" w:tentative="1">
+      <w:start w:val="1"/>
+      <w:numFmt w:val="lowerLetter"/>
+      <w:lvlText w:val="%5."/>
+      <w:lvlJc w:val="left"/>
+      <w:pPr>
+        <w:ind w:left="3600" w:hanging="360"/>
+      </w:pPr>
+    </w:lvl>
+    <w:lvl w:ilvl="5" w:tplc="100C001B" w:tentative="1">
+      <w:start w:val="1"/>
+      <w:numFmt w:val="lowerRoman"/>
+      <w:lvlText w:val="%6."/>
+      <w:lvlJc w:val="right"/>
+      <w:pPr>
+        <w:ind w:left="4320" w:hanging="180"/>
+      </w:pPr>
+    </w:lvl>
+    <w:lvl w:ilvl="6" w:tplc="100C000F" w:tentative="1">
+      <w:start w:val="1"/>
+      <w:numFmt w:val="decimal"/>
+      <w:lvlText w:val="%7."/>
+      <w:lvlJc w:val="left"/>
+      <w:pPr>
+        <w:ind w:left="5040" w:hanging="360"/>
+      </w:pPr>
+    </w:lvl>
+    <w:lvl w:ilvl="7" w:tplc="100C0019" w:tentative="1">
+      <w:start w:val="1"/>
+      <w:numFmt w:val="lowerLetter"/>
+      <w:lvlText w:val="%8."/>
+      <w:lvlJc w:val="left"/>
+      <w:pPr>
+        <w:ind w:left="5760" w:hanging="360"/>
+      </w:pPr>
+    </w:lvl>
+    <w:lvl w:ilvl="8" w:tplc="100C001B" w:tentative="1">
+      <w:start w:val="1"/>
+      <w:numFmt w:val="lowerRoman"/>
+      <w:lvlText w:val="%9."/>
+      <w:lvlJc w:val="right"/>
+      <w:pPr>
+        <w:ind w:left="6480" w:hanging="180"/>
+      </w:pPr>
+    </w:lvl>
+  </w:abstractNum>
+  <w:abstractNum w:abstractNumId="10" w15:restartNumberingAfterBreak="0">
     <w:nsid w:val="6285458D"/>
     <w:multiLevelType w:val="hybridMultilevel"/>
     <w:tmpl w:val="926CB764"/>
@@ -2768,7 +4442,93 @@
       </w:pPr>
     </w:lvl>
   </w:abstractNum>
-  <w:abstractNum w:abstractNumId="10" w15:restartNumberingAfterBreak="0">
+  <w:abstractNum w:abstractNumId="11" w15:restartNumberingAfterBreak="0">
+    <w:nsid w:val="6EB44182"/>
+    <w:multiLevelType w:val="hybridMultilevel"/>
+    <w:tmpl w:val="9B545082"/>
+    <w:lvl w:ilvl="0" w:tplc="FFFFFFFF">
+      <w:start w:val="1"/>
+      <w:numFmt w:val="decimal"/>
+      <w:lvlText w:val="%1."/>
+      <w:lvlJc w:val="left"/>
+      <w:pPr>
+        <w:ind w:left="720" w:hanging="360"/>
+      </w:pPr>
+    </w:lvl>
+    <w:lvl w:ilvl="1" w:tplc="FFFFFFFF" w:tentative="1">
+      <w:start w:val="1"/>
+      <w:numFmt w:val="lowerLetter"/>
+      <w:lvlText w:val="%2."/>
+      <w:lvlJc w:val="left"/>
+      <w:pPr>
+        <w:ind w:left="1440" w:hanging="360"/>
+      </w:pPr>
+    </w:lvl>
+    <w:lvl w:ilvl="2" w:tplc="FFFFFFFF" w:tentative="1">
+      <w:start w:val="1"/>
+      <w:numFmt w:val="lowerRoman"/>
+      <w:lvlText w:val="%3."/>
+      <w:lvlJc w:val="right"/>
+      <w:pPr>
+        <w:ind w:left="2160" w:hanging="180"/>
+      </w:pPr>
+    </w:lvl>
+    <w:lvl w:ilvl="3" w:tplc="FFFFFFFF" w:tentative="1">
+      <w:start w:val="1"/>
+      <w:numFmt w:val="decimal"/>
+      <w:lvlText w:val="%4."/>
+      <w:lvlJc w:val="left"/>
+      <w:pPr>
+        <w:ind w:left="2880" w:hanging="360"/>
+      </w:pPr>
+    </w:lvl>
+    <w:lvl w:ilvl="4" w:tplc="FFFFFFFF" w:tentative="1">
+      <w:start w:val="1"/>
+      <w:numFmt w:val="lowerLetter"/>
+      <w:lvlText w:val="%5."/>
+      <w:lvlJc w:val="left"/>
+      <w:pPr>
+        <w:ind w:left="3600" w:hanging="360"/>
+      </w:pPr>
+    </w:lvl>
+    <w:lvl w:ilvl="5" w:tplc="FFFFFFFF" w:tentative="1">
+      <w:start w:val="1"/>
+      <w:numFmt w:val="lowerRoman"/>
+      <w:lvlText w:val="%6."/>
+      <w:lvlJc w:val="right"/>
+      <w:pPr>
+        <w:ind w:left="4320" w:hanging="180"/>
+      </w:pPr>
+    </w:lvl>
+    <w:lvl w:ilvl="6" w:tplc="FFFFFFFF" w:tentative="1">
+      <w:start w:val="1"/>
+      <w:numFmt w:val="decimal"/>
+      <w:lvlText w:val="%7."/>
+      <w:lvlJc w:val="left"/>
+      <w:pPr>
+        <w:ind w:left="5040" w:hanging="360"/>
+      </w:pPr>
+    </w:lvl>
+    <w:lvl w:ilvl="7" w:tplc="FFFFFFFF" w:tentative="1">
+      <w:start w:val="1"/>
+      <w:numFmt w:val="lowerLetter"/>
+      <w:lvlText w:val="%8."/>
+      <w:lvlJc w:val="left"/>
+      <w:pPr>
+        <w:ind w:left="5760" w:hanging="360"/>
+      </w:pPr>
+    </w:lvl>
+    <w:lvl w:ilvl="8" w:tplc="FFFFFFFF" w:tentative="1">
+      <w:start w:val="1"/>
+      <w:numFmt w:val="lowerRoman"/>
+      <w:lvlText w:val="%9."/>
+      <w:lvlJc w:val="right"/>
+      <w:pPr>
+        <w:ind w:left="6480" w:hanging="180"/>
+      </w:pPr>
+    </w:lvl>
+  </w:abstractNum>
+  <w:abstractNum w:abstractNumId="12" w15:restartNumberingAfterBreak="0">
     <w:nsid w:val="7F301BCF"/>
     <w:multiLevelType w:val="hybridMultilevel"/>
     <w:tmpl w:val="F4CAA6CC"/>
@@ -2891,7 +4651,7 @@
     <w:abstractNumId w:val="0"/>
   </w:num>
   <w:num w:numId="4" w16cid:durableId="1037704526">
-    <w:abstractNumId w:val="9"/>
+    <w:abstractNumId w:val="10"/>
   </w:num>
   <w:num w:numId="5" w16cid:durableId="613707920">
     <w:abstractNumId w:val="1"/>
@@ -2900,7 +4660,7 @@
     <w:abstractNumId w:val="7"/>
   </w:num>
   <w:num w:numId="7" w16cid:durableId="301859108">
-    <w:abstractNumId w:val="10"/>
+    <w:abstractNumId w:val="12"/>
   </w:num>
   <w:num w:numId="8" w16cid:durableId="846754967">
     <w:abstractNumId w:val="2"/>
@@ -2913,6 +4673,12 @@
   </w:num>
   <w:num w:numId="11" w16cid:durableId="388040273">
     <w:abstractNumId w:val="5"/>
+  </w:num>
+  <w:num w:numId="12" w16cid:durableId="1361467411">
+    <w:abstractNumId w:val="11"/>
+  </w:num>
+  <w:num w:numId="13" w16cid:durableId="1778212035">
+    <w:abstractNumId w:val="9"/>
   </w:num>
 </w:numbering>
 </file>
@@ -4256,14 +6022,6 @@
 </file>
 
 <file path=customXml/item1.xml><?xml version="1.0" encoding="utf-8"?>
-<p:properties xmlns:p="http://schemas.microsoft.com/office/2006/metadata/properties" xmlns:xsi="http://www.w3.org/2001/XMLSchema-instance" xmlns:pc="http://schemas.microsoft.com/office/infopath/2007/PartnerControls">
-  <documentManagement>
-    <_activity xmlns="0dcbab57-ce0d-48ec-9006-afbf43b82b42" xsi:nil="true"/>
-  </documentManagement>
-</p:properties>
-</file>
-
-<file path=customXml/item2.xml><?xml version="1.0" encoding="utf-8"?>
 <?mso-contentType ?>
 <FormTemplates xmlns="http://schemas.microsoft.com/sharepoint/v3/contenttype/forms">
   <Display>DocumentLibraryForm</Display>
@@ -4272,7 +6030,7 @@
 </FormTemplates>
 </file>
 
-<file path=customXml/item3.xml><?xml version="1.0" encoding="utf-8"?>
+<file path=customXml/item2.xml><?xml version="1.0" encoding="utf-8"?>
 <ct:contentTypeSchema xmlns:ct="http://schemas.microsoft.com/office/2006/metadata/contentType" xmlns:ma="http://schemas.microsoft.com/office/2006/metadata/properties/metaAttributes" ct:_="" ma:_="" ma:contentTypeName="Document" ma:contentTypeID="0x010100735015723C2CFE488EA62BE6EBA752B5" ma:contentTypeVersion="10" ma:contentTypeDescription="Crée un document." ma:contentTypeScope="" ma:versionID="879a0952b67ddc4861aa98f664a08e07">
   <xsd:schema xmlns:xsd="http://www.w3.org/2001/XMLSchema" xmlns:xs="http://www.w3.org/2001/XMLSchema" xmlns:p="http://schemas.microsoft.com/office/2006/metadata/properties" xmlns:ns3="0dcbab57-ce0d-48ec-9006-afbf43b82b42" targetNamespace="http://schemas.microsoft.com/office/2006/metadata/properties" ma:root="true" ma:fieldsID="872bcaed78208874ee82016f6206aa40" ns3:_="">
     <xsd:import namespace="0dcbab57-ce0d-48ec-9006-afbf43b82b42"/>
@@ -4454,17 +6212,15 @@
 </ct:contentTypeSchema>
 </file>
 
-<file path=customXml/itemProps1.xml><?xml version="1.0" encoding="utf-8"?>
-<ds:datastoreItem xmlns:ds="http://schemas.openxmlformats.org/officeDocument/2006/customXml" ds:itemID="{7D23386E-842B-4B42-9D04-7B63869B43F9}">
-  <ds:schemaRefs>
-    <ds:schemaRef ds:uri="http://schemas.microsoft.com/office/2006/metadata/properties"/>
-    <ds:schemaRef ds:uri="http://schemas.microsoft.com/office/infopath/2007/PartnerControls"/>
-    <ds:schemaRef ds:uri="0dcbab57-ce0d-48ec-9006-afbf43b82b42"/>
-  </ds:schemaRefs>
-</ds:datastoreItem>
+<file path=customXml/item3.xml><?xml version="1.0" encoding="utf-8"?>
+<p:properties xmlns:p="http://schemas.microsoft.com/office/2006/metadata/properties" xmlns:xsi="http://www.w3.org/2001/XMLSchema-instance" xmlns:pc="http://schemas.microsoft.com/office/infopath/2007/PartnerControls">
+  <documentManagement>
+    <_activity xmlns="0dcbab57-ce0d-48ec-9006-afbf43b82b42" xsi:nil="true"/>
+  </documentManagement>
+</p:properties>
 </file>
 
-<file path=customXml/itemProps2.xml><?xml version="1.0" encoding="utf-8"?>
+<file path=customXml/itemProps1.xml><?xml version="1.0" encoding="utf-8"?>
 <ds:datastoreItem xmlns:ds="http://schemas.openxmlformats.org/officeDocument/2006/customXml" ds:itemID="{ACF3336E-B009-4268-AFDE-A53C75438088}">
   <ds:schemaRefs>
     <ds:schemaRef ds:uri="http://schemas.microsoft.com/sharepoint/v3/contenttype/forms"/>
@@ -4472,7 +6228,7 @@
 </ds:datastoreItem>
 </file>
 
-<file path=customXml/itemProps3.xml><?xml version="1.0" encoding="utf-8"?>
+<file path=customXml/itemProps2.xml><?xml version="1.0" encoding="utf-8"?>
 <ds:datastoreItem xmlns:ds="http://schemas.openxmlformats.org/officeDocument/2006/customXml" ds:itemID="{1FC03C61-EAFE-4134-834E-573F40A8F159}">
   <ds:schemaRefs>
     <ds:schemaRef ds:uri="http://schemas.microsoft.com/office/2006/metadata/contentType"/>
@@ -4488,4 +6244,14 @@
     <ds:schemaRef ds:uri="http://schemas.microsoft.com/internal/obd"/>
   </ds:schemaRefs>
 </ds:datastoreItem>
+</file>
+
+<file path=customXml/itemProps3.xml><?xml version="1.0" encoding="utf-8"?>
+<ds:datastoreItem xmlns:ds="http://schemas.openxmlformats.org/officeDocument/2006/customXml" ds:itemID="{7D23386E-842B-4B42-9D04-7B63869B43F9}">
+  <ds:schemaRefs>
+    <ds:schemaRef ds:uri="http://schemas.microsoft.com/office/2006/metadata/properties"/>
+    <ds:schemaRef ds:uri="http://schemas.microsoft.com/office/infopath/2007/PartnerControls"/>
+    <ds:schemaRef ds:uri="0dcbab57-ce0d-48ec-9006-afbf43b82b42"/>
+  </ds:schemaRefs>
+</ds:datastoreItem>
 </file>
</xml_diff>

<commit_message>
chore(doc) : maj 30.10 intermediaire
</commit_message>
<xml_diff>
--- a/doc/H-P_ShootMeUp-pe84djb-Rapport.docx
+++ b/doc/H-P_ShootMeUp-pe84djb-Rapport.docx
@@ -113,7 +113,6 @@
         </w:rPr>
         <w:t xml:space="preserve">Rapport </w:t>
       </w:r>
-      <w:proofErr w:type="spellStart"/>
       <w:r>
         <w:rPr>
           <w:b/>
@@ -126,7 +125,6 @@
         </w:rPr>
         <w:t>ShootMeUp</w:t>
       </w:r>
-      <w:proofErr w:type="spellEnd"/>
     </w:p>
     <w:p>
       <w:pPr>
@@ -1555,15 +1553,7 @@
         <w:t>Ces documents vont nous servir à nous organiser, séparer le travail en plusieurs parties (user stories)</w:t>
       </w:r>
       <w:r>
-        <w:t xml:space="preserve">, créer des </w:t>
-      </w:r>
-      <w:proofErr w:type="spellStart"/>
-      <w:r>
-        <w:t>commits</w:t>
-      </w:r>
-      <w:proofErr w:type="spellEnd"/>
-      <w:r>
-        <w:t xml:space="preserve"> atomiques clairs respectant des conventions,</w:t>
+        <w:t>, créer des commits atomiques clairs respectant des conventions,</w:t>
       </w:r>
       <w:r>
         <w:t xml:space="preserve"> ainsi que des points antérieurs tels qu’un rapport de test etc…</w:t>
@@ -1603,15 +1593,7 @@
         <w:t>,</w:t>
       </w:r>
       <w:r>
-        <w:t xml:space="preserve"> mais la rédaction de rapports, </w:t>
-      </w:r>
-      <w:proofErr w:type="spellStart"/>
-      <w:r>
-        <w:t>jdt</w:t>
-      </w:r>
-      <w:proofErr w:type="spellEnd"/>
-      <w:r>
-        <w:t xml:space="preserve"> et autres points mentionnés nous apprends à être organisés et </w:t>
+        <w:t xml:space="preserve"> mais la rédaction de rapports, jdt et autres points mentionnés nous apprends à être organisés et </w:t>
       </w:r>
       <w:r>
         <w:t>professionnels.</w:t>
@@ -2195,7 +2177,6 @@
       <w:r>
         <w:t xml:space="preserve">J’ai ajouté un projet </w:t>
       </w:r>
-      <w:proofErr w:type="spellStart"/>
       <w:r>
         <w:rPr>
           <w:b/>
@@ -2203,7 +2184,6 @@
         </w:rPr>
         <w:t>MSTest</w:t>
       </w:r>
-      <w:proofErr w:type="spellEnd"/>
       <w:r>
         <w:t xml:space="preserve"> dans la solution et chaque test a une méthode dans ce projet (un seul fichier).</w:t>
       </w:r>
@@ -2286,22 +2266,23 @@
           <w:lang w:eastAsia="fr-CH"/>
           <w14:ligatures w14:val="none"/>
         </w:rPr>
-        <w:t>[</w:t>
-      </w:r>
-      <w:proofErr w:type="spellStart"/>
-      <w:r>
+        <w:t>[TestMethod]</w:t>
+      </w:r>
+    </w:p>
+    <w:p>
+      <w:pPr>
+        <w:shd w:val="clear" w:color="auto" w:fill="1E1E1E"/>
+        <w:spacing w:after="0" w:line="285" w:lineRule="atLeast"/>
         <w:rPr>
           <w:rFonts w:ascii="Consolas" w:eastAsia="Times New Roman" w:hAnsi="Consolas" w:cs="Times New Roman"/>
           <w:color w:val="D4D4D4"/>
           <w:kern w:val="0"/>
           <w:sz w:val="21"/>
           <w:szCs w:val="21"/>
-          <w:lang w:eastAsia="fr-CH"/>
+          <w:lang w:val="en-US" w:eastAsia="fr-CH"/>
           <w14:ligatures w14:val="none"/>
         </w:rPr>
-        <w:t>TestMethod</w:t>
-      </w:r>
-      <w:proofErr w:type="spellEnd"/>
+      </w:pPr>
       <w:r>
         <w:rPr>
           <w:rFonts w:ascii="Consolas" w:eastAsia="Times New Roman" w:hAnsi="Consolas" w:cs="Times New Roman"/>
@@ -2309,11 +2290,203 @@
           <w:kern w:val="0"/>
           <w:sz w:val="21"/>
           <w:szCs w:val="21"/>
-          <w:lang w:eastAsia="fr-CH"/>
+          <w:lang w:val="en-US" w:eastAsia="fr-CH"/>
           <w14:ligatures w14:val="none"/>
         </w:rPr>
-        <w:t>]</w:t>
-      </w:r>
+        <w:t>public void MathHelpers_IsTouching_2Rectangles_True()</w:t>
+      </w:r>
+    </w:p>
+    <w:p>
+      <w:pPr>
+        <w:shd w:val="clear" w:color="auto" w:fill="1E1E1E"/>
+        <w:spacing w:after="0" w:line="285" w:lineRule="atLeast"/>
+        <w:rPr>
+          <w:rFonts w:ascii="Consolas" w:eastAsia="Times New Roman" w:hAnsi="Consolas" w:cs="Times New Roman"/>
+          <w:color w:val="D4D4D4"/>
+          <w:kern w:val="0"/>
+          <w:sz w:val="21"/>
+          <w:szCs w:val="21"/>
+          <w:lang w:val="en-US" w:eastAsia="fr-CH"/>
+          <w14:ligatures w14:val="none"/>
+        </w:rPr>
+      </w:pPr>
+      <w:r>
+        <w:rPr>
+          <w:rFonts w:ascii="Consolas" w:eastAsia="Times New Roman" w:hAnsi="Consolas" w:cs="Times New Roman"/>
+          <w:color w:val="D4D4D4"/>
+          <w:kern w:val="0"/>
+          <w:sz w:val="21"/>
+          <w:szCs w:val="21"/>
+          <w:lang w:val="en-US" w:eastAsia="fr-CH"/>
+          <w14:ligatures w14:val="none"/>
+        </w:rPr>
+        <w:t>{</w:t>
+      </w:r>
+    </w:p>
+    <w:p>
+      <w:pPr>
+        <w:shd w:val="clear" w:color="auto" w:fill="1E1E1E"/>
+        <w:spacing w:after="0" w:line="285" w:lineRule="atLeast"/>
+        <w:rPr>
+          <w:rFonts w:ascii="Consolas" w:eastAsia="Times New Roman" w:hAnsi="Consolas" w:cs="Times New Roman"/>
+          <w:color w:val="D4D4D4"/>
+          <w:kern w:val="0"/>
+          <w:sz w:val="21"/>
+          <w:szCs w:val="21"/>
+          <w:lang w:val="en-US" w:eastAsia="fr-CH"/>
+          <w14:ligatures w14:val="none"/>
+        </w:rPr>
+      </w:pPr>
+      <w:r>
+        <w:rPr>
+          <w:rFonts w:ascii="Consolas" w:eastAsia="Times New Roman" w:hAnsi="Consolas" w:cs="Times New Roman"/>
+          <w:color w:val="D4D4D4"/>
+          <w:kern w:val="0"/>
+          <w:sz w:val="21"/>
+          <w:szCs w:val="21"/>
+          <w:lang w:val="en-US" w:eastAsia="fr-CH"/>
+          <w14:ligatures w14:val="none"/>
+        </w:rPr>
+        <w:t xml:space="preserve">    // Arrange</w:t>
+      </w:r>
+    </w:p>
+    <w:p>
+      <w:pPr>
+        <w:shd w:val="clear" w:color="auto" w:fill="1E1E1E"/>
+        <w:spacing w:after="0" w:line="285" w:lineRule="atLeast"/>
+        <w:rPr>
+          <w:rFonts w:ascii="Consolas" w:eastAsia="Times New Roman" w:hAnsi="Consolas" w:cs="Times New Roman"/>
+          <w:color w:val="D4D4D4"/>
+          <w:kern w:val="0"/>
+          <w:sz w:val="21"/>
+          <w:szCs w:val="21"/>
+          <w:lang w:val="en-US" w:eastAsia="fr-CH"/>
+          <w14:ligatures w14:val="none"/>
+        </w:rPr>
+      </w:pPr>
+      <w:r>
+        <w:rPr>
+          <w:rFonts w:ascii="Consolas" w:eastAsia="Times New Roman" w:hAnsi="Consolas" w:cs="Times New Roman"/>
+          <w:color w:val="D4D4D4"/>
+          <w:kern w:val="0"/>
+          <w:sz w:val="21"/>
+          <w:szCs w:val="21"/>
+          <w:lang w:val="en-US" w:eastAsia="fr-CH"/>
+          <w14:ligatures w14:val="none"/>
+        </w:rPr>
+        <w:t xml:space="preserve">    int x1 = 0, y1 = 0, width1 = 10, height1 = 10;</w:t>
+      </w:r>
+    </w:p>
+    <w:p>
+      <w:pPr>
+        <w:shd w:val="clear" w:color="auto" w:fill="1E1E1E"/>
+        <w:spacing w:after="0" w:line="285" w:lineRule="atLeast"/>
+        <w:rPr>
+          <w:rFonts w:ascii="Consolas" w:eastAsia="Times New Roman" w:hAnsi="Consolas" w:cs="Times New Roman"/>
+          <w:color w:val="D4D4D4"/>
+          <w:kern w:val="0"/>
+          <w:sz w:val="21"/>
+          <w:szCs w:val="21"/>
+          <w:lang w:val="en-US" w:eastAsia="fr-CH"/>
+          <w14:ligatures w14:val="none"/>
+        </w:rPr>
+      </w:pPr>
+      <w:r>
+        <w:rPr>
+          <w:rFonts w:ascii="Consolas" w:eastAsia="Times New Roman" w:hAnsi="Consolas" w:cs="Times New Roman"/>
+          <w:color w:val="D4D4D4"/>
+          <w:kern w:val="0"/>
+          <w:sz w:val="21"/>
+          <w:szCs w:val="21"/>
+          <w:lang w:val="en-US" w:eastAsia="fr-CH"/>
+          <w14:ligatures w14:val="none"/>
+        </w:rPr>
+        <w:t xml:space="preserve">    int x2 = 5, y2 = 5, width2 = 10, height2 = 10;</w:t>
+      </w:r>
+    </w:p>
+    <w:p>
+      <w:pPr>
+        <w:shd w:val="clear" w:color="auto" w:fill="1E1E1E"/>
+        <w:spacing w:after="0" w:line="285" w:lineRule="atLeast"/>
+        <w:rPr>
+          <w:rFonts w:ascii="Consolas" w:eastAsia="Times New Roman" w:hAnsi="Consolas" w:cs="Times New Roman"/>
+          <w:color w:val="D4D4D4"/>
+          <w:kern w:val="0"/>
+          <w:sz w:val="21"/>
+          <w:szCs w:val="21"/>
+          <w:lang w:val="en-US" w:eastAsia="fr-CH"/>
+          <w14:ligatures w14:val="none"/>
+        </w:rPr>
+      </w:pPr>
+    </w:p>
+    <w:p>
+      <w:pPr>
+        <w:shd w:val="clear" w:color="auto" w:fill="1E1E1E"/>
+        <w:spacing w:after="0" w:line="285" w:lineRule="atLeast"/>
+        <w:rPr>
+          <w:rFonts w:ascii="Consolas" w:eastAsia="Times New Roman" w:hAnsi="Consolas" w:cs="Times New Roman"/>
+          <w:color w:val="D4D4D4"/>
+          <w:kern w:val="0"/>
+          <w:sz w:val="21"/>
+          <w:szCs w:val="21"/>
+          <w:lang w:val="en-US" w:eastAsia="fr-CH"/>
+          <w14:ligatures w14:val="none"/>
+        </w:rPr>
+      </w:pPr>
+      <w:r>
+        <w:rPr>
+          <w:rFonts w:ascii="Consolas" w:eastAsia="Times New Roman" w:hAnsi="Consolas" w:cs="Times New Roman"/>
+          <w:color w:val="D4D4D4"/>
+          <w:kern w:val="0"/>
+          <w:sz w:val="21"/>
+          <w:szCs w:val="21"/>
+          <w:lang w:val="en-US" w:eastAsia="fr-CH"/>
+          <w14:ligatures w14:val="none"/>
+        </w:rPr>
+        <w:t xml:space="preserve">    // Act</w:t>
+      </w:r>
+    </w:p>
+    <w:p>
+      <w:pPr>
+        <w:shd w:val="clear" w:color="auto" w:fill="1E1E1E"/>
+        <w:spacing w:after="0" w:line="285" w:lineRule="atLeast"/>
+        <w:rPr>
+          <w:rFonts w:ascii="Consolas" w:eastAsia="Times New Roman" w:hAnsi="Consolas" w:cs="Times New Roman"/>
+          <w:color w:val="D4D4D4"/>
+          <w:kern w:val="0"/>
+          <w:sz w:val="21"/>
+          <w:szCs w:val="21"/>
+          <w:lang w:val="en-US" w:eastAsia="fr-CH"/>
+          <w14:ligatures w14:val="none"/>
+        </w:rPr>
+      </w:pPr>
+      <w:r>
+        <w:rPr>
+          <w:rFonts w:ascii="Consolas" w:eastAsia="Times New Roman" w:hAnsi="Consolas" w:cs="Times New Roman"/>
+          <w:color w:val="D4D4D4"/>
+          <w:kern w:val="0"/>
+          <w:sz w:val="21"/>
+          <w:szCs w:val="21"/>
+          <w:lang w:val="en-US" w:eastAsia="fr-CH"/>
+          <w14:ligatures w14:val="none"/>
+        </w:rPr>
+        <w:t xml:space="preserve">    bool result = MathHelpers.IsTouching(x1, y1, width1, height1, x2, y2, width2, height2);</w:t>
+      </w:r>
+    </w:p>
+    <w:p>
+      <w:pPr>
+        <w:shd w:val="clear" w:color="auto" w:fill="1E1E1E"/>
+        <w:spacing w:after="0" w:line="285" w:lineRule="atLeast"/>
+        <w:rPr>
+          <w:rFonts w:ascii="Consolas" w:eastAsia="Times New Roman" w:hAnsi="Consolas" w:cs="Times New Roman"/>
+          <w:color w:val="D4D4D4"/>
+          <w:kern w:val="0"/>
+          <w:sz w:val="21"/>
+          <w:szCs w:val="21"/>
+          <w:lang w:val="en-US" w:eastAsia="fr-CH"/>
+          <w14:ligatures w14:val="none"/>
+        </w:rPr>
+      </w:pPr>
     </w:p>
     <w:p>
       <w:pPr>
@@ -2329,7 +2502,18 @@
           <w14:ligatures w14:val="none"/>
         </w:rPr>
       </w:pPr>
-      <w:proofErr w:type="gramStart"/>
+      <w:r>
+        <w:rPr>
+          <w:rFonts w:ascii="Consolas" w:eastAsia="Times New Roman" w:hAnsi="Consolas" w:cs="Times New Roman"/>
+          <w:color w:val="D4D4D4"/>
+          <w:kern w:val="0"/>
+          <w:sz w:val="21"/>
+          <w:szCs w:val="21"/>
+          <w:lang w:val="en-US" w:eastAsia="fr-CH"/>
+          <w14:ligatures w14:val="none"/>
+        </w:rPr>
+        <w:t xml:space="preserve">    </w:t>
+      </w:r>
       <w:r>
         <w:rPr>
           <w:rFonts w:ascii="Consolas" w:eastAsia="Times New Roman" w:hAnsi="Consolas" w:cs="Times New Roman"/>
@@ -2340,72 +2524,7 @@
           <w:lang w:eastAsia="fr-CH"/>
           <w14:ligatures w14:val="none"/>
         </w:rPr>
-        <w:t>public</w:t>
-      </w:r>
-      <w:proofErr w:type="gramEnd"/>
-      <w:r>
-        <w:rPr>
-          <w:rFonts w:ascii="Consolas" w:eastAsia="Times New Roman" w:hAnsi="Consolas" w:cs="Times New Roman"/>
-          <w:color w:val="D4D4D4"/>
-          <w:kern w:val="0"/>
-          <w:sz w:val="21"/>
-          <w:szCs w:val="21"/>
-          <w:lang w:eastAsia="fr-CH"/>
-          <w14:ligatures w14:val="none"/>
-        </w:rPr>
-        <w:t xml:space="preserve"> </w:t>
-      </w:r>
-      <w:proofErr w:type="spellStart"/>
-      <w:r>
-        <w:rPr>
-          <w:rFonts w:ascii="Consolas" w:eastAsia="Times New Roman" w:hAnsi="Consolas" w:cs="Times New Roman"/>
-          <w:color w:val="D4D4D4"/>
-          <w:kern w:val="0"/>
-          <w:sz w:val="21"/>
-          <w:szCs w:val="21"/>
-          <w:lang w:eastAsia="fr-CH"/>
-          <w14:ligatures w14:val="none"/>
-        </w:rPr>
-        <w:t>void</w:t>
-      </w:r>
-      <w:proofErr w:type="spellEnd"/>
-      <w:r>
-        <w:rPr>
-          <w:rFonts w:ascii="Consolas" w:eastAsia="Times New Roman" w:hAnsi="Consolas" w:cs="Times New Roman"/>
-          <w:color w:val="D4D4D4"/>
-          <w:kern w:val="0"/>
-          <w:sz w:val="21"/>
-          <w:szCs w:val="21"/>
-          <w:lang w:eastAsia="fr-CH"/>
-          <w14:ligatures w14:val="none"/>
-        </w:rPr>
-        <w:t xml:space="preserve"> MathHelpers_IsTouching_2Rectangles_</w:t>
-      </w:r>
-      <w:proofErr w:type="gramStart"/>
-      <w:r>
-        <w:rPr>
-          <w:rFonts w:ascii="Consolas" w:eastAsia="Times New Roman" w:hAnsi="Consolas" w:cs="Times New Roman"/>
-          <w:color w:val="D4D4D4"/>
-          <w:kern w:val="0"/>
-          <w:sz w:val="21"/>
-          <w:szCs w:val="21"/>
-          <w:lang w:eastAsia="fr-CH"/>
-          <w14:ligatures w14:val="none"/>
-        </w:rPr>
-        <w:t>True(</w:t>
-      </w:r>
-      <w:proofErr w:type="gramEnd"/>
-      <w:r>
-        <w:rPr>
-          <w:rFonts w:ascii="Consolas" w:eastAsia="Times New Roman" w:hAnsi="Consolas" w:cs="Times New Roman"/>
-          <w:color w:val="D4D4D4"/>
-          <w:kern w:val="0"/>
-          <w:sz w:val="21"/>
-          <w:szCs w:val="21"/>
-          <w:lang w:eastAsia="fr-CH"/>
-          <w14:ligatures w14:val="none"/>
-        </w:rPr>
-        <w:t>)</w:t>
+        <w:t>// Assert</w:t>
       </w:r>
     </w:p>
     <w:p>
@@ -2432,7 +2551,7 @@
           <w:lang w:eastAsia="fr-CH"/>
           <w14:ligatures w14:val="none"/>
         </w:rPr>
-        <w:t>{</w:t>
+        <w:t xml:space="preserve">    Assert.IsTrue(result);</w:t>
       </w:r>
     </w:p>
     <w:p>
@@ -2459,435 +2578,6 @@
           <w:lang w:eastAsia="fr-CH"/>
           <w14:ligatures w14:val="none"/>
         </w:rPr>
-        <w:t xml:space="preserve">    // Arrange</w:t>
-      </w:r>
-    </w:p>
-    <w:p>
-      <w:pPr>
-        <w:shd w:val="clear" w:color="auto" w:fill="1E1E1E"/>
-        <w:spacing w:after="0" w:line="285" w:lineRule="atLeast"/>
-        <w:rPr>
-          <w:rFonts w:ascii="Consolas" w:eastAsia="Times New Roman" w:hAnsi="Consolas" w:cs="Times New Roman"/>
-          <w:color w:val="D4D4D4"/>
-          <w:kern w:val="0"/>
-          <w:sz w:val="21"/>
-          <w:szCs w:val="21"/>
-          <w:lang w:val="de-CH" w:eastAsia="fr-CH"/>
-          <w14:ligatures w14:val="none"/>
-        </w:rPr>
-      </w:pPr>
-      <w:r>
-        <w:rPr>
-          <w:rFonts w:ascii="Consolas" w:eastAsia="Times New Roman" w:hAnsi="Consolas" w:cs="Times New Roman"/>
-          <w:color w:val="D4D4D4"/>
-          <w:kern w:val="0"/>
-          <w:sz w:val="21"/>
-          <w:szCs w:val="21"/>
-          <w:lang w:eastAsia="fr-CH"/>
-          <w14:ligatures w14:val="none"/>
-        </w:rPr>
-        <w:t xml:space="preserve">    </w:t>
-      </w:r>
-      <w:proofErr w:type="spellStart"/>
-      <w:r>
-        <w:rPr>
-          <w:rFonts w:ascii="Consolas" w:eastAsia="Times New Roman" w:hAnsi="Consolas" w:cs="Times New Roman"/>
-          <w:color w:val="D4D4D4"/>
-          <w:kern w:val="0"/>
-          <w:sz w:val="21"/>
-          <w:szCs w:val="21"/>
-          <w:lang w:val="de-CH" w:eastAsia="fr-CH"/>
-          <w14:ligatures w14:val="none"/>
-        </w:rPr>
-        <w:t>int</w:t>
-      </w:r>
-      <w:proofErr w:type="spellEnd"/>
-      <w:r>
-        <w:rPr>
-          <w:rFonts w:ascii="Consolas" w:eastAsia="Times New Roman" w:hAnsi="Consolas" w:cs="Times New Roman"/>
-          <w:color w:val="D4D4D4"/>
-          <w:kern w:val="0"/>
-          <w:sz w:val="21"/>
-          <w:szCs w:val="21"/>
-          <w:lang w:val="de-CH" w:eastAsia="fr-CH"/>
-          <w14:ligatures w14:val="none"/>
-        </w:rPr>
-        <w:t xml:space="preserve"> x1 = 0, y1 = 0, width1 = 10, height1 = 10;</w:t>
-      </w:r>
-    </w:p>
-    <w:p>
-      <w:pPr>
-        <w:shd w:val="clear" w:color="auto" w:fill="1E1E1E"/>
-        <w:spacing w:after="0" w:line="285" w:lineRule="atLeast"/>
-        <w:rPr>
-          <w:rFonts w:ascii="Consolas" w:eastAsia="Times New Roman" w:hAnsi="Consolas" w:cs="Times New Roman"/>
-          <w:color w:val="D4D4D4"/>
-          <w:kern w:val="0"/>
-          <w:sz w:val="21"/>
-          <w:szCs w:val="21"/>
-          <w:lang w:val="de-CH" w:eastAsia="fr-CH"/>
-          <w14:ligatures w14:val="none"/>
-        </w:rPr>
-      </w:pPr>
-      <w:r>
-        <w:rPr>
-          <w:rFonts w:ascii="Consolas" w:eastAsia="Times New Roman" w:hAnsi="Consolas" w:cs="Times New Roman"/>
-          <w:color w:val="D4D4D4"/>
-          <w:kern w:val="0"/>
-          <w:sz w:val="21"/>
-          <w:szCs w:val="21"/>
-          <w:lang w:val="de-CH" w:eastAsia="fr-CH"/>
-          <w14:ligatures w14:val="none"/>
-        </w:rPr>
-        <w:t xml:space="preserve">    </w:t>
-      </w:r>
-      <w:proofErr w:type="spellStart"/>
-      <w:r>
-        <w:rPr>
-          <w:rFonts w:ascii="Consolas" w:eastAsia="Times New Roman" w:hAnsi="Consolas" w:cs="Times New Roman"/>
-          <w:color w:val="D4D4D4"/>
-          <w:kern w:val="0"/>
-          <w:sz w:val="21"/>
-          <w:szCs w:val="21"/>
-          <w:lang w:val="de-CH" w:eastAsia="fr-CH"/>
-          <w14:ligatures w14:val="none"/>
-        </w:rPr>
-        <w:t>int</w:t>
-      </w:r>
-      <w:proofErr w:type="spellEnd"/>
-      <w:r>
-        <w:rPr>
-          <w:rFonts w:ascii="Consolas" w:eastAsia="Times New Roman" w:hAnsi="Consolas" w:cs="Times New Roman"/>
-          <w:color w:val="D4D4D4"/>
-          <w:kern w:val="0"/>
-          <w:sz w:val="21"/>
-          <w:szCs w:val="21"/>
-          <w:lang w:val="de-CH" w:eastAsia="fr-CH"/>
-          <w14:ligatures w14:val="none"/>
-        </w:rPr>
-        <w:t xml:space="preserve"> x2 = 5, y2 = 5, width2 = 10, height2 = 10;</w:t>
-      </w:r>
-    </w:p>
-    <w:p>
-      <w:pPr>
-        <w:shd w:val="clear" w:color="auto" w:fill="1E1E1E"/>
-        <w:spacing w:after="0" w:line="285" w:lineRule="atLeast"/>
-        <w:rPr>
-          <w:rFonts w:ascii="Consolas" w:eastAsia="Times New Roman" w:hAnsi="Consolas" w:cs="Times New Roman"/>
-          <w:color w:val="D4D4D4"/>
-          <w:kern w:val="0"/>
-          <w:sz w:val="21"/>
-          <w:szCs w:val="21"/>
-          <w:lang w:val="de-CH" w:eastAsia="fr-CH"/>
-          <w14:ligatures w14:val="none"/>
-        </w:rPr>
-      </w:pPr>
-    </w:p>
-    <w:p>
-      <w:pPr>
-        <w:shd w:val="clear" w:color="auto" w:fill="1E1E1E"/>
-        <w:spacing w:after="0" w:line="285" w:lineRule="atLeast"/>
-        <w:rPr>
-          <w:rFonts w:ascii="Consolas" w:eastAsia="Times New Roman" w:hAnsi="Consolas" w:cs="Times New Roman"/>
-          <w:color w:val="D4D4D4"/>
-          <w:kern w:val="0"/>
-          <w:sz w:val="21"/>
-          <w:szCs w:val="21"/>
-          <w:lang w:val="de-CH" w:eastAsia="fr-CH"/>
-          <w14:ligatures w14:val="none"/>
-        </w:rPr>
-      </w:pPr>
-      <w:r>
-        <w:rPr>
-          <w:rFonts w:ascii="Consolas" w:eastAsia="Times New Roman" w:hAnsi="Consolas" w:cs="Times New Roman"/>
-          <w:color w:val="D4D4D4"/>
-          <w:kern w:val="0"/>
-          <w:sz w:val="21"/>
-          <w:szCs w:val="21"/>
-          <w:lang w:val="de-CH" w:eastAsia="fr-CH"/>
-          <w14:ligatures w14:val="none"/>
-        </w:rPr>
-        <w:t xml:space="preserve">    // Act</w:t>
-      </w:r>
-    </w:p>
-    <w:p>
-      <w:pPr>
-        <w:shd w:val="clear" w:color="auto" w:fill="1E1E1E"/>
-        <w:spacing w:after="0" w:line="285" w:lineRule="atLeast"/>
-        <w:rPr>
-          <w:rFonts w:ascii="Consolas" w:eastAsia="Times New Roman" w:hAnsi="Consolas" w:cs="Times New Roman"/>
-          <w:color w:val="D4D4D4"/>
-          <w:kern w:val="0"/>
-          <w:sz w:val="21"/>
-          <w:szCs w:val="21"/>
-          <w:lang w:val="de-CH" w:eastAsia="fr-CH"/>
-          <w14:ligatures w14:val="none"/>
-        </w:rPr>
-      </w:pPr>
-      <w:r>
-        <w:rPr>
-          <w:rFonts w:ascii="Consolas" w:eastAsia="Times New Roman" w:hAnsi="Consolas" w:cs="Times New Roman"/>
-          <w:color w:val="D4D4D4"/>
-          <w:kern w:val="0"/>
-          <w:sz w:val="21"/>
-          <w:szCs w:val="21"/>
-          <w:lang w:val="de-CH" w:eastAsia="fr-CH"/>
-          <w14:ligatures w14:val="none"/>
-        </w:rPr>
-        <w:t xml:space="preserve">    </w:t>
-      </w:r>
-      <w:proofErr w:type="spellStart"/>
-      <w:r>
-        <w:rPr>
-          <w:rFonts w:ascii="Consolas" w:eastAsia="Times New Roman" w:hAnsi="Consolas" w:cs="Times New Roman"/>
-          <w:color w:val="D4D4D4"/>
-          <w:kern w:val="0"/>
-          <w:sz w:val="21"/>
-          <w:szCs w:val="21"/>
-          <w:lang w:val="de-CH" w:eastAsia="fr-CH"/>
-          <w14:ligatures w14:val="none"/>
-        </w:rPr>
-        <w:t>bool</w:t>
-      </w:r>
-      <w:proofErr w:type="spellEnd"/>
-      <w:r>
-        <w:rPr>
-          <w:rFonts w:ascii="Consolas" w:eastAsia="Times New Roman" w:hAnsi="Consolas" w:cs="Times New Roman"/>
-          <w:color w:val="D4D4D4"/>
-          <w:kern w:val="0"/>
-          <w:sz w:val="21"/>
-          <w:szCs w:val="21"/>
-          <w:lang w:val="de-CH" w:eastAsia="fr-CH"/>
-          <w14:ligatures w14:val="none"/>
-        </w:rPr>
-        <w:t xml:space="preserve"> </w:t>
-      </w:r>
-      <w:proofErr w:type="spellStart"/>
-      <w:r>
-        <w:rPr>
-          <w:rFonts w:ascii="Consolas" w:eastAsia="Times New Roman" w:hAnsi="Consolas" w:cs="Times New Roman"/>
-          <w:color w:val="D4D4D4"/>
-          <w:kern w:val="0"/>
-          <w:sz w:val="21"/>
-          <w:szCs w:val="21"/>
-          <w:lang w:val="de-CH" w:eastAsia="fr-CH"/>
-          <w14:ligatures w14:val="none"/>
-        </w:rPr>
-        <w:t>result</w:t>
-      </w:r>
-      <w:proofErr w:type="spellEnd"/>
-      <w:r>
-        <w:rPr>
-          <w:rFonts w:ascii="Consolas" w:eastAsia="Times New Roman" w:hAnsi="Consolas" w:cs="Times New Roman"/>
-          <w:color w:val="D4D4D4"/>
-          <w:kern w:val="0"/>
-          <w:sz w:val="21"/>
-          <w:szCs w:val="21"/>
-          <w:lang w:val="de-CH" w:eastAsia="fr-CH"/>
-          <w14:ligatures w14:val="none"/>
-        </w:rPr>
-        <w:t xml:space="preserve"> = </w:t>
-      </w:r>
-      <w:proofErr w:type="spellStart"/>
-      <w:r>
-        <w:rPr>
-          <w:rFonts w:ascii="Consolas" w:eastAsia="Times New Roman" w:hAnsi="Consolas" w:cs="Times New Roman"/>
-          <w:color w:val="D4D4D4"/>
-          <w:kern w:val="0"/>
-          <w:sz w:val="21"/>
-          <w:szCs w:val="21"/>
-          <w:lang w:val="de-CH" w:eastAsia="fr-CH"/>
-          <w14:ligatures w14:val="none"/>
-        </w:rPr>
-        <w:t>MathHelpers.IsTouching</w:t>
-      </w:r>
-      <w:proofErr w:type="spellEnd"/>
-      <w:r>
-        <w:rPr>
-          <w:rFonts w:ascii="Consolas" w:eastAsia="Times New Roman" w:hAnsi="Consolas" w:cs="Times New Roman"/>
-          <w:color w:val="D4D4D4"/>
-          <w:kern w:val="0"/>
-          <w:sz w:val="21"/>
-          <w:szCs w:val="21"/>
-          <w:lang w:val="de-CH" w:eastAsia="fr-CH"/>
-          <w14:ligatures w14:val="none"/>
-        </w:rPr>
-        <w:t>(x1, y1, width1, height1, x2, y2, width2, height2);</w:t>
-      </w:r>
-    </w:p>
-    <w:p>
-      <w:pPr>
-        <w:shd w:val="clear" w:color="auto" w:fill="1E1E1E"/>
-        <w:spacing w:after="0" w:line="285" w:lineRule="atLeast"/>
-        <w:rPr>
-          <w:rFonts w:ascii="Consolas" w:eastAsia="Times New Roman" w:hAnsi="Consolas" w:cs="Times New Roman"/>
-          <w:color w:val="D4D4D4"/>
-          <w:kern w:val="0"/>
-          <w:sz w:val="21"/>
-          <w:szCs w:val="21"/>
-          <w:lang w:val="de-CH" w:eastAsia="fr-CH"/>
-          <w14:ligatures w14:val="none"/>
-        </w:rPr>
-      </w:pPr>
-    </w:p>
-    <w:p>
-      <w:pPr>
-        <w:shd w:val="clear" w:color="auto" w:fill="1E1E1E"/>
-        <w:spacing w:after="0" w:line="285" w:lineRule="atLeast"/>
-        <w:rPr>
-          <w:rFonts w:ascii="Consolas" w:eastAsia="Times New Roman" w:hAnsi="Consolas" w:cs="Times New Roman"/>
-          <w:color w:val="D4D4D4"/>
-          <w:kern w:val="0"/>
-          <w:sz w:val="21"/>
-          <w:szCs w:val="21"/>
-          <w:lang w:eastAsia="fr-CH"/>
-          <w14:ligatures w14:val="none"/>
-        </w:rPr>
-      </w:pPr>
-      <w:r>
-        <w:rPr>
-          <w:rFonts w:ascii="Consolas" w:eastAsia="Times New Roman" w:hAnsi="Consolas" w:cs="Times New Roman"/>
-          <w:color w:val="D4D4D4"/>
-          <w:kern w:val="0"/>
-          <w:sz w:val="21"/>
-          <w:szCs w:val="21"/>
-          <w:lang w:val="de-CH" w:eastAsia="fr-CH"/>
-          <w14:ligatures w14:val="none"/>
-        </w:rPr>
-        <w:t xml:space="preserve">    </w:t>
-      </w:r>
-      <w:r>
-        <w:rPr>
-          <w:rFonts w:ascii="Consolas" w:eastAsia="Times New Roman" w:hAnsi="Consolas" w:cs="Times New Roman"/>
-          <w:color w:val="D4D4D4"/>
-          <w:kern w:val="0"/>
-          <w:sz w:val="21"/>
-          <w:szCs w:val="21"/>
-          <w:lang w:eastAsia="fr-CH"/>
-          <w14:ligatures w14:val="none"/>
-        </w:rPr>
-        <w:t xml:space="preserve">// </w:t>
-      </w:r>
-      <w:proofErr w:type="spellStart"/>
-      <w:r>
-        <w:rPr>
-          <w:rFonts w:ascii="Consolas" w:eastAsia="Times New Roman" w:hAnsi="Consolas" w:cs="Times New Roman"/>
-          <w:color w:val="D4D4D4"/>
-          <w:kern w:val="0"/>
-          <w:sz w:val="21"/>
-          <w:szCs w:val="21"/>
-          <w:lang w:eastAsia="fr-CH"/>
-          <w14:ligatures w14:val="none"/>
-        </w:rPr>
-        <w:t>Assert</w:t>
-      </w:r>
-      <w:proofErr w:type="spellEnd"/>
-    </w:p>
-    <w:p>
-      <w:pPr>
-        <w:shd w:val="clear" w:color="auto" w:fill="1E1E1E"/>
-        <w:spacing w:after="0" w:line="285" w:lineRule="atLeast"/>
-        <w:rPr>
-          <w:rFonts w:ascii="Consolas" w:eastAsia="Times New Roman" w:hAnsi="Consolas" w:cs="Times New Roman"/>
-          <w:color w:val="D4D4D4"/>
-          <w:kern w:val="0"/>
-          <w:sz w:val="21"/>
-          <w:szCs w:val="21"/>
-          <w:lang w:eastAsia="fr-CH"/>
-          <w14:ligatures w14:val="none"/>
-        </w:rPr>
-      </w:pPr>
-      <w:r>
-        <w:rPr>
-          <w:rFonts w:ascii="Consolas" w:eastAsia="Times New Roman" w:hAnsi="Consolas" w:cs="Times New Roman"/>
-          <w:color w:val="D4D4D4"/>
-          <w:kern w:val="0"/>
-          <w:sz w:val="21"/>
-          <w:szCs w:val="21"/>
-          <w:lang w:eastAsia="fr-CH"/>
-          <w14:ligatures w14:val="none"/>
-        </w:rPr>
-        <w:t xml:space="preserve">    </w:t>
-      </w:r>
-      <w:proofErr w:type="spellStart"/>
-      <w:r>
-        <w:rPr>
-          <w:rFonts w:ascii="Consolas" w:eastAsia="Times New Roman" w:hAnsi="Consolas" w:cs="Times New Roman"/>
-          <w:color w:val="D4D4D4"/>
-          <w:kern w:val="0"/>
-          <w:sz w:val="21"/>
-          <w:szCs w:val="21"/>
-          <w:lang w:eastAsia="fr-CH"/>
-          <w14:ligatures w14:val="none"/>
-        </w:rPr>
-        <w:t>Assert.IsTrue</w:t>
-      </w:r>
-      <w:proofErr w:type="spellEnd"/>
-      <w:r>
-        <w:rPr>
-          <w:rFonts w:ascii="Consolas" w:eastAsia="Times New Roman" w:hAnsi="Consolas" w:cs="Times New Roman"/>
-          <w:color w:val="D4D4D4"/>
-          <w:kern w:val="0"/>
-          <w:sz w:val="21"/>
-          <w:szCs w:val="21"/>
-          <w:lang w:eastAsia="fr-CH"/>
-          <w14:ligatures w14:val="none"/>
-        </w:rPr>
-        <w:t>(</w:t>
-      </w:r>
-      <w:proofErr w:type="spellStart"/>
-      <w:r>
-        <w:rPr>
-          <w:rFonts w:ascii="Consolas" w:eastAsia="Times New Roman" w:hAnsi="Consolas" w:cs="Times New Roman"/>
-          <w:color w:val="D4D4D4"/>
-          <w:kern w:val="0"/>
-          <w:sz w:val="21"/>
-          <w:szCs w:val="21"/>
-          <w:lang w:eastAsia="fr-CH"/>
-          <w14:ligatures w14:val="none"/>
-        </w:rPr>
-        <w:t>result</w:t>
-      </w:r>
-      <w:proofErr w:type="spellEnd"/>
-      <w:proofErr w:type="gramStart"/>
-      <w:r>
-        <w:rPr>
-          <w:rFonts w:ascii="Consolas" w:eastAsia="Times New Roman" w:hAnsi="Consolas" w:cs="Times New Roman"/>
-          <w:color w:val="D4D4D4"/>
-          <w:kern w:val="0"/>
-          <w:sz w:val="21"/>
-          <w:szCs w:val="21"/>
-          <w:lang w:eastAsia="fr-CH"/>
-          <w14:ligatures w14:val="none"/>
-        </w:rPr>
-        <w:t>);</w:t>
-      </w:r>
-      <w:proofErr w:type="gramEnd"/>
-    </w:p>
-    <w:p>
-      <w:pPr>
-        <w:shd w:val="clear" w:color="auto" w:fill="1E1E1E"/>
-        <w:spacing w:after="0" w:line="285" w:lineRule="atLeast"/>
-        <w:rPr>
-          <w:rFonts w:ascii="Consolas" w:eastAsia="Times New Roman" w:hAnsi="Consolas" w:cs="Times New Roman"/>
-          <w:color w:val="D4D4D4"/>
-          <w:kern w:val="0"/>
-          <w:sz w:val="21"/>
-          <w:szCs w:val="21"/>
-          <w:lang w:eastAsia="fr-CH"/>
-          <w14:ligatures w14:val="none"/>
-        </w:rPr>
-      </w:pPr>
-      <w:r>
-        <w:rPr>
-          <w:rFonts w:ascii="Consolas" w:eastAsia="Times New Roman" w:hAnsi="Consolas" w:cs="Times New Roman"/>
-          <w:color w:val="D4D4D4"/>
-          <w:kern w:val="0"/>
-          <w:sz w:val="21"/>
-          <w:szCs w:val="21"/>
-          <w:lang w:eastAsia="fr-CH"/>
-          <w14:ligatures w14:val="none"/>
-        </w:rPr>
         <w:t>}</w:t>
       </w:r>
     </w:p>
@@ -3069,15 +2759,7 @@
         <w:t>, pendant ce chapitre, j’ai demandé de l’aide pour imaginer quels outils je pouvais utiliser</w:t>
       </w:r>
       <w:r>
-        <w:t xml:space="preserve"> (utiliser une </w:t>
-      </w:r>
-      <w:proofErr w:type="gramStart"/>
-      <w:r>
-        <w:t>Liste,  une</w:t>
-      </w:r>
-      <w:proofErr w:type="gramEnd"/>
-      <w:r>
-        <w:t xml:space="preserve"> nouvelle classe)</w:t>
+        <w:t xml:space="preserve"> (utiliser une Liste,  une nouvelle classe)</w:t>
       </w:r>
       <w:r>
         <w:t xml:space="preserve"> mais là encore, j’ai fini par opter pour ma propre approche</w:t>
@@ -3209,7 +2891,6 @@
       <w:r>
         <w:t xml:space="preserve">J’aurais pu simplement copier les exercices du module (drones) et utiliser </w:t>
       </w:r>
-      <w:proofErr w:type="spellStart"/>
       <w:r>
         <w:rPr>
           <w:b/>
@@ -3217,7 +2898,6 @@
         </w:rPr>
         <w:t>roaming</w:t>
       </w:r>
-      <w:proofErr w:type="spellEnd"/>
       <w:r>
         <w:t xml:space="preserve"> </w:t>
       </w:r>
@@ -3255,10 +2935,32 @@
       </w:pPr>
       <w:bookmarkStart w:id="8" w:name="_Toc242631070"/>
       <w:r>
-        <w:lastRenderedPageBreak/>
         <w:t>BILAN PRODUIT</w:t>
       </w:r>
       <w:bookmarkEnd w:id="8"/>
+    </w:p>
+    <w:p>
+      <w:pPr>
+        <w:pStyle w:val="Titre2"/>
+        <w:rPr>
+          <w:noProof/>
+        </w:rPr>
+      </w:pPr>
+      <w:r>
+        <w:t>Bilan</w:t>
+      </w:r>
+      <w:r>
+        <w:t xml:space="preserve"> </w:t>
+      </w:r>
+      <w:r>
+        <w:t>80% :</w:t>
+      </w:r>
+      <w:r>
+        <w:rPr>
+          <w:noProof/>
+        </w:rPr>
+        <w:t xml:space="preserve"> </w:t>
+      </w:r>
     </w:p>
     <w:p>
       <w:r>
@@ -3266,17 +2968,9 @@
           <w:noProof/>
         </w:rPr>
         <w:drawing>
-          <wp:anchor distT="0" distB="0" distL="114300" distR="114300" simplePos="0" relativeHeight="251659264" behindDoc="0" locked="0" layoutInCell="1" allowOverlap="1" wp14:anchorId="3E1FF0D3" wp14:editId="0EDA9F20">
-            <wp:simplePos x="0" y="0"/>
-            <wp:positionH relativeFrom="page">
-              <wp:posOffset>217714</wp:posOffset>
-            </wp:positionH>
-            <wp:positionV relativeFrom="paragraph">
-              <wp:posOffset>245291</wp:posOffset>
-            </wp:positionV>
-            <wp:extent cx="7051981" cy="2932884"/>
-            <wp:effectExtent l="0" t="0" r="0" b="1270"/>
-            <wp:wrapTopAndBottom/>
+          <wp:inline distT="0" distB="0" distL="0" distR="0" wp14:anchorId="3A1AE593" wp14:editId="60168D72">
+            <wp:extent cx="5760720" cy="2395220"/>
+            <wp:effectExtent l="0" t="0" r="0" b="5080"/>
             <wp:docPr id="440935663" name="Image 1"/>
             <wp:cNvGraphicFramePr>
               <a:graphicFrameLocks xmlns:a="http://schemas.openxmlformats.org/drawingml/2006/main" noChangeAspect="1"/>
@@ -3289,7 +2983,7 @@
                     <pic:cNvPicPr/>
                   </pic:nvPicPr>
                   <pic:blipFill>
-                    <a:blip r:embed="rId11">
+                    <a:blip r:embed="rId11" cstate="print">
                       <a:extLst>
                         <a:ext uri="{28A0092B-C50C-407E-A947-70E740481C1C}">
                           <a14:useLocalDpi xmlns:a14="http://schemas.microsoft.com/office/drawing/2010/main" val="0"/>
@@ -3303,7 +2997,7 @@
                   <pic:spPr>
                     <a:xfrm>
                       <a:off x="0" y="0"/>
-                      <a:ext cx="7051981" cy="2932884"/>
+                      <a:ext cx="5760720" cy="2395220"/>
                     </a:xfrm>
                     <a:prstGeom prst="rect">
                       <a:avLst/>
@@ -3312,23 +3006,8 @@
                 </pic:pic>
               </a:graphicData>
             </a:graphic>
-            <wp14:sizeRelH relativeFrom="margin">
-              <wp14:pctWidth>0</wp14:pctWidth>
-            </wp14:sizeRelH>
-            <wp14:sizeRelV relativeFrom="margin">
-              <wp14:pctHeight>0</wp14:pctHeight>
-            </wp14:sizeRelV>
-          </wp:anchor>
+          </wp:inline>
         </w:drawing>
-      </w:r>
-      <w:r>
-        <w:t>Bilan</w:t>
-      </w:r>
-      <w:r>
-        <w:t xml:space="preserve"> </w:t>
-      </w:r>
-      <w:r>
-        <w:t>80% :</w:t>
       </w:r>
     </w:p>
     <w:p>
@@ -3359,36 +3038,18 @@
           <w:b/>
           <w:bCs/>
         </w:rPr>
-        <w:t xml:space="preserve">In </w:t>
-      </w:r>
-      <w:proofErr w:type="spellStart"/>
+        <w:t>In progress</w:t>
+      </w:r>
+      <w:r>
+        <w:t xml:space="preserve"> et </w:t>
+      </w:r>
       <w:r>
         <w:rPr>
           <w:b/>
           <w:bCs/>
         </w:rPr>
-        <w:t>progress</w:t>
-      </w:r>
-      <w:proofErr w:type="spellEnd"/>
-      <w:r>
-        <w:t xml:space="preserve"> et </w:t>
-      </w:r>
-      <w:r>
-        <w:rPr>
-          <w:b/>
-          <w:bCs/>
-        </w:rPr>
-        <w:t xml:space="preserve">In </w:t>
-      </w:r>
-      <w:proofErr w:type="spellStart"/>
-      <w:r>
-        <w:rPr>
-          <w:b/>
-          <w:bCs/>
-        </w:rPr>
-        <w:t>review</w:t>
-      </w:r>
-      <w:proofErr w:type="spellEnd"/>
+        <w:t>In review</w:t>
+      </w:r>
       <w:r>
         <w:t>.</w:t>
       </w:r>
@@ -3396,6 +3057,16 @@
     <w:p>
       <w:r>
         <w:t>Il faut également que je trouve un moyen de changer le nom de ma solution et enlever les traces de drones venant de la base de code.</w:t>
+      </w:r>
+    </w:p>
+    <w:p>
+      <w:pPr>
+        <w:pStyle w:val="Titre2"/>
+      </w:pPr>
+      <w:bookmarkStart w:id="9" w:name="_Toc242631071"/>
+      <w:r>
+        <w:lastRenderedPageBreak/>
+        <w:t>Bilan final</w:t>
       </w:r>
     </w:p>
     <w:p>
@@ -3406,7 +3077,6 @@
           <w:numId w:val="9"/>
         </w:numPr>
       </w:pPr>
-      <w:bookmarkStart w:id="9" w:name="_Toc242631071"/>
       <w:r>
         <w:t>CONCLUSION</w:t>
       </w:r>
@@ -6022,12 +5692,11 @@
 </file>
 
 <file path=customXml/item1.xml><?xml version="1.0" encoding="utf-8"?>
-<?mso-contentType ?>
-<FormTemplates xmlns="http://schemas.microsoft.com/sharepoint/v3/contenttype/forms">
-  <Display>DocumentLibraryForm</Display>
-  <Edit>DocumentLibraryForm</Edit>
-  <New>DocumentLibraryForm</New>
-</FormTemplates>
+<p:properties xmlns:p="http://schemas.microsoft.com/office/2006/metadata/properties" xmlns:xsi="http://www.w3.org/2001/XMLSchema-instance" xmlns:pc="http://schemas.microsoft.com/office/infopath/2007/PartnerControls">
+  <documentManagement>
+    <_activity xmlns="0dcbab57-ce0d-48ec-9006-afbf43b82b42" xsi:nil="true"/>
+  </documentManagement>
+</p:properties>
 </file>
 
 <file path=customXml/item2.xml><?xml version="1.0" encoding="utf-8"?>
@@ -6213,17 +5882,20 @@
 </file>
 
 <file path=customXml/item3.xml><?xml version="1.0" encoding="utf-8"?>
-<p:properties xmlns:p="http://schemas.microsoft.com/office/2006/metadata/properties" xmlns:xsi="http://www.w3.org/2001/XMLSchema-instance" xmlns:pc="http://schemas.microsoft.com/office/infopath/2007/PartnerControls">
-  <documentManagement>
-    <_activity xmlns="0dcbab57-ce0d-48ec-9006-afbf43b82b42" xsi:nil="true"/>
-  </documentManagement>
-</p:properties>
+<?mso-contentType ?>
+<FormTemplates xmlns="http://schemas.microsoft.com/sharepoint/v3/contenttype/forms">
+  <Display>DocumentLibraryForm</Display>
+  <Edit>DocumentLibraryForm</Edit>
+  <New>DocumentLibraryForm</New>
+</FormTemplates>
 </file>
 
 <file path=customXml/itemProps1.xml><?xml version="1.0" encoding="utf-8"?>
-<ds:datastoreItem xmlns:ds="http://schemas.openxmlformats.org/officeDocument/2006/customXml" ds:itemID="{ACF3336E-B009-4268-AFDE-A53C75438088}">
+<ds:datastoreItem xmlns:ds="http://schemas.openxmlformats.org/officeDocument/2006/customXml" ds:itemID="{7D23386E-842B-4B42-9D04-7B63869B43F9}">
   <ds:schemaRefs>
-    <ds:schemaRef ds:uri="http://schemas.microsoft.com/sharepoint/v3/contenttype/forms"/>
+    <ds:schemaRef ds:uri="http://schemas.microsoft.com/office/2006/metadata/properties"/>
+    <ds:schemaRef ds:uri="http://schemas.microsoft.com/office/infopath/2007/PartnerControls"/>
+    <ds:schemaRef ds:uri="0dcbab57-ce0d-48ec-9006-afbf43b82b42"/>
   </ds:schemaRefs>
 </ds:datastoreItem>
 </file>
@@ -6247,11 +5919,9 @@
 </file>
 
 <file path=customXml/itemProps3.xml><?xml version="1.0" encoding="utf-8"?>
-<ds:datastoreItem xmlns:ds="http://schemas.openxmlformats.org/officeDocument/2006/customXml" ds:itemID="{7D23386E-842B-4B42-9D04-7B63869B43F9}">
+<ds:datastoreItem xmlns:ds="http://schemas.openxmlformats.org/officeDocument/2006/customXml" ds:itemID="{ACF3336E-B009-4268-AFDE-A53C75438088}">
   <ds:schemaRefs>
-    <ds:schemaRef ds:uri="http://schemas.microsoft.com/office/2006/metadata/properties"/>
-    <ds:schemaRef ds:uri="http://schemas.microsoft.com/office/infopath/2007/PartnerControls"/>
-    <ds:schemaRef ds:uri="0dcbab57-ce0d-48ec-9006-afbf43b82b42"/>
+    <ds:schemaRef ds:uri="http://schemas.microsoft.com/sharepoint/v3/contenttype/forms"/>
   </ds:schemaRefs>
 </ds:datastoreItem>
 </file>
</xml_diff>

<commit_message>
doc(rapport) : un peu avancé dans utilisation IA
</commit_message>
<xml_diff>
--- a/doc/H-P_ShootMeUp-pe84djb-Rapport.docx
+++ b/doc/H-P_ShootMeUp-pe84djb-Rapport.docx
@@ -113,6 +113,7 @@
         </w:rPr>
         <w:t xml:space="preserve">Rapport </w:t>
       </w:r>
+      <w:proofErr w:type="spellStart"/>
       <w:r>
         <w:rPr>
           <w:b/>
@@ -125,6 +126,7 @@
         </w:rPr>
         <w:t>ShootMeUp</w:t>
       </w:r>
+      <w:proofErr w:type="spellEnd"/>
     </w:p>
     <w:p>
       <w:pPr>
@@ -1553,7 +1555,15 @@
         <w:t>Ces documents vont nous servir à nous organiser, séparer le travail en plusieurs parties (user stories)</w:t>
       </w:r>
       <w:r>
-        <w:t>, créer des commits atomiques clairs respectant des conventions,</w:t>
+        <w:t xml:space="preserve">, créer des </w:t>
+      </w:r>
+      <w:proofErr w:type="spellStart"/>
+      <w:r>
+        <w:t>commits</w:t>
+      </w:r>
+      <w:proofErr w:type="spellEnd"/>
+      <w:r>
+        <w:t xml:space="preserve"> atomiques clairs respectant des conventions,</w:t>
       </w:r>
       <w:r>
         <w:t xml:space="preserve"> ainsi que des points antérieurs tels qu’un rapport de test etc…</w:t>
@@ -1593,7 +1603,15 @@
         <w:t>,</w:t>
       </w:r>
       <w:r>
-        <w:t xml:space="preserve"> mais la rédaction de rapports, jdt et autres points mentionnés nous apprends à être organisés et </w:t>
+        <w:t xml:space="preserve"> mais la rédaction de rapports, </w:t>
+      </w:r>
+      <w:proofErr w:type="spellStart"/>
+      <w:r>
+        <w:t>jdt</w:t>
+      </w:r>
+      <w:proofErr w:type="spellEnd"/>
+      <w:r>
+        <w:t xml:space="preserve"> et autres points mentionnés nous apprends à être organisés et </w:t>
       </w:r>
       <w:r>
         <w:t>professionnels.</w:t>
@@ -2177,6 +2195,7 @@
       <w:r>
         <w:t xml:space="preserve">J’ai ajouté un projet </w:t>
       </w:r>
+      <w:proofErr w:type="spellStart"/>
       <w:r>
         <w:rPr>
           <w:b/>
@@ -2184,6 +2203,7 @@
         </w:rPr>
         <w:t>MSTest</w:t>
       </w:r>
+      <w:proofErr w:type="spellEnd"/>
       <w:r>
         <w:t xml:space="preserve"> dans la solution et chaque test a une méthode dans ce projet (un seul fichier).</w:t>
       </w:r>
@@ -2241,6 +2261,330 @@
       <w:r>
         <w:t>Exemple :</w:t>
       </w:r>
+    </w:p>
+    <w:p>
+      <w:pPr>
+        <w:shd w:val="clear" w:color="auto" w:fill="1E1E1E"/>
+        <w:spacing w:after="0" w:line="285" w:lineRule="atLeast"/>
+        <w:rPr>
+          <w:rFonts w:ascii="Consolas" w:eastAsia="Times New Roman" w:hAnsi="Consolas" w:cs="Times New Roman"/>
+          <w:color w:val="D4D4D4"/>
+          <w:kern w:val="0"/>
+          <w:sz w:val="21"/>
+          <w:szCs w:val="21"/>
+          <w:lang w:val="en-US" w:eastAsia="fr-CH"/>
+          <w14:ligatures w14:val="none"/>
+        </w:rPr>
+      </w:pPr>
+      <w:r>
+        <w:rPr>
+          <w:rFonts w:ascii="Consolas" w:eastAsia="Times New Roman" w:hAnsi="Consolas" w:cs="Times New Roman"/>
+          <w:color w:val="D4D4D4"/>
+          <w:kern w:val="0"/>
+          <w:sz w:val="21"/>
+          <w:szCs w:val="21"/>
+          <w:lang w:val="en-US" w:eastAsia="fr-CH"/>
+          <w14:ligatures w14:val="none"/>
+        </w:rPr>
+        <w:t>[</w:t>
+      </w:r>
+      <w:proofErr w:type="spellStart"/>
+      <w:r>
+        <w:rPr>
+          <w:rFonts w:ascii="Consolas" w:eastAsia="Times New Roman" w:hAnsi="Consolas" w:cs="Times New Roman"/>
+          <w:color w:val="D4D4D4"/>
+          <w:kern w:val="0"/>
+          <w:sz w:val="21"/>
+          <w:szCs w:val="21"/>
+          <w:lang w:val="en-US" w:eastAsia="fr-CH"/>
+          <w14:ligatures w14:val="none"/>
+        </w:rPr>
+        <w:t>TestMethod</w:t>
+      </w:r>
+      <w:proofErr w:type="spellEnd"/>
+      <w:r>
+        <w:rPr>
+          <w:rFonts w:ascii="Consolas" w:eastAsia="Times New Roman" w:hAnsi="Consolas" w:cs="Times New Roman"/>
+          <w:color w:val="D4D4D4"/>
+          <w:kern w:val="0"/>
+          <w:sz w:val="21"/>
+          <w:szCs w:val="21"/>
+          <w:lang w:val="en-US" w:eastAsia="fr-CH"/>
+          <w14:ligatures w14:val="none"/>
+        </w:rPr>
+        <w:t>]</w:t>
+      </w:r>
+    </w:p>
+    <w:p>
+      <w:pPr>
+        <w:shd w:val="clear" w:color="auto" w:fill="1E1E1E"/>
+        <w:spacing w:after="0" w:line="285" w:lineRule="atLeast"/>
+        <w:rPr>
+          <w:rFonts w:ascii="Consolas" w:eastAsia="Times New Roman" w:hAnsi="Consolas" w:cs="Times New Roman"/>
+          <w:color w:val="D4D4D4"/>
+          <w:kern w:val="0"/>
+          <w:sz w:val="21"/>
+          <w:szCs w:val="21"/>
+          <w:lang w:val="en-US" w:eastAsia="fr-CH"/>
+          <w14:ligatures w14:val="none"/>
+        </w:rPr>
+      </w:pPr>
+      <w:r>
+        <w:rPr>
+          <w:rFonts w:ascii="Consolas" w:eastAsia="Times New Roman" w:hAnsi="Consolas" w:cs="Times New Roman"/>
+          <w:color w:val="D4D4D4"/>
+          <w:kern w:val="0"/>
+          <w:sz w:val="21"/>
+          <w:szCs w:val="21"/>
+          <w:lang w:val="en-US" w:eastAsia="fr-CH"/>
+          <w14:ligatures w14:val="none"/>
+        </w:rPr>
+        <w:t>public void MathHelpers_IsTouching_2Rectangles_</w:t>
+      </w:r>
+      <w:proofErr w:type="gramStart"/>
+      <w:r>
+        <w:rPr>
+          <w:rFonts w:ascii="Consolas" w:eastAsia="Times New Roman" w:hAnsi="Consolas" w:cs="Times New Roman"/>
+          <w:color w:val="D4D4D4"/>
+          <w:kern w:val="0"/>
+          <w:sz w:val="21"/>
+          <w:szCs w:val="21"/>
+          <w:lang w:val="en-US" w:eastAsia="fr-CH"/>
+          <w14:ligatures w14:val="none"/>
+        </w:rPr>
+        <w:t>True(</w:t>
+      </w:r>
+      <w:proofErr w:type="gramEnd"/>
+      <w:r>
+        <w:rPr>
+          <w:rFonts w:ascii="Consolas" w:eastAsia="Times New Roman" w:hAnsi="Consolas" w:cs="Times New Roman"/>
+          <w:color w:val="D4D4D4"/>
+          <w:kern w:val="0"/>
+          <w:sz w:val="21"/>
+          <w:szCs w:val="21"/>
+          <w:lang w:val="en-US" w:eastAsia="fr-CH"/>
+          <w14:ligatures w14:val="none"/>
+        </w:rPr>
+        <w:t>)</w:t>
+      </w:r>
+    </w:p>
+    <w:p>
+      <w:pPr>
+        <w:shd w:val="clear" w:color="auto" w:fill="1E1E1E"/>
+        <w:spacing w:after="0" w:line="285" w:lineRule="atLeast"/>
+        <w:rPr>
+          <w:rFonts w:ascii="Consolas" w:eastAsia="Times New Roman" w:hAnsi="Consolas" w:cs="Times New Roman"/>
+          <w:color w:val="D4D4D4"/>
+          <w:kern w:val="0"/>
+          <w:sz w:val="21"/>
+          <w:szCs w:val="21"/>
+          <w:lang w:val="en-US" w:eastAsia="fr-CH"/>
+          <w14:ligatures w14:val="none"/>
+        </w:rPr>
+      </w:pPr>
+      <w:r>
+        <w:rPr>
+          <w:rFonts w:ascii="Consolas" w:eastAsia="Times New Roman" w:hAnsi="Consolas" w:cs="Times New Roman"/>
+          <w:color w:val="D4D4D4"/>
+          <w:kern w:val="0"/>
+          <w:sz w:val="21"/>
+          <w:szCs w:val="21"/>
+          <w:lang w:val="en-US" w:eastAsia="fr-CH"/>
+          <w14:ligatures w14:val="none"/>
+        </w:rPr>
+        <w:t>{</w:t>
+      </w:r>
+    </w:p>
+    <w:p>
+      <w:pPr>
+        <w:shd w:val="clear" w:color="auto" w:fill="1E1E1E"/>
+        <w:spacing w:after="0" w:line="285" w:lineRule="atLeast"/>
+        <w:rPr>
+          <w:rFonts w:ascii="Consolas" w:eastAsia="Times New Roman" w:hAnsi="Consolas" w:cs="Times New Roman"/>
+          <w:color w:val="D4D4D4"/>
+          <w:kern w:val="0"/>
+          <w:sz w:val="21"/>
+          <w:szCs w:val="21"/>
+          <w:lang w:val="en-US" w:eastAsia="fr-CH"/>
+          <w14:ligatures w14:val="none"/>
+        </w:rPr>
+      </w:pPr>
+      <w:r>
+        <w:rPr>
+          <w:rFonts w:ascii="Consolas" w:eastAsia="Times New Roman" w:hAnsi="Consolas" w:cs="Times New Roman"/>
+          <w:color w:val="D4D4D4"/>
+          <w:kern w:val="0"/>
+          <w:sz w:val="21"/>
+          <w:szCs w:val="21"/>
+          <w:lang w:val="en-US" w:eastAsia="fr-CH"/>
+          <w14:ligatures w14:val="none"/>
+        </w:rPr>
+        <w:t xml:space="preserve">    // Arrange</w:t>
+      </w:r>
+    </w:p>
+    <w:p>
+      <w:pPr>
+        <w:shd w:val="clear" w:color="auto" w:fill="1E1E1E"/>
+        <w:spacing w:after="0" w:line="285" w:lineRule="atLeast"/>
+        <w:rPr>
+          <w:rFonts w:ascii="Consolas" w:eastAsia="Times New Roman" w:hAnsi="Consolas" w:cs="Times New Roman"/>
+          <w:color w:val="D4D4D4"/>
+          <w:kern w:val="0"/>
+          <w:sz w:val="21"/>
+          <w:szCs w:val="21"/>
+          <w:lang w:val="en-US" w:eastAsia="fr-CH"/>
+          <w14:ligatures w14:val="none"/>
+        </w:rPr>
+      </w:pPr>
+      <w:r>
+        <w:rPr>
+          <w:rFonts w:ascii="Consolas" w:eastAsia="Times New Roman" w:hAnsi="Consolas" w:cs="Times New Roman"/>
+          <w:color w:val="D4D4D4"/>
+          <w:kern w:val="0"/>
+          <w:sz w:val="21"/>
+          <w:szCs w:val="21"/>
+          <w:lang w:val="en-US" w:eastAsia="fr-CH"/>
+          <w14:ligatures w14:val="none"/>
+        </w:rPr>
+        <w:t xml:space="preserve">    int x1 = 0, y1 = 0, width1 = 10, height1 = 10;</w:t>
+      </w:r>
+    </w:p>
+    <w:p>
+      <w:pPr>
+        <w:shd w:val="clear" w:color="auto" w:fill="1E1E1E"/>
+        <w:spacing w:after="0" w:line="285" w:lineRule="atLeast"/>
+        <w:rPr>
+          <w:rFonts w:ascii="Consolas" w:eastAsia="Times New Roman" w:hAnsi="Consolas" w:cs="Times New Roman"/>
+          <w:color w:val="D4D4D4"/>
+          <w:kern w:val="0"/>
+          <w:sz w:val="21"/>
+          <w:szCs w:val="21"/>
+          <w:lang w:val="en-US" w:eastAsia="fr-CH"/>
+          <w14:ligatures w14:val="none"/>
+        </w:rPr>
+      </w:pPr>
+      <w:r>
+        <w:rPr>
+          <w:rFonts w:ascii="Consolas" w:eastAsia="Times New Roman" w:hAnsi="Consolas" w:cs="Times New Roman"/>
+          <w:color w:val="D4D4D4"/>
+          <w:kern w:val="0"/>
+          <w:sz w:val="21"/>
+          <w:szCs w:val="21"/>
+          <w:lang w:val="en-US" w:eastAsia="fr-CH"/>
+          <w14:ligatures w14:val="none"/>
+        </w:rPr>
+        <w:t xml:space="preserve">    int x2 = 5, y2 = 5, width2 = 10, height2 = 10;</w:t>
+      </w:r>
+    </w:p>
+    <w:p>
+      <w:pPr>
+        <w:shd w:val="clear" w:color="auto" w:fill="1E1E1E"/>
+        <w:spacing w:after="0" w:line="285" w:lineRule="atLeast"/>
+        <w:rPr>
+          <w:rFonts w:ascii="Consolas" w:eastAsia="Times New Roman" w:hAnsi="Consolas" w:cs="Times New Roman"/>
+          <w:color w:val="D4D4D4"/>
+          <w:kern w:val="0"/>
+          <w:sz w:val="21"/>
+          <w:szCs w:val="21"/>
+          <w:lang w:val="en-US" w:eastAsia="fr-CH"/>
+          <w14:ligatures w14:val="none"/>
+        </w:rPr>
+      </w:pPr>
+    </w:p>
+    <w:p>
+      <w:pPr>
+        <w:shd w:val="clear" w:color="auto" w:fill="1E1E1E"/>
+        <w:spacing w:after="0" w:line="285" w:lineRule="atLeast"/>
+        <w:rPr>
+          <w:rFonts w:ascii="Consolas" w:eastAsia="Times New Roman" w:hAnsi="Consolas" w:cs="Times New Roman"/>
+          <w:color w:val="D4D4D4"/>
+          <w:kern w:val="0"/>
+          <w:sz w:val="21"/>
+          <w:szCs w:val="21"/>
+          <w:lang w:val="en-US" w:eastAsia="fr-CH"/>
+          <w14:ligatures w14:val="none"/>
+        </w:rPr>
+      </w:pPr>
+      <w:r>
+        <w:rPr>
+          <w:rFonts w:ascii="Consolas" w:eastAsia="Times New Roman" w:hAnsi="Consolas" w:cs="Times New Roman"/>
+          <w:color w:val="D4D4D4"/>
+          <w:kern w:val="0"/>
+          <w:sz w:val="21"/>
+          <w:szCs w:val="21"/>
+          <w:lang w:val="en-US" w:eastAsia="fr-CH"/>
+          <w14:ligatures w14:val="none"/>
+        </w:rPr>
+        <w:t xml:space="preserve">    // Act</w:t>
+      </w:r>
+    </w:p>
+    <w:p>
+      <w:pPr>
+        <w:shd w:val="clear" w:color="auto" w:fill="1E1E1E"/>
+        <w:spacing w:after="0" w:line="285" w:lineRule="atLeast"/>
+        <w:rPr>
+          <w:rFonts w:ascii="Consolas" w:eastAsia="Times New Roman" w:hAnsi="Consolas" w:cs="Times New Roman"/>
+          <w:color w:val="D4D4D4"/>
+          <w:kern w:val="0"/>
+          <w:sz w:val="21"/>
+          <w:szCs w:val="21"/>
+          <w:lang w:val="en-US" w:eastAsia="fr-CH"/>
+          <w14:ligatures w14:val="none"/>
+        </w:rPr>
+      </w:pPr>
+      <w:r>
+        <w:rPr>
+          <w:rFonts w:ascii="Consolas" w:eastAsia="Times New Roman" w:hAnsi="Consolas" w:cs="Times New Roman"/>
+          <w:color w:val="D4D4D4"/>
+          <w:kern w:val="0"/>
+          <w:sz w:val="21"/>
+          <w:szCs w:val="21"/>
+          <w:lang w:val="en-US" w:eastAsia="fr-CH"/>
+          <w14:ligatures w14:val="none"/>
+        </w:rPr>
+        <w:t xml:space="preserve">    bool result = </w:t>
+      </w:r>
+      <w:proofErr w:type="spellStart"/>
+      <w:r>
+        <w:rPr>
+          <w:rFonts w:ascii="Consolas" w:eastAsia="Times New Roman" w:hAnsi="Consolas" w:cs="Times New Roman"/>
+          <w:color w:val="D4D4D4"/>
+          <w:kern w:val="0"/>
+          <w:sz w:val="21"/>
+          <w:szCs w:val="21"/>
+          <w:lang w:val="en-US" w:eastAsia="fr-CH"/>
+          <w14:ligatures w14:val="none"/>
+        </w:rPr>
+        <w:t>MathHelpers.IsTouching</w:t>
+      </w:r>
+      <w:proofErr w:type="spellEnd"/>
+      <w:r>
+        <w:rPr>
+          <w:rFonts w:ascii="Consolas" w:eastAsia="Times New Roman" w:hAnsi="Consolas" w:cs="Times New Roman"/>
+          <w:color w:val="D4D4D4"/>
+          <w:kern w:val="0"/>
+          <w:sz w:val="21"/>
+          <w:szCs w:val="21"/>
+          <w:lang w:val="en-US" w:eastAsia="fr-CH"/>
+          <w14:ligatures w14:val="none"/>
+        </w:rPr>
+        <w:t>(x1, y1, width1, height1, x2, y2, width2, height2);</w:t>
+      </w:r>
+    </w:p>
+    <w:p>
+      <w:pPr>
+        <w:shd w:val="clear" w:color="auto" w:fill="1E1E1E"/>
+        <w:spacing w:after="0" w:line="285" w:lineRule="atLeast"/>
+        <w:rPr>
+          <w:rFonts w:ascii="Consolas" w:eastAsia="Times New Roman" w:hAnsi="Consolas" w:cs="Times New Roman"/>
+          <w:color w:val="D4D4D4"/>
+          <w:kern w:val="0"/>
+          <w:sz w:val="21"/>
+          <w:szCs w:val="21"/>
+          <w:lang w:val="en-US" w:eastAsia="fr-CH"/>
+          <w14:ligatures w14:val="none"/>
+        </w:rPr>
+      </w:pPr>
     </w:p>
     <w:p>
       <w:pPr>
@@ -2263,235 +2607,12 @@
           <w:kern w:val="0"/>
           <w:sz w:val="21"/>
           <w:szCs w:val="21"/>
-          <w:lang w:eastAsia="fr-CH"/>
-          <w14:ligatures w14:val="none"/>
-        </w:rPr>
-        <w:t>[TestMethod]</w:t>
-      </w:r>
-    </w:p>
-    <w:p>
-      <w:pPr>
-        <w:shd w:val="clear" w:color="auto" w:fill="1E1E1E"/>
-        <w:spacing w:after="0" w:line="285" w:lineRule="atLeast"/>
-        <w:rPr>
-          <w:rFonts w:ascii="Consolas" w:eastAsia="Times New Roman" w:hAnsi="Consolas" w:cs="Times New Roman"/>
-          <w:color w:val="D4D4D4"/>
-          <w:kern w:val="0"/>
-          <w:sz w:val="21"/>
-          <w:szCs w:val="21"/>
           <w:lang w:val="en-US" w:eastAsia="fr-CH"/>
           <w14:ligatures w14:val="none"/>
         </w:rPr>
-      </w:pPr>
-      <w:r>
-        <w:rPr>
-          <w:rFonts w:ascii="Consolas" w:eastAsia="Times New Roman" w:hAnsi="Consolas" w:cs="Times New Roman"/>
-          <w:color w:val="D4D4D4"/>
-          <w:kern w:val="0"/>
-          <w:sz w:val="21"/>
-          <w:szCs w:val="21"/>
-          <w:lang w:val="en-US" w:eastAsia="fr-CH"/>
-          <w14:ligatures w14:val="none"/>
-        </w:rPr>
-        <w:t>public void MathHelpers_IsTouching_2Rectangles_True()</w:t>
-      </w:r>
-    </w:p>
-    <w:p>
-      <w:pPr>
-        <w:shd w:val="clear" w:color="auto" w:fill="1E1E1E"/>
-        <w:spacing w:after="0" w:line="285" w:lineRule="atLeast"/>
-        <w:rPr>
-          <w:rFonts w:ascii="Consolas" w:eastAsia="Times New Roman" w:hAnsi="Consolas" w:cs="Times New Roman"/>
-          <w:color w:val="D4D4D4"/>
-          <w:kern w:val="0"/>
-          <w:sz w:val="21"/>
-          <w:szCs w:val="21"/>
-          <w:lang w:val="en-US" w:eastAsia="fr-CH"/>
-          <w14:ligatures w14:val="none"/>
-        </w:rPr>
-      </w:pPr>
-      <w:r>
-        <w:rPr>
-          <w:rFonts w:ascii="Consolas" w:eastAsia="Times New Roman" w:hAnsi="Consolas" w:cs="Times New Roman"/>
-          <w:color w:val="D4D4D4"/>
-          <w:kern w:val="0"/>
-          <w:sz w:val="21"/>
-          <w:szCs w:val="21"/>
-          <w:lang w:val="en-US" w:eastAsia="fr-CH"/>
-          <w14:ligatures w14:val="none"/>
-        </w:rPr>
-        <w:t>{</w:t>
-      </w:r>
-    </w:p>
-    <w:p>
-      <w:pPr>
-        <w:shd w:val="clear" w:color="auto" w:fill="1E1E1E"/>
-        <w:spacing w:after="0" w:line="285" w:lineRule="atLeast"/>
-        <w:rPr>
-          <w:rFonts w:ascii="Consolas" w:eastAsia="Times New Roman" w:hAnsi="Consolas" w:cs="Times New Roman"/>
-          <w:color w:val="D4D4D4"/>
-          <w:kern w:val="0"/>
-          <w:sz w:val="21"/>
-          <w:szCs w:val="21"/>
-          <w:lang w:val="en-US" w:eastAsia="fr-CH"/>
-          <w14:ligatures w14:val="none"/>
-        </w:rPr>
-      </w:pPr>
-      <w:r>
-        <w:rPr>
-          <w:rFonts w:ascii="Consolas" w:eastAsia="Times New Roman" w:hAnsi="Consolas" w:cs="Times New Roman"/>
-          <w:color w:val="D4D4D4"/>
-          <w:kern w:val="0"/>
-          <w:sz w:val="21"/>
-          <w:szCs w:val="21"/>
-          <w:lang w:val="en-US" w:eastAsia="fr-CH"/>
-          <w14:ligatures w14:val="none"/>
-        </w:rPr>
-        <w:t xml:space="preserve">    // Arrange</w:t>
-      </w:r>
-    </w:p>
-    <w:p>
-      <w:pPr>
-        <w:shd w:val="clear" w:color="auto" w:fill="1E1E1E"/>
-        <w:spacing w:after="0" w:line="285" w:lineRule="atLeast"/>
-        <w:rPr>
-          <w:rFonts w:ascii="Consolas" w:eastAsia="Times New Roman" w:hAnsi="Consolas" w:cs="Times New Roman"/>
-          <w:color w:val="D4D4D4"/>
-          <w:kern w:val="0"/>
-          <w:sz w:val="21"/>
-          <w:szCs w:val="21"/>
-          <w:lang w:val="en-US" w:eastAsia="fr-CH"/>
-          <w14:ligatures w14:val="none"/>
-        </w:rPr>
-      </w:pPr>
-      <w:r>
-        <w:rPr>
-          <w:rFonts w:ascii="Consolas" w:eastAsia="Times New Roman" w:hAnsi="Consolas" w:cs="Times New Roman"/>
-          <w:color w:val="D4D4D4"/>
-          <w:kern w:val="0"/>
-          <w:sz w:val="21"/>
-          <w:szCs w:val="21"/>
-          <w:lang w:val="en-US" w:eastAsia="fr-CH"/>
-          <w14:ligatures w14:val="none"/>
-        </w:rPr>
-        <w:t xml:space="preserve">    int x1 = 0, y1 = 0, width1 = 10, height1 = 10;</w:t>
-      </w:r>
-    </w:p>
-    <w:p>
-      <w:pPr>
-        <w:shd w:val="clear" w:color="auto" w:fill="1E1E1E"/>
-        <w:spacing w:after="0" w:line="285" w:lineRule="atLeast"/>
-        <w:rPr>
-          <w:rFonts w:ascii="Consolas" w:eastAsia="Times New Roman" w:hAnsi="Consolas" w:cs="Times New Roman"/>
-          <w:color w:val="D4D4D4"/>
-          <w:kern w:val="0"/>
-          <w:sz w:val="21"/>
-          <w:szCs w:val="21"/>
-          <w:lang w:val="en-US" w:eastAsia="fr-CH"/>
-          <w14:ligatures w14:val="none"/>
-        </w:rPr>
-      </w:pPr>
-      <w:r>
-        <w:rPr>
-          <w:rFonts w:ascii="Consolas" w:eastAsia="Times New Roman" w:hAnsi="Consolas" w:cs="Times New Roman"/>
-          <w:color w:val="D4D4D4"/>
-          <w:kern w:val="0"/>
-          <w:sz w:val="21"/>
-          <w:szCs w:val="21"/>
-          <w:lang w:val="en-US" w:eastAsia="fr-CH"/>
-          <w14:ligatures w14:val="none"/>
-        </w:rPr>
-        <w:t xml:space="preserve">    int x2 = 5, y2 = 5, width2 = 10, height2 = 10;</w:t>
-      </w:r>
-    </w:p>
-    <w:p>
-      <w:pPr>
-        <w:shd w:val="clear" w:color="auto" w:fill="1E1E1E"/>
-        <w:spacing w:after="0" w:line="285" w:lineRule="atLeast"/>
-        <w:rPr>
-          <w:rFonts w:ascii="Consolas" w:eastAsia="Times New Roman" w:hAnsi="Consolas" w:cs="Times New Roman"/>
-          <w:color w:val="D4D4D4"/>
-          <w:kern w:val="0"/>
-          <w:sz w:val="21"/>
-          <w:szCs w:val="21"/>
-          <w:lang w:val="en-US" w:eastAsia="fr-CH"/>
-          <w14:ligatures w14:val="none"/>
-        </w:rPr>
-      </w:pPr>
-    </w:p>
-    <w:p>
-      <w:pPr>
-        <w:shd w:val="clear" w:color="auto" w:fill="1E1E1E"/>
-        <w:spacing w:after="0" w:line="285" w:lineRule="atLeast"/>
-        <w:rPr>
-          <w:rFonts w:ascii="Consolas" w:eastAsia="Times New Roman" w:hAnsi="Consolas" w:cs="Times New Roman"/>
-          <w:color w:val="D4D4D4"/>
-          <w:kern w:val="0"/>
-          <w:sz w:val="21"/>
-          <w:szCs w:val="21"/>
-          <w:lang w:val="en-US" w:eastAsia="fr-CH"/>
-          <w14:ligatures w14:val="none"/>
-        </w:rPr>
-      </w:pPr>
-      <w:r>
-        <w:rPr>
-          <w:rFonts w:ascii="Consolas" w:eastAsia="Times New Roman" w:hAnsi="Consolas" w:cs="Times New Roman"/>
-          <w:color w:val="D4D4D4"/>
-          <w:kern w:val="0"/>
-          <w:sz w:val="21"/>
-          <w:szCs w:val="21"/>
-          <w:lang w:val="en-US" w:eastAsia="fr-CH"/>
-          <w14:ligatures w14:val="none"/>
-        </w:rPr>
-        <w:t xml:space="preserve">    // Act</w:t>
-      </w:r>
-    </w:p>
-    <w:p>
-      <w:pPr>
-        <w:shd w:val="clear" w:color="auto" w:fill="1E1E1E"/>
-        <w:spacing w:after="0" w:line="285" w:lineRule="atLeast"/>
-        <w:rPr>
-          <w:rFonts w:ascii="Consolas" w:eastAsia="Times New Roman" w:hAnsi="Consolas" w:cs="Times New Roman"/>
-          <w:color w:val="D4D4D4"/>
-          <w:kern w:val="0"/>
-          <w:sz w:val="21"/>
-          <w:szCs w:val="21"/>
-          <w:lang w:val="en-US" w:eastAsia="fr-CH"/>
-          <w14:ligatures w14:val="none"/>
-        </w:rPr>
-      </w:pPr>
-      <w:r>
-        <w:rPr>
-          <w:rFonts w:ascii="Consolas" w:eastAsia="Times New Roman" w:hAnsi="Consolas" w:cs="Times New Roman"/>
-          <w:color w:val="D4D4D4"/>
-          <w:kern w:val="0"/>
-          <w:sz w:val="21"/>
-          <w:szCs w:val="21"/>
-          <w:lang w:val="en-US" w:eastAsia="fr-CH"/>
-          <w14:ligatures w14:val="none"/>
-        </w:rPr>
-        <w:t xml:space="preserve">    bool result = MathHelpers.IsTouching(x1, y1, width1, height1, x2, y2, width2, height2);</w:t>
-      </w:r>
-    </w:p>
-    <w:p>
-      <w:pPr>
-        <w:shd w:val="clear" w:color="auto" w:fill="1E1E1E"/>
-        <w:spacing w:after="0" w:line="285" w:lineRule="atLeast"/>
-        <w:rPr>
-          <w:rFonts w:ascii="Consolas" w:eastAsia="Times New Roman" w:hAnsi="Consolas" w:cs="Times New Roman"/>
-          <w:color w:val="D4D4D4"/>
-          <w:kern w:val="0"/>
-          <w:sz w:val="21"/>
-          <w:szCs w:val="21"/>
-          <w:lang w:val="en-US" w:eastAsia="fr-CH"/>
-          <w14:ligatures w14:val="none"/>
-        </w:rPr>
-      </w:pPr>
-    </w:p>
-    <w:p>
-      <w:pPr>
-        <w:shd w:val="clear" w:color="auto" w:fill="1E1E1E"/>
-        <w:spacing w:after="0" w:line="285" w:lineRule="atLeast"/>
+        <w:t xml:space="preserve">    </w:t>
+      </w:r>
+      <w:r>
         <w:rPr>
           <w:rFonts w:ascii="Consolas" w:eastAsia="Times New Roman" w:hAnsi="Consolas" w:cs="Times New Roman"/>
           <w:color w:val="D4D4D4"/>
@@ -2501,19 +2622,9 @@
           <w:lang w:eastAsia="fr-CH"/>
           <w14:ligatures w14:val="none"/>
         </w:rPr>
-      </w:pPr>
-      <w:r>
-        <w:rPr>
-          <w:rFonts w:ascii="Consolas" w:eastAsia="Times New Roman" w:hAnsi="Consolas" w:cs="Times New Roman"/>
-          <w:color w:val="D4D4D4"/>
-          <w:kern w:val="0"/>
-          <w:sz w:val="21"/>
-          <w:szCs w:val="21"/>
-          <w:lang w:val="en-US" w:eastAsia="fr-CH"/>
-          <w14:ligatures w14:val="none"/>
-        </w:rPr>
-        <w:t xml:space="preserve">    </w:t>
-      </w:r>
+        <w:t xml:space="preserve">// </w:t>
+      </w:r>
+      <w:proofErr w:type="spellStart"/>
       <w:r>
         <w:rPr>
           <w:rFonts w:ascii="Consolas" w:eastAsia="Times New Roman" w:hAnsi="Consolas" w:cs="Times New Roman"/>
@@ -2524,8 +2635,9 @@
           <w:lang w:eastAsia="fr-CH"/>
           <w14:ligatures w14:val="none"/>
         </w:rPr>
-        <w:t>// Assert</w:t>
-      </w:r>
+        <w:t>Assert</w:t>
+      </w:r>
+      <w:proofErr w:type="spellEnd"/>
     </w:p>
     <w:p>
       <w:pPr>
@@ -2551,13 +2663,10 @@
           <w:lang w:eastAsia="fr-CH"/>
           <w14:ligatures w14:val="none"/>
         </w:rPr>
-        <w:t xml:space="preserve">    Assert.IsTrue(result);</w:t>
-      </w:r>
-    </w:p>
-    <w:p>
-      <w:pPr>
-        <w:shd w:val="clear" w:color="auto" w:fill="1E1E1E"/>
-        <w:spacing w:after="0" w:line="285" w:lineRule="atLeast"/>
+        <w:t xml:space="preserve">    </w:t>
+      </w:r>
+      <w:proofErr w:type="spellStart"/>
+      <w:r>
         <w:rPr>
           <w:rFonts w:ascii="Consolas" w:eastAsia="Times New Roman" w:hAnsi="Consolas" w:cs="Times New Roman"/>
           <w:color w:val="D4D4D4"/>
@@ -2567,7 +2676,9 @@
           <w:lang w:eastAsia="fr-CH"/>
           <w14:ligatures w14:val="none"/>
         </w:rPr>
-      </w:pPr>
+        <w:t>Assert.IsTrue</w:t>
+      </w:r>
+      <w:proofErr w:type="spellEnd"/>
       <w:r>
         <w:rPr>
           <w:rFonts w:ascii="Consolas" w:eastAsia="Times New Roman" w:hAnsi="Consolas" w:cs="Times New Roman"/>
@@ -2578,6 +2689,61 @@
           <w:lang w:eastAsia="fr-CH"/>
           <w14:ligatures w14:val="none"/>
         </w:rPr>
+        <w:t>(</w:t>
+      </w:r>
+      <w:proofErr w:type="spellStart"/>
+      <w:r>
+        <w:rPr>
+          <w:rFonts w:ascii="Consolas" w:eastAsia="Times New Roman" w:hAnsi="Consolas" w:cs="Times New Roman"/>
+          <w:color w:val="D4D4D4"/>
+          <w:kern w:val="0"/>
+          <w:sz w:val="21"/>
+          <w:szCs w:val="21"/>
+          <w:lang w:eastAsia="fr-CH"/>
+          <w14:ligatures w14:val="none"/>
+        </w:rPr>
+        <w:t>result</w:t>
+      </w:r>
+      <w:proofErr w:type="spellEnd"/>
+      <w:proofErr w:type="gramStart"/>
+      <w:r>
+        <w:rPr>
+          <w:rFonts w:ascii="Consolas" w:eastAsia="Times New Roman" w:hAnsi="Consolas" w:cs="Times New Roman"/>
+          <w:color w:val="D4D4D4"/>
+          <w:kern w:val="0"/>
+          <w:sz w:val="21"/>
+          <w:szCs w:val="21"/>
+          <w:lang w:eastAsia="fr-CH"/>
+          <w14:ligatures w14:val="none"/>
+        </w:rPr>
+        <w:t>);</w:t>
+      </w:r>
+      <w:proofErr w:type="gramEnd"/>
+    </w:p>
+    <w:p>
+      <w:pPr>
+        <w:shd w:val="clear" w:color="auto" w:fill="1E1E1E"/>
+        <w:spacing w:after="0" w:line="285" w:lineRule="atLeast"/>
+        <w:rPr>
+          <w:rFonts w:ascii="Consolas" w:eastAsia="Times New Roman" w:hAnsi="Consolas" w:cs="Times New Roman"/>
+          <w:color w:val="D4D4D4"/>
+          <w:kern w:val="0"/>
+          <w:sz w:val="21"/>
+          <w:szCs w:val="21"/>
+          <w:lang w:eastAsia="fr-CH"/>
+          <w14:ligatures w14:val="none"/>
+        </w:rPr>
+      </w:pPr>
+      <w:r>
+        <w:rPr>
+          <w:rFonts w:ascii="Consolas" w:eastAsia="Times New Roman" w:hAnsi="Consolas" w:cs="Times New Roman"/>
+          <w:color w:val="D4D4D4"/>
+          <w:kern w:val="0"/>
+          <w:sz w:val="21"/>
+          <w:szCs w:val="21"/>
+          <w:lang w:eastAsia="fr-CH"/>
+          <w14:ligatures w14:val="none"/>
+        </w:rPr>
         <w:t>}</w:t>
       </w:r>
     </w:p>
@@ -2759,7 +2925,15 @@
         <w:t>, pendant ce chapitre, j’ai demandé de l’aide pour imaginer quels outils je pouvais utiliser</w:t>
       </w:r>
       <w:r>
-        <w:t xml:space="preserve"> (utiliser une Liste,  une nouvelle classe)</w:t>
+        <w:t xml:space="preserve"> (utiliser une </w:t>
+      </w:r>
+      <w:proofErr w:type="gramStart"/>
+      <w:r>
+        <w:t>Liste,  une</w:t>
+      </w:r>
+      <w:proofErr w:type="gramEnd"/>
+      <w:r>
+        <w:t xml:space="preserve"> nouvelle classe)</w:t>
       </w:r>
       <w:r>
         <w:t xml:space="preserve"> mais là encore, j’ai fini par opter pour ma propre approche</w:t>
@@ -2801,7 +2975,13 @@
     </w:p>
     <w:p>
       <w:r>
-        <w:t>Je n’ai pas utilisé d’LLM pour le rapport.</w:t>
+        <w:t>Je n’ai pas utilisé d’LLM pour le rapport</w:t>
+      </w:r>
+      <w:r>
+        <w:t xml:space="preserve"> (excepté diagramme de classes)</w:t>
+      </w:r>
+      <w:r>
+        <w:t>.</w:t>
       </w:r>
     </w:p>
     <w:p>
@@ -2809,6 +2989,372 @@
         <w:t>Moins décisif pour la note du projet : je n’ai pas utilisé l’IA pour les images non plus.</w:t>
       </w:r>
     </w:p>
+    <w:p>
+      <w:pPr>
+        <w:pStyle w:val="Titre3"/>
+      </w:pPr>
+      <w:r>
+        <w:t>Exemples d’utilisations type :</w:t>
+      </w:r>
+    </w:p>
+    <w:p>
+      <w:proofErr w:type="gramStart"/>
+      <w:r>
+        <w:t>il</w:t>
+      </w:r>
+      <w:proofErr w:type="gramEnd"/>
+      <w:r>
+        <w:t xml:space="preserve"> est ou l'explorateur de solutions</w:t>
+      </w:r>
+    </w:p>
+    <w:p>
+      <w:pPr>
+        <w:rPr>
+          <w:b/>
+          <w:bCs/>
+        </w:rPr>
+      </w:pPr>
+      <w:r>
+        <w:rPr>
+          <w:rFonts w:ascii="Segoe UI Emoji" w:hAnsi="Segoe UI Emoji" w:cs="Segoe UI Emoji"/>
+          <w:b/>
+          <w:bCs/>
+        </w:rPr>
+        <w:t>📂</w:t>
+      </w:r>
+      <w:r>
+        <w:rPr>
+          <w:b/>
+          <w:bCs/>
+        </w:rPr>
+        <w:t xml:space="preserve"> L’Explorateur de solutions</w:t>
+      </w:r>
+    </w:p>
+    <w:p>
+      <w:r>
+        <w:t xml:space="preserve">Il devrait être </w:t>
+      </w:r>
+      <w:r>
+        <w:rPr>
+          <w:b/>
+          <w:bCs/>
+        </w:rPr>
+        <w:t>à droite</w:t>
+      </w:r>
+      <w:r>
+        <w:t xml:space="preserve"> de ton écran (généralement).</w:t>
+      </w:r>
+    </w:p>
+    <w:p>
+      <w:r>
+        <w:t>Si tu ne le vois pas :</w:t>
+      </w:r>
+    </w:p>
+    <w:p>
+      <w:pPr>
+        <w:rPr>
+          <w:b/>
+          <w:bCs/>
+        </w:rPr>
+      </w:pPr>
+      <w:r>
+        <w:rPr>
+          <w:rFonts w:ascii="Segoe UI Emoji" w:hAnsi="Segoe UI Emoji" w:cs="Segoe UI Emoji"/>
+          <w:b/>
+          <w:bCs/>
+        </w:rPr>
+        <w:t>🔧</w:t>
+      </w:r>
+      <w:r>
+        <w:rPr>
+          <w:b/>
+          <w:bCs/>
+        </w:rPr>
+        <w:t xml:space="preserve"> Pour l’afficher :</w:t>
+      </w:r>
+    </w:p>
+    <w:p>
+      <w:r>
+        <w:rPr>
+          <w:b/>
+          <w:bCs/>
+        </w:rPr>
+        <w:t>Menu</w:t>
+      </w:r>
+      <w:r>
+        <w:t xml:space="preserve"> → </w:t>
+      </w:r>
+      <w:r>
+        <w:rPr>
+          <w:b/>
+          <w:bCs/>
+        </w:rPr>
+        <w:t>Affichage</w:t>
+      </w:r>
+      <w:r>
+        <w:t xml:space="preserve"> (ou “</w:t>
+      </w:r>
+      <w:proofErr w:type="spellStart"/>
+      <w:r>
+        <w:t>View</w:t>
+      </w:r>
+      <w:proofErr w:type="spellEnd"/>
+      <w:r>
+        <w:t xml:space="preserve">” en anglais) → </w:t>
+      </w:r>
+      <w:r>
+        <w:rPr>
+          <w:b/>
+          <w:bCs/>
+        </w:rPr>
+        <w:t>Explorateur de solutions</w:t>
+      </w:r>
+    </w:p>
+    <w:p>
+      <w:r>
+        <w:t xml:space="preserve">Ou plus rapide : </w:t>
+      </w:r>
+      <w:r>
+        <w:rPr>
+          <w:b/>
+          <w:bCs/>
+        </w:rPr>
+        <w:t>Ctrl + Alt + L</w:t>
+      </w:r>
+      <w:r>
+        <w:t xml:space="preserve"> </w:t>
+      </w:r>
+      <w:r>
+        <w:rPr>
+          <w:rFonts w:ascii="Segoe UI Emoji" w:hAnsi="Segoe UI Emoji" w:cs="Segoe UI Emoji"/>
+        </w:rPr>
+        <w:t>⌨️</w:t>
+      </w:r>
+    </w:p>
+    <w:p>
+      <w:r>
+        <w:pict w14:anchorId="31FAEBCE">
+          <v:rect id="_x0000_i1037" style="width:0;height:0" o:hralign="center" o:hrstd="t" o:hr="t" fillcolor="#a0a0a0" stroked="f"/>
+        </w:pict>
+      </w:r>
+    </w:p>
+    <w:p>
+      <w:pPr>
+        <w:rPr>
+          <w:b/>
+          <w:bCs/>
+        </w:rPr>
+      </w:pPr>
+      <w:r>
+        <w:rPr>
+          <w:rFonts w:ascii="Segoe UI Emoji" w:hAnsi="Segoe UI Emoji" w:cs="Segoe UI Emoji"/>
+          <w:b/>
+          <w:bCs/>
+        </w:rPr>
+        <w:t>📍</w:t>
+      </w:r>
+      <w:r>
+        <w:rPr>
+          <w:b/>
+          <w:bCs/>
+        </w:rPr>
+        <w:t xml:space="preserve"> Une fois ouvert :</w:t>
+      </w:r>
+    </w:p>
+    <w:p>
+      <w:r>
+        <w:t>Tu verras l’arborescence de ton projet :</w:t>
+      </w:r>
+    </w:p>
+    <w:p>
+      <w:proofErr w:type="spellStart"/>
+      <w:r>
+        <w:t>MonProjet</w:t>
+      </w:r>
+      <w:proofErr w:type="spellEnd"/>
+    </w:p>
+    <w:p>
+      <w:r>
+        <w:t xml:space="preserve">  </w:t>
+      </w:r>
+      <w:r>
+        <w:rPr>
+          <w:rFonts w:ascii="MS Gothic" w:eastAsia="MS Gothic" w:hAnsi="MS Gothic" w:cs="MS Gothic" w:hint="eastAsia"/>
+        </w:rPr>
+        <w:t>├</w:t>
+      </w:r>
+      <w:r>
+        <w:rPr>
+          <w:rFonts w:ascii="Aptos" w:hAnsi="Aptos" w:cs="Aptos"/>
+        </w:rPr>
+        <w:t>─</w:t>
+      </w:r>
+      <w:r>
+        <w:t xml:space="preserve"> </w:t>
+      </w:r>
+      <w:proofErr w:type="spellStart"/>
+      <w:r>
+        <w:t>Player.cs</w:t>
+      </w:r>
+      <w:proofErr w:type="spellEnd"/>
+    </w:p>
+    <w:p>
+      <w:r>
+        <w:t xml:space="preserve">  </w:t>
+      </w:r>
+      <w:r>
+        <w:rPr>
+          <w:rFonts w:ascii="MS Gothic" w:eastAsia="MS Gothic" w:hAnsi="MS Gothic" w:cs="MS Gothic" w:hint="eastAsia"/>
+        </w:rPr>
+        <w:t>├</w:t>
+      </w:r>
+      <w:r>
+        <w:rPr>
+          <w:rFonts w:ascii="Aptos" w:hAnsi="Aptos" w:cs="Aptos"/>
+        </w:rPr>
+        <w:t>─</w:t>
+      </w:r>
+      <w:r>
+        <w:t xml:space="preserve"> </w:t>
+      </w:r>
+      <w:proofErr w:type="spellStart"/>
+      <w:r>
+        <w:t>Drones.cs</w:t>
+      </w:r>
+      <w:proofErr w:type="spellEnd"/>
+    </w:p>
+    <w:p>
+      <w:r>
+        <w:t xml:space="preserve">  </w:t>
+      </w:r>
+      <w:r>
+        <w:rPr>
+          <w:rFonts w:ascii="MS Gothic" w:eastAsia="MS Gothic" w:hAnsi="MS Gothic" w:cs="MS Gothic" w:hint="eastAsia"/>
+        </w:rPr>
+        <w:t>├</w:t>
+      </w:r>
+      <w:r>
+        <w:rPr>
+          <w:rFonts w:ascii="Aptos" w:hAnsi="Aptos" w:cs="Aptos"/>
+        </w:rPr>
+        <w:t>─</w:t>
+      </w:r>
+      <w:r>
+        <w:t xml:space="preserve"> </w:t>
+      </w:r>
+      <w:proofErr w:type="spellStart"/>
+      <w:r>
+        <w:t>Resources.Designer.cs</w:t>
+      </w:r>
+      <w:proofErr w:type="spellEnd"/>
+    </w:p>
+    <w:p>
+      <w:r>
+        <w:t xml:space="preserve">  └─ </w:t>
+      </w:r>
+      <w:proofErr w:type="spellStart"/>
+      <w:r>
+        <w:t>Properties</w:t>
+      </w:r>
+      <w:proofErr w:type="spellEnd"/>
+    </w:p>
+    <w:p>
+      <w:r>
+        <w:t xml:space="preserve">      └─ </w:t>
+      </w:r>
+      <w:proofErr w:type="spellStart"/>
+      <w:proofErr w:type="gramStart"/>
+      <w:r>
+        <w:t>Resources.resx</w:t>
+      </w:r>
+      <w:proofErr w:type="spellEnd"/>
+      <w:r>
+        <w:t xml:space="preserve">  ←</w:t>
+      </w:r>
+      <w:proofErr w:type="gramEnd"/>
+      <w:r>
+        <w:t xml:space="preserve"> C'EST LÀ !</w:t>
+      </w:r>
+    </w:p>
+    <w:p>
+      <w:r>
+        <w:t xml:space="preserve">Tu fais un </w:t>
+      </w:r>
+      <w:r>
+        <w:rPr>
+          <w:b/>
+          <w:bCs/>
+        </w:rPr>
+        <w:t>clic droit</w:t>
+      </w:r>
+      <w:r>
+        <w:t xml:space="preserve"> sur </w:t>
+      </w:r>
+      <w:proofErr w:type="spellStart"/>
+      <w:r>
+        <w:rPr>
+          <w:b/>
+          <w:bCs/>
+        </w:rPr>
+        <w:t>Resources.resx</w:t>
+      </w:r>
+      <w:proofErr w:type="spellEnd"/>
+      <w:r>
+        <w:t xml:space="preserve"> et tu choisis </w:t>
+      </w:r>
+      <w:r>
+        <w:rPr>
+          <w:b/>
+          <w:bCs/>
+        </w:rPr>
+        <w:t>“Ouvrir avec”</w:t>
+      </w:r>
+      <w:r>
+        <w:t xml:space="preserve"> → </w:t>
+      </w:r>
+      <w:r>
+        <w:rPr>
+          <w:b/>
+          <w:bCs/>
+        </w:rPr>
+        <w:t>“Éditeur de ressources”</w:t>
+      </w:r>
+    </w:p>
+    <w:p>
+      <w:r>
+        <w:pict w14:anchorId="02350AB7">
+          <v:rect id="_x0000_i1038" style="width:0;height:0" o:hralign="center" o:hrstd="t" o:hr="t" fillcolor="#a0a0a0" stroked="f"/>
+        </w:pict>
+      </w:r>
+    </w:p>
+    <w:p>
+      <w:r>
+        <w:t xml:space="preserve">Si </w:t>
+      </w:r>
+      <w:proofErr w:type="gramStart"/>
+      <w:r>
+        <w:t>tu vois toujours rien</w:t>
+      </w:r>
+      <w:proofErr w:type="gramEnd"/>
+      <w:r>
+        <w:t xml:space="preserve">, envoie une </w:t>
+      </w:r>
+      <w:proofErr w:type="spellStart"/>
+      <w:r>
+        <w:t>screenshot</w:t>
+      </w:r>
+      <w:proofErr w:type="spellEnd"/>
+      <w:r>
+        <w:t xml:space="preserve"> et je t’aiderai ! </w:t>
+      </w:r>
+      <w:r>
+        <w:rPr>
+          <w:rFonts w:ascii="Segoe UI Emoji" w:hAnsi="Segoe UI Emoji" w:cs="Segoe UI Emoji"/>
+        </w:rPr>
+        <w:t>📸</w:t>
+      </w:r>
+    </w:p>
+    <w:p/>
     <w:p>
       <w:pPr>
         <w:pStyle w:val="Titre1"/>
@@ -2879,7 +3425,15 @@
     </w:p>
     <w:p>
       <w:r>
-        <w:t>Mon principal frein sur ce projet était les mouvements des ennemis, tout le reste s’est déroulé sans encombre a part une légère lenteur.</w:t>
+        <w:t xml:space="preserve">Mon principal frein sur ce projet était les mouvements des ennemis, tout le reste s’est déroulé sans encombre </w:t>
+      </w:r>
+      <w:proofErr w:type="spellStart"/>
+      <w:r>
+        <w:t>a</w:t>
+      </w:r>
+      <w:proofErr w:type="spellEnd"/>
+      <w:r>
+        <w:t xml:space="preserve"> part une légère lenteur.</w:t>
       </w:r>
     </w:p>
     <w:p>
@@ -2891,6 +3445,7 @@
       <w:r>
         <w:t xml:space="preserve">J’aurais pu simplement copier les exercices du module (drones) et utiliser </w:t>
       </w:r>
+      <w:proofErr w:type="spellStart"/>
       <w:r>
         <w:rPr>
           <w:b/>
@@ -2898,6 +3453,7 @@
         </w:rPr>
         <w:t>roaming</w:t>
       </w:r>
+      <w:proofErr w:type="spellEnd"/>
       <w:r>
         <w:t xml:space="preserve"> </w:t>
       </w:r>
@@ -2935,6 +3491,7 @@
       </w:pPr>
       <w:bookmarkStart w:id="8" w:name="_Toc242631070"/>
       <w:r>
+        <w:lastRenderedPageBreak/>
         <w:t>BILAN PRODUIT</w:t>
       </w:r>
       <w:bookmarkEnd w:id="8"/>
@@ -2968,7 +3525,7 @@
           <w:noProof/>
         </w:rPr>
         <w:drawing>
-          <wp:inline distT="0" distB="0" distL="0" distR="0" wp14:anchorId="3A1AE593" wp14:editId="60168D72">
+          <wp:inline distT="0" distB="0" distL="0" distR="0" wp14:anchorId="3A1AE593" wp14:editId="3971B04D">
             <wp:extent cx="5760720" cy="2395220"/>
             <wp:effectExtent l="0" t="0" r="0" b="5080"/>
             <wp:docPr id="440935663" name="Image 1"/>
@@ -3038,18 +3595,36 @@
           <w:b/>
           <w:bCs/>
         </w:rPr>
-        <w:t>In progress</w:t>
-      </w:r>
-      <w:r>
-        <w:t xml:space="preserve"> et </w:t>
-      </w:r>
+        <w:t xml:space="preserve">In </w:t>
+      </w:r>
+      <w:proofErr w:type="spellStart"/>
       <w:r>
         <w:rPr>
           <w:b/>
           <w:bCs/>
         </w:rPr>
-        <w:t>In review</w:t>
-      </w:r>
+        <w:t>progress</w:t>
+      </w:r>
+      <w:proofErr w:type="spellEnd"/>
+      <w:r>
+        <w:t xml:space="preserve"> et </w:t>
+      </w:r>
+      <w:r>
+        <w:rPr>
+          <w:b/>
+          <w:bCs/>
+        </w:rPr>
+        <w:t xml:space="preserve">In </w:t>
+      </w:r>
+      <w:proofErr w:type="spellStart"/>
+      <w:r>
+        <w:rPr>
+          <w:b/>
+          <w:bCs/>
+        </w:rPr>
+        <w:t>review</w:t>
+      </w:r>
+      <w:proofErr w:type="spellEnd"/>
       <w:r>
         <w:t>.</w:t>
       </w:r>
@@ -3065,7 +3640,6 @@
       </w:pPr>
       <w:bookmarkStart w:id="9" w:name="_Toc242631071"/>
       <w:r>
-        <w:lastRenderedPageBreak/>
         <w:t>Bilan final</w:t>
       </w:r>
     </w:p>
@@ -4953,7 +5527,6 @@
   <w:style w:type="character" w:default="1" w:styleId="Policepardfaut">
     <w:name w:val="Default Paragraph Font"/>
     <w:uiPriority w:val="1"/>
-    <w:semiHidden/>
     <w:unhideWhenUsed/>
   </w:style>
   <w:style w:type="table" w:default="1" w:styleId="TableauNormal">
@@ -5692,11 +6265,12 @@
 </file>
 
 <file path=customXml/item1.xml><?xml version="1.0" encoding="utf-8"?>
-<p:properties xmlns:p="http://schemas.microsoft.com/office/2006/metadata/properties" xmlns:xsi="http://www.w3.org/2001/XMLSchema-instance" xmlns:pc="http://schemas.microsoft.com/office/infopath/2007/PartnerControls">
-  <documentManagement>
-    <_activity xmlns="0dcbab57-ce0d-48ec-9006-afbf43b82b42" xsi:nil="true"/>
-  </documentManagement>
-</p:properties>
+<?mso-contentType ?>
+<FormTemplates xmlns="http://schemas.microsoft.com/sharepoint/v3/contenttype/forms">
+  <Display>DocumentLibraryForm</Display>
+  <Edit>DocumentLibraryForm</Edit>
+  <New>DocumentLibraryForm</New>
+</FormTemplates>
 </file>
 
 <file path=customXml/item2.xml><?xml version="1.0" encoding="utf-8"?>
@@ -5882,20 +6456,17 @@
 </file>
 
 <file path=customXml/item3.xml><?xml version="1.0" encoding="utf-8"?>
-<?mso-contentType ?>
-<FormTemplates xmlns="http://schemas.microsoft.com/sharepoint/v3/contenttype/forms">
-  <Display>DocumentLibraryForm</Display>
-  <Edit>DocumentLibraryForm</Edit>
-  <New>DocumentLibraryForm</New>
-</FormTemplates>
+<p:properties xmlns:p="http://schemas.microsoft.com/office/2006/metadata/properties" xmlns:xsi="http://www.w3.org/2001/XMLSchema-instance" xmlns:pc="http://schemas.microsoft.com/office/infopath/2007/PartnerControls">
+  <documentManagement>
+    <_activity xmlns="0dcbab57-ce0d-48ec-9006-afbf43b82b42" xsi:nil="true"/>
+  </documentManagement>
+</p:properties>
 </file>
 
 <file path=customXml/itemProps1.xml><?xml version="1.0" encoding="utf-8"?>
-<ds:datastoreItem xmlns:ds="http://schemas.openxmlformats.org/officeDocument/2006/customXml" ds:itemID="{7D23386E-842B-4B42-9D04-7B63869B43F9}">
+<ds:datastoreItem xmlns:ds="http://schemas.openxmlformats.org/officeDocument/2006/customXml" ds:itemID="{ACF3336E-B009-4268-AFDE-A53C75438088}">
   <ds:schemaRefs>
-    <ds:schemaRef ds:uri="http://schemas.microsoft.com/office/2006/metadata/properties"/>
-    <ds:schemaRef ds:uri="http://schemas.microsoft.com/office/infopath/2007/PartnerControls"/>
-    <ds:schemaRef ds:uri="0dcbab57-ce0d-48ec-9006-afbf43b82b42"/>
+    <ds:schemaRef ds:uri="http://schemas.microsoft.com/sharepoint/v3/contenttype/forms"/>
   </ds:schemaRefs>
 </ds:datastoreItem>
 </file>
@@ -5919,9 +6490,11 @@
 </file>
 
 <file path=customXml/itemProps3.xml><?xml version="1.0" encoding="utf-8"?>
-<ds:datastoreItem xmlns:ds="http://schemas.openxmlformats.org/officeDocument/2006/customXml" ds:itemID="{ACF3336E-B009-4268-AFDE-A53C75438088}">
+<ds:datastoreItem xmlns:ds="http://schemas.openxmlformats.org/officeDocument/2006/customXml" ds:itemID="{7D23386E-842B-4B42-9D04-7B63869B43F9}">
   <ds:schemaRefs>
-    <ds:schemaRef ds:uri="http://schemas.microsoft.com/sharepoint/v3/contenttype/forms"/>
+    <ds:schemaRef ds:uri="http://schemas.microsoft.com/office/2006/metadata/properties"/>
+    <ds:schemaRef ds:uri="http://schemas.microsoft.com/office/infopath/2007/PartnerControls"/>
+    <ds:schemaRef ds:uri="0dcbab57-ce0d-48ec-9006-afbf43b82b42"/>
   </ds:schemaRefs>
 </ds:datastoreItem>
 </file>
</xml_diff>

<commit_message>
doc(rapport) : avancer dans bilan et conception
</commit_message>
<xml_diff>
--- a/doc/H-P_ShootMeUp-pe84djb-Rapport.docx
+++ b/doc/H-P_ShootMeUp-pe84djb-Rapport.docx
@@ -308,7 +308,7 @@
           <w:r>
             <w:fldChar w:fldCharType="separate"/>
           </w:r>
-          <w:hyperlink w:anchor="_Toc242631062" w:history="1">
+          <w:hyperlink w:anchor="_Toc244282727" w:history="1">
             <w:r>
               <w:rPr>
                 <w:rStyle w:val="Lienhypertexte"/>
@@ -350,7 +350,7 @@
                 <w:noProof/>
                 <w:webHidden/>
               </w:rPr>
-              <w:instrText xml:space="preserve"> PAGEREF _Toc242631062 \h </w:instrText>
+              <w:instrText xml:space="preserve"> PAGEREF _Toc244282727 \h </w:instrText>
             </w:r>
             <w:r>
               <w:rPr>
@@ -393,7 +393,7 @@
               <w:lang w:eastAsia="fr-CH"/>
             </w:rPr>
           </w:pPr>
-          <w:hyperlink w:anchor="_Toc242631063" w:history="1">
+          <w:hyperlink w:anchor="_Toc244282728" w:history="1">
             <w:r>
               <w:rPr>
                 <w:rStyle w:val="Lienhypertexte"/>
@@ -420,7 +420,7 @@
                 <w:noProof/>
                 <w:webHidden/>
               </w:rPr>
-              <w:instrText xml:space="preserve"> PAGEREF _Toc242631063 \h </w:instrText>
+              <w:instrText xml:space="preserve"> PAGEREF _Toc244282728 \h </w:instrText>
             </w:r>
             <w:r>
               <w:rPr>
@@ -463,7 +463,7 @@
               <w:lang w:eastAsia="fr-CH"/>
             </w:rPr>
           </w:pPr>
-          <w:hyperlink w:anchor="_Toc242631064" w:history="1">
+          <w:hyperlink w:anchor="_Toc244282729" w:history="1">
             <w:r>
               <w:rPr>
                 <w:rStyle w:val="Lienhypertexte"/>
@@ -490,7 +490,7 @@
                 <w:noProof/>
                 <w:webHidden/>
               </w:rPr>
-              <w:instrText xml:space="preserve"> PAGEREF _Toc242631064 \h </w:instrText>
+              <w:instrText xml:space="preserve"> PAGEREF _Toc244282729 \h </w:instrText>
             </w:r>
             <w:r>
               <w:rPr>
@@ -534,7 +534,7 @@
               <w:lang w:eastAsia="fr-CH"/>
             </w:rPr>
           </w:pPr>
-          <w:hyperlink w:anchor="_Toc242631065" w:history="1">
+          <w:hyperlink w:anchor="_Toc244282730" w:history="1">
             <w:r>
               <w:rPr>
                 <w:rStyle w:val="Lienhypertexte"/>
@@ -576,7 +576,7 @@
                 <w:noProof/>
                 <w:webHidden/>
               </w:rPr>
-              <w:instrText xml:space="preserve"> PAGEREF _Toc242631065 \h </w:instrText>
+              <w:instrText xml:space="preserve"> PAGEREF _Toc244282730 \h </w:instrText>
             </w:r>
             <w:r>
               <w:rPr>
@@ -620,7 +620,7 @@
               <w:lang w:eastAsia="fr-CH"/>
             </w:rPr>
           </w:pPr>
-          <w:hyperlink w:anchor="_Toc242631066" w:history="1">
+          <w:hyperlink w:anchor="_Toc244282731" w:history="1">
             <w:r>
               <w:rPr>
                 <w:rStyle w:val="Lienhypertexte"/>
@@ -662,7 +662,7 @@
                 <w:noProof/>
                 <w:webHidden/>
               </w:rPr>
-              <w:instrText xml:space="preserve"> PAGEREF _Toc242631066 \h </w:instrText>
+              <w:instrText xml:space="preserve"> PAGEREF _Toc244282731 \h </w:instrText>
             </w:r>
             <w:r>
               <w:rPr>
@@ -706,13 +706,13 @@
               <w:lang w:eastAsia="fr-CH"/>
             </w:rPr>
           </w:pPr>
-          <w:hyperlink w:anchor="_Toc242631067" w:history="1">
+          <w:hyperlink w:anchor="_Toc244282732" w:history="1">
             <w:r>
               <w:rPr>
                 <w:rStyle w:val="Lienhypertexte"/>
                 <w:noProof/>
               </w:rPr>
-              <w:t>3.</w:t>
+              <w:t>4.</w:t>
             </w:r>
             <w:r>
               <w:rPr>
@@ -748,7 +748,7 @@
                 <w:noProof/>
                 <w:webHidden/>
               </w:rPr>
-              <w:instrText xml:space="preserve"> PAGEREF _Toc242631067 \h </w:instrText>
+              <w:instrText xml:space="preserve"> PAGEREF _Toc244282732 \h </w:instrText>
             </w:r>
             <w:r>
               <w:rPr>
@@ -792,13 +792,13 @@
               <w:lang w:eastAsia="fr-CH"/>
             </w:rPr>
           </w:pPr>
-          <w:hyperlink w:anchor="_Toc242631068" w:history="1">
+          <w:hyperlink w:anchor="_Toc244282733" w:history="1">
             <w:r>
               <w:rPr>
                 <w:rStyle w:val="Lienhypertexte"/>
                 <w:noProof/>
               </w:rPr>
-              <w:t>4.</w:t>
+              <w:t>5.</w:t>
             </w:r>
             <w:r>
               <w:rPr>
@@ -834,7 +834,7 @@
                 <w:noProof/>
                 <w:webHidden/>
               </w:rPr>
-              <w:instrText xml:space="preserve"> PAGEREF _Toc242631068 \h </w:instrText>
+              <w:instrText xml:space="preserve"> PAGEREF _Toc244282733 \h </w:instrText>
             </w:r>
             <w:r>
               <w:rPr>
@@ -855,6 +855,76 @@
                 <w:webHidden/>
               </w:rPr>
               <w:t>5</w:t>
+            </w:r>
+            <w:r>
+              <w:rPr>
+                <w:noProof/>
+                <w:webHidden/>
+              </w:rPr>
+              <w:fldChar w:fldCharType="end"/>
+            </w:r>
+          </w:hyperlink>
+        </w:p>
+        <w:p>
+          <w:pPr>
+            <w:pStyle w:val="TM3"/>
+            <w:tabs>
+              <w:tab w:val="right" w:leader="dot" w:pos="9062"/>
+            </w:tabs>
+            <w:rPr>
+              <w:rFonts w:eastAsiaTheme="minorEastAsia"/>
+              <w:noProof/>
+              <w:lang w:eastAsia="fr-CH"/>
+            </w:rPr>
+          </w:pPr>
+          <w:hyperlink w:anchor="_Toc244282734" w:history="1">
+            <w:r>
+              <w:rPr>
+                <w:rStyle w:val="Lienhypertexte"/>
+                <w:noProof/>
+              </w:rPr>
+              <w:t>Exemples d’utilisations type :</w:t>
+            </w:r>
+            <w:r>
+              <w:rPr>
+                <w:noProof/>
+                <w:webHidden/>
+              </w:rPr>
+              <w:tab/>
+            </w:r>
+            <w:r>
+              <w:rPr>
+                <w:noProof/>
+                <w:webHidden/>
+              </w:rPr>
+              <w:fldChar w:fldCharType="begin"/>
+            </w:r>
+            <w:r>
+              <w:rPr>
+                <w:noProof/>
+                <w:webHidden/>
+              </w:rPr>
+              <w:instrText xml:space="preserve"> PAGEREF _Toc244282734 \h </w:instrText>
+            </w:r>
+            <w:r>
+              <w:rPr>
+                <w:noProof/>
+                <w:webHidden/>
+              </w:rPr>
+            </w:r>
+            <w:r>
+              <w:rPr>
+                <w:noProof/>
+                <w:webHidden/>
+              </w:rPr>
+              <w:fldChar w:fldCharType="separate"/>
+            </w:r>
+            <w:r>
+              <w:rPr>
+                <w:noProof/>
+                <w:webHidden/>
+              </w:rPr>
+              <w:t>6</w:t>
             </w:r>
             <w:r>
               <w:rPr>
@@ -878,13 +948,13 @@
               <w:lang w:eastAsia="fr-CH"/>
             </w:rPr>
           </w:pPr>
-          <w:hyperlink w:anchor="_Toc242631069" w:history="1">
+          <w:hyperlink w:anchor="_Toc244282735" w:history="1">
             <w:r>
               <w:rPr>
                 <w:rStyle w:val="Lienhypertexte"/>
                 <w:noProof/>
               </w:rPr>
-              <w:t>5.</w:t>
+              <w:t>6.</w:t>
             </w:r>
             <w:r>
               <w:rPr>
@@ -920,7 +990,7 @@
                 <w:noProof/>
                 <w:webHidden/>
               </w:rPr>
-              <w:instrText xml:space="preserve"> PAGEREF _Toc242631069 \h </w:instrText>
+              <w:instrText xml:space="preserve"> PAGEREF _Toc244282735 \h </w:instrText>
             </w:r>
             <w:r>
               <w:rPr>
@@ -940,7 +1010,7 @@
                 <w:noProof/>
                 <w:webHidden/>
               </w:rPr>
-              <w:t>5</w:t>
+              <w:t>7</w:t>
             </w:r>
             <w:r>
               <w:rPr>
@@ -964,13 +1034,13 @@
               <w:lang w:eastAsia="fr-CH"/>
             </w:rPr>
           </w:pPr>
-          <w:hyperlink w:anchor="_Toc242631070" w:history="1">
+          <w:hyperlink w:anchor="_Toc244282736" w:history="1">
             <w:r>
               <w:rPr>
                 <w:rStyle w:val="Lienhypertexte"/>
                 <w:noProof/>
               </w:rPr>
-              <w:t>6.</w:t>
+              <w:t>7.</w:t>
             </w:r>
             <w:r>
               <w:rPr>
@@ -1006,7 +1076,7 @@
                 <w:noProof/>
                 <w:webHidden/>
               </w:rPr>
-              <w:instrText xml:space="preserve"> PAGEREF _Toc242631070 \h </w:instrText>
+              <w:instrText xml:space="preserve"> PAGEREF _Toc244282736 \h </w:instrText>
             </w:r>
             <w:r>
               <w:rPr>
@@ -1026,7 +1096,147 @@
                 <w:noProof/>
                 <w:webHidden/>
               </w:rPr>
-              <w:t>5</w:t>
+              <w:t>7</w:t>
+            </w:r>
+            <w:r>
+              <w:rPr>
+                <w:noProof/>
+                <w:webHidden/>
+              </w:rPr>
+              <w:fldChar w:fldCharType="end"/>
+            </w:r>
+          </w:hyperlink>
+        </w:p>
+        <w:p>
+          <w:pPr>
+            <w:pStyle w:val="TM2"/>
+            <w:tabs>
+              <w:tab w:val="right" w:leader="dot" w:pos="9062"/>
+            </w:tabs>
+            <w:rPr>
+              <w:rFonts w:eastAsiaTheme="minorEastAsia"/>
+              <w:noProof/>
+              <w:lang w:eastAsia="fr-CH"/>
+            </w:rPr>
+          </w:pPr>
+          <w:hyperlink w:anchor="_Toc244282737" w:history="1">
+            <w:r>
+              <w:rPr>
+                <w:rStyle w:val="Lienhypertexte"/>
+                <w:noProof/>
+              </w:rPr>
+              <w:t>Bilan 80% :</w:t>
+            </w:r>
+            <w:r>
+              <w:rPr>
+                <w:noProof/>
+                <w:webHidden/>
+              </w:rPr>
+              <w:tab/>
+            </w:r>
+            <w:r>
+              <w:rPr>
+                <w:noProof/>
+                <w:webHidden/>
+              </w:rPr>
+              <w:fldChar w:fldCharType="begin"/>
+            </w:r>
+            <w:r>
+              <w:rPr>
+                <w:noProof/>
+                <w:webHidden/>
+              </w:rPr>
+              <w:instrText xml:space="preserve"> PAGEREF _Toc244282737 \h </w:instrText>
+            </w:r>
+            <w:r>
+              <w:rPr>
+                <w:noProof/>
+                <w:webHidden/>
+              </w:rPr>
+            </w:r>
+            <w:r>
+              <w:rPr>
+                <w:noProof/>
+                <w:webHidden/>
+              </w:rPr>
+              <w:fldChar w:fldCharType="separate"/>
+            </w:r>
+            <w:r>
+              <w:rPr>
+                <w:noProof/>
+                <w:webHidden/>
+              </w:rPr>
+              <w:t>7</w:t>
+            </w:r>
+            <w:r>
+              <w:rPr>
+                <w:noProof/>
+                <w:webHidden/>
+              </w:rPr>
+              <w:fldChar w:fldCharType="end"/>
+            </w:r>
+          </w:hyperlink>
+        </w:p>
+        <w:p>
+          <w:pPr>
+            <w:pStyle w:val="TM2"/>
+            <w:tabs>
+              <w:tab w:val="right" w:leader="dot" w:pos="9062"/>
+            </w:tabs>
+            <w:rPr>
+              <w:rFonts w:eastAsiaTheme="minorEastAsia"/>
+              <w:noProof/>
+              <w:lang w:eastAsia="fr-CH"/>
+            </w:rPr>
+          </w:pPr>
+          <w:hyperlink w:anchor="_Toc244282738" w:history="1">
+            <w:r>
+              <w:rPr>
+                <w:rStyle w:val="Lienhypertexte"/>
+                <w:noProof/>
+              </w:rPr>
+              <w:t>Bilan final</w:t>
+            </w:r>
+            <w:r>
+              <w:rPr>
+                <w:noProof/>
+                <w:webHidden/>
+              </w:rPr>
+              <w:tab/>
+            </w:r>
+            <w:r>
+              <w:rPr>
+                <w:noProof/>
+                <w:webHidden/>
+              </w:rPr>
+              <w:fldChar w:fldCharType="begin"/>
+            </w:r>
+            <w:r>
+              <w:rPr>
+                <w:noProof/>
+                <w:webHidden/>
+              </w:rPr>
+              <w:instrText xml:space="preserve"> PAGEREF _Toc244282738 \h </w:instrText>
+            </w:r>
+            <w:r>
+              <w:rPr>
+                <w:noProof/>
+                <w:webHidden/>
+              </w:rPr>
+            </w:r>
+            <w:r>
+              <w:rPr>
+                <w:noProof/>
+                <w:webHidden/>
+              </w:rPr>
+              <w:fldChar w:fldCharType="separate"/>
+            </w:r>
+            <w:r>
+              <w:rPr>
+                <w:noProof/>
+                <w:webHidden/>
+              </w:rPr>
+              <w:t>8</w:t>
             </w:r>
             <w:r>
               <w:rPr>
@@ -1050,13 +1260,13 @@
               <w:lang w:eastAsia="fr-CH"/>
             </w:rPr>
           </w:pPr>
-          <w:hyperlink w:anchor="_Toc242631071" w:history="1">
+          <w:hyperlink w:anchor="_Toc244282739" w:history="1">
             <w:r>
               <w:rPr>
                 <w:rStyle w:val="Lienhypertexte"/>
                 <w:noProof/>
               </w:rPr>
-              <w:t>7.</w:t>
+              <w:t>5.</w:t>
             </w:r>
             <w:r>
               <w:rPr>
@@ -1092,7 +1302,7 @@
                 <w:noProof/>
                 <w:webHidden/>
               </w:rPr>
-              <w:instrText xml:space="preserve"> PAGEREF _Toc242631071 \h </w:instrText>
+              <w:instrText xml:space="preserve"> PAGEREF _Toc244282739 \h </w:instrText>
             </w:r>
             <w:r>
               <w:rPr>
@@ -1112,7 +1322,7 @@
                 <w:noProof/>
                 <w:webHidden/>
               </w:rPr>
-              <w:t>5</w:t>
+              <w:t>8</w:t>
             </w:r>
             <w:r>
               <w:rPr>
@@ -1136,13 +1346,13 @@
               <w:lang w:eastAsia="fr-CH"/>
             </w:rPr>
           </w:pPr>
-          <w:hyperlink w:anchor="_Toc242631072" w:history="1">
+          <w:hyperlink w:anchor="_Toc244282740" w:history="1">
             <w:r>
               <w:rPr>
                 <w:rStyle w:val="Lienhypertexte"/>
                 <w:noProof/>
               </w:rPr>
-              <w:t>8.</w:t>
+              <w:t>6.</w:t>
             </w:r>
             <w:r>
               <w:rPr>
@@ -1178,7 +1388,7 @@
                 <w:noProof/>
                 <w:webHidden/>
               </w:rPr>
-              <w:instrText xml:space="preserve"> PAGEREF _Toc242631072 \h </w:instrText>
+              <w:instrText xml:space="preserve"> PAGEREF _Toc244282740 \h </w:instrText>
             </w:r>
             <w:r>
               <w:rPr>
@@ -1198,7 +1408,7 @@
                 <w:noProof/>
                 <w:webHidden/>
               </w:rPr>
-              <w:t>5</w:t>
+              <w:t>8</w:t>
             </w:r>
             <w:r>
               <w:rPr>
@@ -1221,7 +1431,7 @@
               <w:lang w:eastAsia="fr-CH"/>
             </w:rPr>
           </w:pPr>
-          <w:hyperlink w:anchor="_Toc242631073" w:history="1">
+          <w:hyperlink w:anchor="_Toc244282741" w:history="1">
             <w:r>
               <w:rPr>
                 <w:rStyle w:val="Lienhypertexte"/>
@@ -1248,7 +1458,7 @@
                 <w:noProof/>
                 <w:webHidden/>
               </w:rPr>
-              <w:instrText xml:space="preserve"> PAGEREF _Toc242631073 \h </w:instrText>
+              <w:instrText xml:space="preserve"> PAGEREF _Toc244282741 \h </w:instrText>
             </w:r>
             <w:r>
               <w:rPr>
@@ -1268,7 +1478,7 @@
                 <w:noProof/>
                 <w:webHidden/>
               </w:rPr>
-              <w:t>5</w:t>
+              <w:t>8</w:t>
             </w:r>
             <w:r>
               <w:rPr>
@@ -1312,7 +1522,7 @@
           <w:numId w:val="13"/>
         </w:numPr>
       </w:pPr>
-      <w:bookmarkStart w:id="0" w:name="_Toc242631062"/>
+      <w:bookmarkStart w:id="0" w:name="_Toc244282727"/>
       <w:r>
         <w:lastRenderedPageBreak/>
         <w:t>INTRODUCTION</w:t>
@@ -1323,7 +1533,7 @@
       <w:pPr>
         <w:pStyle w:val="Titre2"/>
       </w:pPr>
-      <w:bookmarkStart w:id="1" w:name="_Toc242631063"/>
+      <w:bookmarkStart w:id="1" w:name="_Toc244282728"/>
       <w:r>
         <w:t>Objectifs produit</w:t>
       </w:r>
@@ -1533,7 +1743,7 @@
       <w:pPr>
         <w:pStyle w:val="Titre2"/>
       </w:pPr>
-      <w:bookmarkStart w:id="2" w:name="_Toc242631064"/>
+      <w:bookmarkStart w:id="2" w:name="_Toc244282729"/>
       <w:r>
         <w:t>Objectifs pédagogiques</w:t>
       </w:r>
@@ -1630,7 +1840,7 @@
           <w:numId w:val="13"/>
         </w:numPr>
       </w:pPr>
-      <w:bookmarkStart w:id="3" w:name="_Toc242631065"/>
+      <w:bookmarkStart w:id="3" w:name="_Toc244282730"/>
       <w:r>
         <w:t>PLANIFICATION</w:t>
       </w:r>
@@ -2180,7 +2390,7 @@
           <w:numId w:val="13"/>
         </w:numPr>
       </w:pPr>
-      <w:bookmarkStart w:id="4" w:name="_Toc242631066"/>
+      <w:bookmarkStart w:id="4" w:name="_Toc244282731"/>
       <w:r>
         <w:t>RAPPORTS DE TESTS</w:t>
       </w:r>
@@ -2814,7 +3024,74 @@
           <w:numId w:val="13"/>
         </w:numPr>
       </w:pPr>
-      <w:bookmarkStart w:id="5" w:name="_Toc242631067"/>
+      <w:bookmarkStart w:id="5" w:name="_Toc244282732"/>
+      <w:r>
+        <w:rPr>
+          <w:noProof/>
+        </w:rPr>
+        <w:drawing>
+          <wp:anchor distT="0" distB="0" distL="114300" distR="114300" simplePos="0" relativeHeight="251662336" behindDoc="0" locked="0" layoutInCell="1" allowOverlap="1" wp14:anchorId="41D527AC" wp14:editId="69F67435">
+            <wp:simplePos x="0" y="0"/>
+            <wp:positionH relativeFrom="margin">
+              <wp:posOffset>-370840</wp:posOffset>
+            </wp:positionH>
+            <wp:positionV relativeFrom="paragraph">
+              <wp:posOffset>507365</wp:posOffset>
+            </wp:positionV>
+            <wp:extent cx="6506210" cy="2502535"/>
+            <wp:effectExtent l="0" t="0" r="8890" b="0"/>
+            <wp:wrapTopAndBottom/>
+            <wp:docPr id="1375671895" name="Image 3"/>
+            <wp:cNvGraphicFramePr>
+              <a:graphicFrameLocks xmlns:a="http://schemas.openxmlformats.org/drawingml/2006/main" noChangeAspect="1"/>
+            </wp:cNvGraphicFramePr>
+            <a:graphic xmlns:a="http://schemas.openxmlformats.org/drawingml/2006/main">
+              <a:graphicData uri="http://schemas.openxmlformats.org/drawingml/2006/picture">
+                <pic:pic xmlns:pic="http://schemas.openxmlformats.org/drawingml/2006/picture">
+                  <pic:nvPicPr>
+                    <pic:cNvPr id="0" name="Picture 8"/>
+                    <pic:cNvPicPr>
+                      <a:picLocks noChangeAspect="1" noChangeArrowheads="1"/>
+                    </pic:cNvPicPr>
+                  </pic:nvPicPr>
+                  <pic:blipFill>
+                    <a:blip r:embed="rId11" cstate="print">
+                      <a:extLst>
+                        <a:ext uri="{28A0092B-C50C-407E-A947-70E740481C1C}">
+                          <a14:useLocalDpi xmlns:a14="http://schemas.microsoft.com/office/drawing/2010/main" val="0"/>
+                        </a:ext>
+                      </a:extLst>
+                    </a:blip>
+                    <a:srcRect/>
+                    <a:stretch>
+                      <a:fillRect/>
+                    </a:stretch>
+                  </pic:blipFill>
+                  <pic:spPr bwMode="auto">
+                    <a:xfrm>
+                      <a:off x="0" y="0"/>
+                      <a:ext cx="6506210" cy="2502535"/>
+                    </a:xfrm>
+                    <a:prstGeom prst="rect">
+                      <a:avLst/>
+                    </a:prstGeom>
+                    <a:noFill/>
+                    <a:ln>
+                      <a:noFill/>
+                    </a:ln>
+                  </pic:spPr>
+                </pic:pic>
+              </a:graphicData>
+            </a:graphic>
+            <wp14:sizeRelH relativeFrom="margin">
+              <wp14:pctWidth>0</wp14:pctWidth>
+            </wp14:sizeRelH>
+            <wp14:sizeRelV relativeFrom="margin">
+              <wp14:pctHeight>0</wp14:pctHeight>
+            </wp14:sizeRelV>
+          </wp:anchor>
+        </w:drawing>
+      </w:r>
       <w:r>
         <w:t>CONCEPTIO</w:t>
       </w:r>
@@ -2823,6 +3100,7 @@
       </w:r>
       <w:bookmarkEnd w:id="5"/>
     </w:p>
+    <w:p/>
     <w:p>
       <w:pPr>
         <w:pStyle w:val="Titre1"/>
@@ -2831,8 +3109,9 @@
           <w:numId w:val="13"/>
         </w:numPr>
       </w:pPr>
-      <w:bookmarkStart w:id="6" w:name="_Toc242631068"/>
-      <w:r>
+      <w:bookmarkStart w:id="6" w:name="_Toc244282733"/>
+      <w:r>
+        <w:lastRenderedPageBreak/>
         <w:t>UTILISATION DE L’IA</w:t>
       </w:r>
       <w:bookmarkEnd w:id="6"/>
@@ -2912,11 +3191,7 @@
         <w:t xml:space="preserve"> que je voulais faire bouger en file sur des axes prédéfinis</w:t>
       </w:r>
       <w:r>
-        <w:t xml:space="preserve">, ce qui s’est avéré </w:t>
-      </w:r>
-      <w:r>
-        <w:lastRenderedPageBreak/>
-        <w:t>trop</w:t>
+        <w:t>, ce qui s’est avéré trop</w:t>
       </w:r>
       <w:r>
         <w:t xml:space="preserve"> compliqué et long</w:t>
@@ -2993,9 +3268,11 @@
       <w:pPr>
         <w:pStyle w:val="Titre3"/>
       </w:pPr>
+      <w:bookmarkStart w:id="7" w:name="_Toc244282734"/>
       <w:r>
         <w:t>Exemples d’utilisations type :</w:t>
       </w:r>
+      <w:bookmarkEnd w:id="7"/>
     </w:p>
     <w:p>
       <w:proofErr w:type="gramStart"/>
@@ -3134,7 +3411,7 @@
     <w:p>
       <w:r>
         <w:pict w14:anchorId="31FAEBCE">
-          <v:rect id="_x0000_i1037" style="width:0;height:0" o:hralign="center" o:hrstd="t" o:hr="t" fillcolor="#a0a0a0" stroked="f"/>
+          <v:rect id="_x0000_i1025" style="width:0;height:0" o:hralign="center" o:hrstd="t" o:hr="t" fillcolor="#a0a0a0" stroked="f"/>
         </w:pict>
       </w:r>
     </w:p>
@@ -3175,6 +3452,7 @@
     </w:p>
     <w:p>
       <w:r>
+        <w:lastRenderedPageBreak/>
         <w:t xml:space="preserve">  </w:t>
       </w:r>
       <w:r>
@@ -3323,7 +3601,7 @@
     <w:p>
       <w:r>
         <w:pict w14:anchorId="02350AB7">
-          <v:rect id="_x0000_i1038" style="width:0;height:0" o:hralign="center" o:hrstd="t" o:hr="t" fillcolor="#a0a0a0" stroked="f"/>
+          <v:rect id="_x0000_i1026" style="width:0;height:0" o:hralign="center" o:hrstd="t" o:hr="t" fillcolor="#a0a0a0" stroked="f"/>
         </w:pict>
       </w:r>
     </w:p>
@@ -3363,11 +3641,11 @@
           <w:numId w:val="13"/>
         </w:numPr>
       </w:pPr>
-      <w:bookmarkStart w:id="7" w:name="_Toc242631069"/>
+      <w:bookmarkStart w:id="8" w:name="_Toc244282735"/>
       <w:r>
         <w:t>DEROULEMENT DU PROJET</w:t>
       </w:r>
-      <w:bookmarkEnd w:id="7"/>
+      <w:bookmarkEnd w:id="8"/>
     </w:p>
     <w:p>
       <w:pPr>
@@ -3401,7 +3679,18 @@
     </w:p>
     <w:p>
       <w:r>
-        <w:t>Ainsi, j’ai ajouté les obstacles bien avant les ennemis car ils me semblaient plus abordables, et ait avancé bien moins vite que prévu.</w:t>
+        <w:t>Ainsi, j’ai ajouté les obstacles bien avant les ennemis car ils me semblaient plus abordables, et ait avancé bien moins vite que prévu</w:t>
+      </w:r>
+      <w:r>
+        <w:t xml:space="preserve"> </w:t>
+      </w:r>
+      <w:proofErr w:type="gramStart"/>
+      <w:r>
+        <w:t>au final</w:t>
+      </w:r>
+      <w:proofErr w:type="gramEnd"/>
+      <w:r>
+        <w:t>.</w:t>
       </w:r>
     </w:p>
     <w:p>
@@ -3489,12 +3778,12 @@
           <w:numId w:val="13"/>
         </w:numPr>
       </w:pPr>
-      <w:bookmarkStart w:id="8" w:name="_Toc242631070"/>
+      <w:bookmarkStart w:id="9" w:name="_Toc244282736"/>
       <w:r>
         <w:lastRenderedPageBreak/>
         <w:t>BILAN PRODUIT</w:t>
       </w:r>
-      <w:bookmarkEnd w:id="8"/>
+      <w:bookmarkEnd w:id="9"/>
     </w:p>
     <w:p>
       <w:pPr>
@@ -3503,6 +3792,7 @@
           <w:noProof/>
         </w:rPr>
       </w:pPr>
+      <w:bookmarkStart w:id="10" w:name="_Toc244282737"/>
       <w:r>
         <w:t>Bilan</w:t>
       </w:r>
@@ -3512,6 +3802,7 @@
       <w:r>
         <w:t>80% :</w:t>
       </w:r>
+      <w:bookmarkEnd w:id="10"/>
       <w:r>
         <w:rPr>
           <w:noProof/>
@@ -3525,7 +3816,7 @@
           <w:noProof/>
         </w:rPr>
         <w:drawing>
-          <wp:inline distT="0" distB="0" distL="0" distR="0" wp14:anchorId="3A1AE593" wp14:editId="3971B04D">
+          <wp:inline distT="0" distB="0" distL="0" distR="0" wp14:anchorId="3A1AE593" wp14:editId="17078276">
             <wp:extent cx="5760720" cy="2395220"/>
             <wp:effectExtent l="0" t="0" r="0" b="5080"/>
             <wp:docPr id="440935663" name="Image 1"/>
@@ -3540,7 +3831,7 @@
                     <pic:cNvPicPr/>
                   </pic:nvPicPr>
                   <pic:blipFill>
-                    <a:blip r:embed="rId11" cstate="print">
+                    <a:blip r:embed="rId12" cstate="print">
                       <a:extLst>
                         <a:ext uri="{28A0092B-C50C-407E-A947-70E740481C1C}">
                           <a14:useLocalDpi xmlns:a14="http://schemas.microsoft.com/office/drawing/2010/main" val="0"/>
@@ -3585,7 +3876,7 @@
     </w:p>
     <w:p>
       <w:r>
-        <w:t>J’admets qu’en termes d’avancée, je suis en retrait. Cependant, les user stories qui restent ont le bénéfice de n’apporter rien de nouveau (à part le fond), et me causent moins d’inquiétudes que les problèmes</w:t>
+        <w:t>J’admets qu’en termes d’avancée, je suis en retrait. Cependant, les user stories qui restent ont le bénéfice de n’apporter rien de nouveau, et me causent moins d’inquiétudes que les problèmes</w:t>
       </w:r>
       <w:r>
         <w:t xml:space="preserve"> dans </w:t>
@@ -3638,11 +3929,260 @@
       <w:pPr>
         <w:pStyle w:val="Titre2"/>
       </w:pPr>
-      <w:bookmarkStart w:id="9" w:name="_Toc242631071"/>
+      <w:bookmarkStart w:id="11" w:name="_Toc244282738"/>
       <w:r>
         <w:t>Bilan final</w:t>
       </w:r>
-    </w:p>
+      <w:bookmarkEnd w:id="11"/>
+    </w:p>
+    <w:p>
+      <w:r>
+        <w:drawing>
+          <wp:inline distT="0" distB="0" distL="0" distR="0" wp14:anchorId="711E6BC2" wp14:editId="01A668CB">
+            <wp:extent cx="5760720" cy="2679700"/>
+            <wp:effectExtent l="0" t="0" r="0" b="6350"/>
+            <wp:docPr id="883030116" name="Image 1"/>
+            <wp:cNvGraphicFramePr>
+              <a:graphicFrameLocks xmlns:a="http://schemas.openxmlformats.org/drawingml/2006/main" noChangeAspect="1"/>
+            </wp:cNvGraphicFramePr>
+            <a:graphic xmlns:a="http://schemas.openxmlformats.org/drawingml/2006/main">
+              <a:graphicData uri="http://schemas.openxmlformats.org/drawingml/2006/picture">
+                <pic:pic xmlns:pic="http://schemas.openxmlformats.org/drawingml/2006/picture">
+                  <pic:nvPicPr>
+                    <pic:cNvPr id="883030116" name=""/>
+                    <pic:cNvPicPr/>
+                  </pic:nvPicPr>
+                  <pic:blipFill>
+                    <a:blip r:embed="rId13"/>
+                    <a:stretch>
+                      <a:fillRect/>
+                    </a:stretch>
+                  </pic:blipFill>
+                  <pic:spPr>
+                    <a:xfrm>
+                      <a:off x="0" y="0"/>
+                      <a:ext cx="5760720" cy="2679700"/>
+                    </a:xfrm>
+                    <a:prstGeom prst="rect">
+                      <a:avLst/>
+                    </a:prstGeom>
+                  </pic:spPr>
+                </pic:pic>
+              </a:graphicData>
+            </a:graphic>
+          </wp:inline>
+        </w:drawing>
+      </w:r>
+    </w:p>
+    <w:p>
+      <w:r>
+        <w:t xml:space="preserve">Toutes les US sont </w:t>
+      </w:r>
+      <w:proofErr w:type="gramStart"/>
+      <w:r>
+        <w:t>terminées</w:t>
+      </w:r>
+      <w:proofErr w:type="gramEnd"/>
+      <w:r>
+        <w:t>, une objection par rapport aux mouvements ennemis serait valable étant donné qu’ils se superposent, se bloquent et se téléportent par moments</w:t>
+      </w:r>
+      <w:r>
+        <w:t>, ce qui compromet l’</w:t>
+      </w:r>
+      <w:r>
+        <w:t>expérience</w:t>
+      </w:r>
+      <w:r>
+        <w:t xml:space="preserve"> de jeu.</w:t>
+      </w:r>
+    </w:p>
+    <w:p>
+      <w:r>
+        <w:t xml:space="preserve">Cependant, l’US n’était pas suffisamment </w:t>
+      </w:r>
+      <w:proofErr w:type="gramStart"/>
+      <w:r>
+        <w:t>stricte</w:t>
+      </w:r>
+      <w:proofErr w:type="gramEnd"/>
+      <w:r>
+        <w:t xml:space="preserve"> pour l’exclure de la colonne Done étant donné que les critères sont acquis.</w:t>
+      </w:r>
+    </w:p>
+    <w:p>
+      <w:r>
+        <w:t>Les ennemis tirent également plus souvent, environ 1x/5sec chacun soit 2x/sec ensembles.</w:t>
+      </w:r>
+    </w:p>
+    <w:p>
+      <w:r>
+        <w:t xml:space="preserve">Les objectifs du </w:t>
+      </w:r>
+      <w:proofErr w:type="spellStart"/>
+      <w:r>
+        <w:t>cdc</w:t>
+      </w:r>
+      <w:proofErr w:type="spellEnd"/>
+      <w:r>
+        <w:t xml:space="preserve"> </w:t>
+      </w:r>
+      <w:r>
+        <w:t xml:space="preserve">sont tous </w:t>
+      </w:r>
+      <w:r>
+        <w:t>atteints :</w:t>
+      </w:r>
+    </w:p>
+    <w:tbl>
+      <w:tblPr>
+        <w:tblStyle w:val="Grilledutableau"/>
+        <w:tblW w:w="0" w:type="auto"/>
+        <w:tblLook w:val="04A0" w:firstRow="1" w:lastRow="0" w:firstColumn="1" w:lastColumn="0" w:noHBand="0" w:noVBand="1"/>
+      </w:tblPr>
+      <w:tblGrid>
+        <w:gridCol w:w="4531"/>
+        <w:gridCol w:w="4531"/>
+      </w:tblGrid>
+      <w:tr>
+        <w:tc>
+          <w:tcPr>
+            <w:tcW w:w="4531" w:type="dxa"/>
+          </w:tcPr>
+          <w:p>
+            <w:r>
+              <w:t>Au moins 5 obstacles infranchissables, peuvent être détruits.</w:t>
+            </w:r>
+          </w:p>
+        </w:tc>
+        <w:tc>
+          <w:tcPr>
+            <w:tcW w:w="4531" w:type="dxa"/>
+            <w:shd w:val="clear" w:color="auto" w:fill="4EA72E" w:themeFill="accent6"/>
+          </w:tcPr>
+          <w:p>
+            <w:r>
+              <w:t>Atteint</w:t>
+            </w:r>
+          </w:p>
+        </w:tc>
+      </w:tr>
+      <w:tr>
+        <w:tc>
+          <w:tcPr>
+            <w:tcW w:w="4531" w:type="dxa"/>
+          </w:tcPr>
+          <w:p>
+            <w:r>
+              <w:t>Déplacement du joueur avec les touches du clavier.</w:t>
+            </w:r>
+          </w:p>
+        </w:tc>
+        <w:tc>
+          <w:tcPr>
+            <w:tcW w:w="4531" w:type="dxa"/>
+            <w:shd w:val="clear" w:color="auto" w:fill="4EA72E" w:themeFill="accent6"/>
+          </w:tcPr>
+          <w:p>
+            <w:r>
+              <w:t>Atteint</w:t>
+            </w:r>
+          </w:p>
+        </w:tc>
+      </w:tr>
+      <w:tr>
+        <w:tc>
+          <w:tcPr>
+            <w:tcW w:w="4531" w:type="dxa"/>
+          </w:tcPr>
+          <w:p>
+            <w:r>
+              <w:t>Le joueur peut tirer.</w:t>
+            </w:r>
+          </w:p>
+        </w:tc>
+        <w:tc>
+          <w:tcPr>
+            <w:tcW w:w="4531" w:type="dxa"/>
+            <w:shd w:val="clear" w:color="auto" w:fill="4EA72E" w:themeFill="accent6"/>
+          </w:tcPr>
+          <w:p>
+            <w:r>
+              <w:t>Atteint</w:t>
+            </w:r>
+          </w:p>
+        </w:tc>
+      </w:tr>
+      <w:tr>
+        <w:tc>
+          <w:tcPr>
+            <w:tcW w:w="4531" w:type="dxa"/>
+          </w:tcPr>
+          <w:p>
+            <w:r>
+              <w:t>Au moins 10 ennemis dès le départ.</w:t>
+            </w:r>
+          </w:p>
+        </w:tc>
+        <w:tc>
+          <w:tcPr>
+            <w:tcW w:w="4531" w:type="dxa"/>
+            <w:shd w:val="clear" w:color="auto" w:fill="4EA72E" w:themeFill="accent6"/>
+          </w:tcPr>
+          <w:p>
+            <w:r>
+              <w:t>Atteint</w:t>
+            </w:r>
+          </w:p>
+        </w:tc>
+      </w:tr>
+      <w:tr>
+        <w:tc>
+          <w:tcPr>
+            <w:tcW w:w="4531" w:type="dxa"/>
+          </w:tcPr>
+          <w:p>
+            <w:r>
+              <w:t>Les ennemis tirent sur le joueur</w:t>
+            </w:r>
+          </w:p>
+        </w:tc>
+        <w:tc>
+          <w:tcPr>
+            <w:tcW w:w="4531" w:type="dxa"/>
+            <w:shd w:val="clear" w:color="auto" w:fill="4EA72E" w:themeFill="accent6"/>
+          </w:tcPr>
+          <w:p>
+            <w:r>
+              <w:t>Atteint</w:t>
+            </w:r>
+          </w:p>
+        </w:tc>
+      </w:tr>
+      <w:tr>
+        <w:tc>
+          <w:tcPr>
+            <w:tcW w:w="4531" w:type="dxa"/>
+          </w:tcPr>
+          <w:p>
+            <w:r>
+              <w:t>Score maintenu et affiché</w:t>
+            </w:r>
+          </w:p>
+        </w:tc>
+        <w:tc>
+          <w:tcPr>
+            <w:tcW w:w="4531" w:type="dxa"/>
+            <w:shd w:val="clear" w:color="auto" w:fill="4EA72E" w:themeFill="accent6"/>
+          </w:tcPr>
+          <w:p>
+            <w:r>
+              <w:t>Atteint</w:t>
+            </w:r>
+          </w:p>
+        </w:tc>
+      </w:tr>
+    </w:tbl>
+    <w:p/>
     <w:p>
       <w:pPr>
         <w:pStyle w:val="Titre1"/>
@@ -3651,10 +4191,46 @@
           <w:numId w:val="9"/>
         </w:numPr>
       </w:pPr>
+      <w:bookmarkStart w:id="12" w:name="_Toc244282739"/>
       <w:r>
         <w:t>CONCLUSION</w:t>
       </w:r>
-      <w:bookmarkEnd w:id="9"/>
+      <w:bookmarkEnd w:id="12"/>
+    </w:p>
+    <w:p>
+      <w:pPr>
+        <w:pStyle w:val="Titre2"/>
+      </w:pPr>
+      <w:r>
+        <w:t xml:space="preserve">Apprentissages : </w:t>
+      </w:r>
+    </w:p>
+    <w:p>
+      <w:r>
+        <w:t>Pendant ce projet, en parallèle au module, j’ai assimilé beaucoup de connaissance par rapport à la programmation orientée objet, étant donné que je n’</w:t>
+      </w:r>
+      <w:r>
+        <w:t>avais</w:t>
+      </w:r>
+      <w:r>
+        <w:t xml:space="preserve"> que des bases d’algorithmique </w:t>
+      </w:r>
+      <w:proofErr w:type="gramStart"/>
+      <w:r>
+        <w:t>suite au</w:t>
+      </w:r>
+      <w:proofErr w:type="gramEnd"/>
+      <w:r>
+        <w:t xml:space="preserve"> module 293.</w:t>
+      </w:r>
+    </w:p>
+    <w:p>
+      <w:r>
+        <w:t>Les notions de classes, objets, tests unitaires</w:t>
+      </w:r>
+      <w:r>
+        <w:t>, etc… étaient toutes nouvelles.</w:t>
+      </w:r>
     </w:p>
     <w:p>
       <w:pPr>
@@ -3664,27 +4240,27 @@
           <w:numId w:val="9"/>
         </w:numPr>
       </w:pPr>
-      <w:bookmarkStart w:id="10" w:name="_Toc242631072"/>
+      <w:bookmarkStart w:id="13" w:name="_Toc244282740"/>
       <w:r>
         <w:t>ANNEXE</w:t>
       </w:r>
-      <w:bookmarkEnd w:id="10"/>
+      <w:bookmarkEnd w:id="13"/>
     </w:p>
     <w:p>
       <w:pPr>
         <w:pStyle w:val="Titre2"/>
       </w:pPr>
-      <w:bookmarkStart w:id="11" w:name="_Toc242631073"/>
+      <w:bookmarkStart w:id="14" w:name="_Toc244282741"/>
       <w:r>
         <w:t>Liens en version texte :</w:t>
       </w:r>
-      <w:bookmarkEnd w:id="11"/>
+      <w:bookmarkEnd w:id="14"/>
       <w:r>
         <w:t xml:space="preserve"> </w:t>
       </w:r>
     </w:p>
     <w:p>
-      <w:hyperlink r:id="rId12" w:history="1">
+      <w:hyperlink r:id="rId14" w:history="1">
         <w:r>
           <w:rPr>
             <w:rStyle w:val="Lienhypertexte"/>
@@ -3694,7 +4270,7 @@
       </w:hyperlink>
     </w:p>
     <w:p>
-      <w:hyperlink r:id="rId13" w:history="1">
+      <w:hyperlink r:id="rId15" w:history="1">
         <w:r>
           <w:rPr>
             <w:rStyle w:val="Lienhypertexte"/>
@@ -3984,6 +4560,119 @@
     </w:lvl>
   </w:abstractNum>
   <w:abstractNum w:abstractNumId="3" w15:restartNumberingAfterBreak="0">
+    <w:nsid w:val="27DD7BE4"/>
+    <w:multiLevelType w:val="hybridMultilevel"/>
+    <w:tmpl w:val="78C4983E"/>
+    <w:lvl w:ilvl="0" w:tplc="100C0001">
+      <w:start w:val="1"/>
+      <w:numFmt w:val="bullet"/>
+      <w:lvlText w:val=""/>
+      <w:lvlJc w:val="left"/>
+      <w:pPr>
+        <w:ind w:left="720" w:hanging="360"/>
+      </w:pPr>
+      <w:rPr>
+        <w:rFonts w:ascii="Symbol" w:hAnsi="Symbol" w:hint="default"/>
+      </w:rPr>
+    </w:lvl>
+    <w:lvl w:ilvl="1" w:tplc="100C0003" w:tentative="1">
+      <w:start w:val="1"/>
+      <w:numFmt w:val="bullet"/>
+      <w:lvlText w:val="o"/>
+      <w:lvlJc w:val="left"/>
+      <w:pPr>
+        <w:ind w:left="1440" w:hanging="360"/>
+      </w:pPr>
+      <w:rPr>
+        <w:rFonts w:ascii="Courier New" w:hAnsi="Courier New" w:cs="Courier New" w:hint="default"/>
+      </w:rPr>
+    </w:lvl>
+    <w:lvl w:ilvl="2" w:tplc="100C0005" w:tentative="1">
+      <w:start w:val="1"/>
+      <w:numFmt w:val="bullet"/>
+      <w:lvlText w:val=""/>
+      <w:lvlJc w:val="left"/>
+      <w:pPr>
+        <w:ind w:left="2160" w:hanging="360"/>
+      </w:pPr>
+      <w:rPr>
+        <w:rFonts w:ascii="Wingdings" w:hAnsi="Wingdings" w:hint="default"/>
+      </w:rPr>
+    </w:lvl>
+    <w:lvl w:ilvl="3" w:tplc="100C0001" w:tentative="1">
+      <w:start w:val="1"/>
+      <w:numFmt w:val="bullet"/>
+      <w:lvlText w:val=""/>
+      <w:lvlJc w:val="left"/>
+      <w:pPr>
+        <w:ind w:left="2880" w:hanging="360"/>
+      </w:pPr>
+      <w:rPr>
+        <w:rFonts w:ascii="Symbol" w:hAnsi="Symbol" w:hint="default"/>
+      </w:rPr>
+    </w:lvl>
+    <w:lvl w:ilvl="4" w:tplc="100C0003" w:tentative="1">
+      <w:start w:val="1"/>
+      <w:numFmt w:val="bullet"/>
+      <w:lvlText w:val="o"/>
+      <w:lvlJc w:val="left"/>
+      <w:pPr>
+        <w:ind w:left="3600" w:hanging="360"/>
+      </w:pPr>
+      <w:rPr>
+        <w:rFonts w:ascii="Courier New" w:hAnsi="Courier New" w:cs="Courier New" w:hint="default"/>
+      </w:rPr>
+    </w:lvl>
+    <w:lvl w:ilvl="5" w:tplc="100C0005" w:tentative="1">
+      <w:start w:val="1"/>
+      <w:numFmt w:val="bullet"/>
+      <w:lvlText w:val=""/>
+      <w:lvlJc w:val="left"/>
+      <w:pPr>
+        <w:ind w:left="4320" w:hanging="360"/>
+      </w:pPr>
+      <w:rPr>
+        <w:rFonts w:ascii="Wingdings" w:hAnsi="Wingdings" w:hint="default"/>
+      </w:rPr>
+    </w:lvl>
+    <w:lvl w:ilvl="6" w:tplc="100C0001" w:tentative="1">
+      <w:start w:val="1"/>
+      <w:numFmt w:val="bullet"/>
+      <w:lvlText w:val=""/>
+      <w:lvlJc w:val="left"/>
+      <w:pPr>
+        <w:ind w:left="5040" w:hanging="360"/>
+      </w:pPr>
+      <w:rPr>
+        <w:rFonts w:ascii="Symbol" w:hAnsi="Symbol" w:hint="default"/>
+      </w:rPr>
+    </w:lvl>
+    <w:lvl w:ilvl="7" w:tplc="100C0003" w:tentative="1">
+      <w:start w:val="1"/>
+      <w:numFmt w:val="bullet"/>
+      <w:lvlText w:val="o"/>
+      <w:lvlJc w:val="left"/>
+      <w:pPr>
+        <w:ind w:left="5760" w:hanging="360"/>
+      </w:pPr>
+      <w:rPr>
+        <w:rFonts w:ascii="Courier New" w:hAnsi="Courier New" w:cs="Courier New" w:hint="default"/>
+      </w:rPr>
+    </w:lvl>
+    <w:lvl w:ilvl="8" w:tplc="100C0005" w:tentative="1">
+      <w:start w:val="1"/>
+      <w:numFmt w:val="bullet"/>
+      <w:lvlText w:val=""/>
+      <w:lvlJc w:val="left"/>
+      <w:pPr>
+        <w:ind w:left="6480" w:hanging="360"/>
+      </w:pPr>
+      <w:rPr>
+        <w:rFonts w:ascii="Wingdings" w:hAnsi="Wingdings" w:hint="default"/>
+      </w:rPr>
+    </w:lvl>
+  </w:abstractNum>
+  <w:abstractNum w:abstractNumId="4" w15:restartNumberingAfterBreak="0">
     <w:nsid w:val="2B355836"/>
     <w:multiLevelType w:val="hybridMultilevel"/>
     <w:tmpl w:val="DC94C620"/>
@@ -4072,7 +4761,7 @@
       </w:pPr>
     </w:lvl>
   </w:abstractNum>
-  <w:abstractNum w:abstractNumId="4" w15:restartNumberingAfterBreak="0">
+  <w:abstractNum w:abstractNumId="5" w15:restartNumberingAfterBreak="0">
     <w:nsid w:val="34695AAE"/>
     <w:multiLevelType w:val="hybridMultilevel"/>
     <w:tmpl w:val="9B545082"/>
@@ -4158,7 +4847,7 @@
       </w:pPr>
     </w:lvl>
   </w:abstractNum>
-  <w:abstractNum w:abstractNumId="5" w15:restartNumberingAfterBreak="0">
+  <w:abstractNum w:abstractNumId="6" w15:restartNumberingAfterBreak="0">
     <w:nsid w:val="39AA5E9A"/>
     <w:multiLevelType w:val="hybridMultilevel"/>
     <w:tmpl w:val="8BFE0068"/>
@@ -4247,7 +4936,7 @@
       </w:pPr>
     </w:lvl>
   </w:abstractNum>
-  <w:abstractNum w:abstractNumId="6" w15:restartNumberingAfterBreak="0">
+  <w:abstractNum w:abstractNumId="7" w15:restartNumberingAfterBreak="0">
     <w:nsid w:val="3F973777"/>
     <w:multiLevelType w:val="hybridMultilevel"/>
     <w:tmpl w:val="8BFE0068"/>
@@ -4336,7 +5025,7 @@
       </w:pPr>
     </w:lvl>
   </w:abstractNum>
-  <w:abstractNum w:abstractNumId="7" w15:restartNumberingAfterBreak="0">
+  <w:abstractNum w:abstractNumId="8" w15:restartNumberingAfterBreak="0">
     <w:nsid w:val="42CF3970"/>
     <w:multiLevelType w:val="hybridMultilevel"/>
     <w:tmpl w:val="5D2E0E82"/>
@@ -4425,7 +5114,7 @@
       </w:pPr>
     </w:lvl>
   </w:abstractNum>
-  <w:abstractNum w:abstractNumId="8" w15:restartNumberingAfterBreak="0">
+  <w:abstractNum w:abstractNumId="9" w15:restartNumberingAfterBreak="0">
     <w:nsid w:val="5E4241B7"/>
     <w:multiLevelType w:val="multilevel"/>
     <w:tmpl w:val="100C001F"/>
@@ -4511,7 +5200,7 @@
       </w:pPr>
     </w:lvl>
   </w:abstractNum>
-  <w:abstractNum w:abstractNumId="9" w15:restartNumberingAfterBreak="0">
+  <w:abstractNum w:abstractNumId="10" w15:restartNumberingAfterBreak="0">
     <w:nsid w:val="60736E98"/>
     <w:multiLevelType w:val="hybridMultilevel"/>
     <w:tmpl w:val="F81A98B8"/>
@@ -4597,7 +5286,7 @@
       </w:pPr>
     </w:lvl>
   </w:abstractNum>
-  <w:abstractNum w:abstractNumId="10" w15:restartNumberingAfterBreak="0">
+  <w:abstractNum w:abstractNumId="11" w15:restartNumberingAfterBreak="0">
     <w:nsid w:val="6285458D"/>
     <w:multiLevelType w:val="hybridMultilevel"/>
     <w:tmpl w:val="926CB764"/>
@@ -4686,7 +5375,7 @@
       </w:pPr>
     </w:lvl>
   </w:abstractNum>
-  <w:abstractNum w:abstractNumId="11" w15:restartNumberingAfterBreak="0">
+  <w:abstractNum w:abstractNumId="12" w15:restartNumberingAfterBreak="0">
     <w:nsid w:val="6EB44182"/>
     <w:multiLevelType w:val="hybridMultilevel"/>
     <w:tmpl w:val="9B545082"/>
@@ -4772,7 +5461,7 @@
       </w:pPr>
     </w:lvl>
   </w:abstractNum>
-  <w:abstractNum w:abstractNumId="12" w15:restartNumberingAfterBreak="0">
+  <w:abstractNum w:abstractNumId="13" w15:restartNumberingAfterBreak="0">
     <w:nsid w:val="7F301BCF"/>
     <w:multiLevelType w:val="hybridMultilevel"/>
     <w:tmpl w:val="F4CAA6CC"/>
@@ -4886,43 +5575,46 @@
     </w:lvl>
   </w:abstractNum>
   <w:num w:numId="1" w16cid:durableId="2042852941">
-    <w:abstractNumId w:val="4"/>
+    <w:abstractNumId w:val="5"/>
   </w:num>
   <w:num w:numId="2" w16cid:durableId="676269452">
-    <w:abstractNumId w:val="8"/>
+    <w:abstractNumId w:val="9"/>
   </w:num>
   <w:num w:numId="3" w16cid:durableId="1126192703">
     <w:abstractNumId w:val="0"/>
   </w:num>
   <w:num w:numId="4" w16cid:durableId="1037704526">
-    <w:abstractNumId w:val="10"/>
+    <w:abstractNumId w:val="11"/>
   </w:num>
   <w:num w:numId="5" w16cid:durableId="613707920">
     <w:abstractNumId w:val="1"/>
   </w:num>
   <w:num w:numId="6" w16cid:durableId="878737404">
-    <w:abstractNumId w:val="7"/>
+    <w:abstractNumId w:val="8"/>
   </w:num>
   <w:num w:numId="7" w16cid:durableId="301859108">
-    <w:abstractNumId w:val="12"/>
+    <w:abstractNumId w:val="13"/>
   </w:num>
   <w:num w:numId="8" w16cid:durableId="846754967">
     <w:abstractNumId w:val="2"/>
   </w:num>
   <w:num w:numId="9" w16cid:durableId="735399288">
-    <w:abstractNumId w:val="3"/>
+    <w:abstractNumId w:val="4"/>
   </w:num>
   <w:num w:numId="10" w16cid:durableId="1584222107">
+    <w:abstractNumId w:val="7"/>
+  </w:num>
+  <w:num w:numId="11" w16cid:durableId="388040273">
     <w:abstractNumId w:val="6"/>
   </w:num>
-  <w:num w:numId="11" w16cid:durableId="388040273">
-    <w:abstractNumId w:val="5"/>
-  </w:num>
   <w:num w:numId="12" w16cid:durableId="1361467411">
-    <w:abstractNumId w:val="11"/>
+    <w:abstractNumId w:val="12"/>
   </w:num>
   <w:num w:numId="13" w16cid:durableId="1778212035">
-    <w:abstractNumId w:val="9"/>
+    <w:abstractNumId w:val="10"/>
+  </w:num>
+  <w:num w:numId="14" w16cid:durableId="823664272">
+    <w:abstractNumId w:val="3"/>
   </w:num>
 </w:numbering>
 </file>
@@ -5527,6 +6219,7 @@
   <w:style w:type="character" w:default="1" w:styleId="Policepardfaut">
     <w:name w:val="Default Paragraph Font"/>
     <w:uiPriority w:val="1"/>
+    <w:semiHidden/>
     <w:unhideWhenUsed/>
   </w:style>
   <w:style w:type="table" w:default="1" w:styleId="TableauNormal">
@@ -6265,12 +6958,11 @@
 </file>
 
 <file path=customXml/item1.xml><?xml version="1.0" encoding="utf-8"?>
-<?mso-contentType ?>
-<FormTemplates xmlns="http://schemas.microsoft.com/sharepoint/v3/contenttype/forms">
-  <Display>DocumentLibraryForm</Display>
-  <Edit>DocumentLibraryForm</Edit>
-  <New>DocumentLibraryForm</New>
-</FormTemplates>
+<p:properties xmlns:p="http://schemas.microsoft.com/office/2006/metadata/properties" xmlns:xsi="http://www.w3.org/2001/XMLSchema-instance" xmlns:pc="http://schemas.microsoft.com/office/infopath/2007/PartnerControls">
+  <documentManagement>
+    <_activity xmlns="0dcbab57-ce0d-48ec-9006-afbf43b82b42" xsi:nil="true"/>
+  </documentManagement>
+</p:properties>
 </file>
 
 <file path=customXml/item2.xml><?xml version="1.0" encoding="utf-8"?>
@@ -6456,17 +7148,20 @@
 </file>
 
 <file path=customXml/item3.xml><?xml version="1.0" encoding="utf-8"?>
-<p:properties xmlns:p="http://schemas.microsoft.com/office/2006/metadata/properties" xmlns:xsi="http://www.w3.org/2001/XMLSchema-instance" xmlns:pc="http://schemas.microsoft.com/office/infopath/2007/PartnerControls">
-  <documentManagement>
-    <_activity xmlns="0dcbab57-ce0d-48ec-9006-afbf43b82b42" xsi:nil="true"/>
-  </documentManagement>
-</p:properties>
+<?mso-contentType ?>
+<FormTemplates xmlns="http://schemas.microsoft.com/sharepoint/v3/contenttype/forms">
+  <Display>DocumentLibraryForm</Display>
+  <Edit>DocumentLibraryForm</Edit>
+  <New>DocumentLibraryForm</New>
+</FormTemplates>
 </file>
 
 <file path=customXml/itemProps1.xml><?xml version="1.0" encoding="utf-8"?>
-<ds:datastoreItem xmlns:ds="http://schemas.openxmlformats.org/officeDocument/2006/customXml" ds:itemID="{ACF3336E-B009-4268-AFDE-A53C75438088}">
+<ds:datastoreItem xmlns:ds="http://schemas.openxmlformats.org/officeDocument/2006/customXml" ds:itemID="{7D23386E-842B-4B42-9D04-7B63869B43F9}">
   <ds:schemaRefs>
-    <ds:schemaRef ds:uri="http://schemas.microsoft.com/sharepoint/v3/contenttype/forms"/>
+    <ds:schemaRef ds:uri="http://schemas.microsoft.com/office/2006/metadata/properties"/>
+    <ds:schemaRef ds:uri="http://schemas.microsoft.com/office/infopath/2007/PartnerControls"/>
+    <ds:schemaRef ds:uri="0dcbab57-ce0d-48ec-9006-afbf43b82b42"/>
   </ds:schemaRefs>
 </ds:datastoreItem>
 </file>
@@ -6490,11 +7185,9 @@
 </file>
 
 <file path=customXml/itemProps3.xml><?xml version="1.0" encoding="utf-8"?>
-<ds:datastoreItem xmlns:ds="http://schemas.openxmlformats.org/officeDocument/2006/customXml" ds:itemID="{7D23386E-842B-4B42-9D04-7B63869B43F9}">
+<ds:datastoreItem xmlns:ds="http://schemas.openxmlformats.org/officeDocument/2006/customXml" ds:itemID="{ACF3336E-B009-4268-AFDE-A53C75438088}">
   <ds:schemaRefs>
-    <ds:schemaRef ds:uri="http://schemas.microsoft.com/office/2006/metadata/properties"/>
-    <ds:schemaRef ds:uri="http://schemas.microsoft.com/office/infopath/2007/PartnerControls"/>
-    <ds:schemaRef ds:uri="0dcbab57-ce0d-48ec-9006-afbf43b82b42"/>
+    <ds:schemaRef ds:uri="http://schemas.microsoft.com/sharepoint/v3/contenttype/forms"/>
   </ds:schemaRefs>
 </ds:datastoreItem>
 </file>
</xml_diff>